<commit_message>
Add India GDP year-on-year growth analysis
</commit_message>
<xml_diff>
--- a/docs/project_documentation.docx
+++ b/docs/project_documentation.docx
@@ -45759,6 +45759,2078 @@
       <w:pPr>
         <w:pStyle w:val="NormalWeb"/>
       </w:pPr>
+      <w:r>
+        <w:t>Git add .</w:t>
+      </w:r>
+    </w:p>
+    <w:p>
+      <w:pPr>
+        <w:pStyle w:val="NormalWeb"/>
+      </w:pPr>
+      <w:r>
+        <w:t>Git commit -m “Python Data Visualisation”</w:t>
+      </w:r>
+    </w:p>
+    <w:p>
+      <w:pPr>
+        <w:pStyle w:val="NormalWeb"/>
+      </w:pPr>
+      <w:r>
+        <w:t>Git push</w:t>
+      </w:r>
+    </w:p>
+    <w:p>
+      <w:pPr>
+        <w:pStyle w:val="NormalWeb"/>
+      </w:pPr>
+      <w:r>
+        <w:t xml:space="preserve">The </w:t>
+      </w:r>
+      <w:proofErr w:type="spellStart"/>
+      <w:r>
+        <w:rPr>
+          <w:b/>
+          <w:bCs/>
+        </w:rPr>
+        <w:t>pct_change</w:t>
+      </w:r>
+      <w:proofErr w:type="spellEnd"/>
+      <w:r>
+        <w:rPr>
+          <w:b/>
+          <w:bCs/>
+        </w:rPr>
+        <w:t>()</w:t>
+      </w:r>
+      <w:r>
+        <w:t xml:space="preserve"> method in pandas calculates the fractional change (relative difference) between the current element and a prior element</w:t>
+      </w:r>
+      <w:r>
+        <w:t>.</w:t>
+      </w:r>
+    </w:p>
+    <w:p>
+      <w:pPr>
+        <w:pStyle w:val="NormalWeb"/>
+        <w:numPr>
+          <w:ilvl w:val="0"/>
+          <w:numId w:val="49"/>
+        </w:numPr>
+      </w:pPr>
+      <w:proofErr w:type="spellStart"/>
+      <w:r>
+        <w:t>india_gdp</w:t>
+      </w:r>
+      <w:proofErr w:type="spellEnd"/>
+      <w:r>
+        <w:t>["</w:t>
+      </w:r>
+      <w:proofErr w:type="spellStart"/>
+      <w:r>
+        <w:t>GDP_YoY_Growth</w:t>
+      </w:r>
+      <w:proofErr w:type="spellEnd"/>
+      <w:r>
+        <w:t xml:space="preserve">"] = ( </w:t>
+      </w:r>
+      <w:proofErr w:type="spellStart"/>
+      <w:r>
+        <w:t>india_gdp</w:t>
+      </w:r>
+      <w:proofErr w:type="spellEnd"/>
+      <w:r>
+        <w:t>["</w:t>
+      </w:r>
+      <w:proofErr w:type="spellStart"/>
+      <w:r>
+        <w:t>GDP_Billion</w:t>
+      </w:r>
+      <w:proofErr w:type="spellEnd"/>
+      <w:r>
+        <w:t>"].</w:t>
+      </w:r>
+      <w:proofErr w:type="spellStart"/>
+      <w:r>
+        <w:t>pct_change</w:t>
+      </w:r>
+      <w:proofErr w:type="spellEnd"/>
+      <w:r>
+        <w:t xml:space="preserve">() * 100 ) </w:t>
+      </w:r>
+      <w:proofErr w:type="spellStart"/>
+      <w:r>
+        <w:t>india_gdp</w:t>
+      </w:r>
+      <w:proofErr w:type="spellEnd"/>
+      <w:r>
+        <w:t>[ ["Year", "</w:t>
+      </w:r>
+      <w:proofErr w:type="spellStart"/>
+      <w:r>
+        <w:t>GDP_Billion</w:t>
+      </w:r>
+      <w:proofErr w:type="spellEnd"/>
+      <w:r>
+        <w:t>", "</w:t>
+      </w:r>
+      <w:proofErr w:type="spellStart"/>
+      <w:r>
+        <w:t>GDP_YoY_Growth</w:t>
+      </w:r>
+      <w:proofErr w:type="spellEnd"/>
+      <w:r>
+        <w:t>"] ].head(10)</w:t>
+      </w:r>
+    </w:p>
+    <w:p>
+      <w:pPr>
+        <w:pStyle w:val="NormalWeb"/>
+        <w:ind w:left="360"/>
+      </w:pPr>
+    </w:p>
+    <w:p>
+      <w:pPr>
+        <w:pStyle w:val="ListParagraph"/>
+        <w:numPr>
+          <w:ilvl w:val="0"/>
+          <w:numId w:val="49"/>
+        </w:numPr>
+        <w:tabs>
+          <w:tab w:val="left" w:pos="916"/>
+          <w:tab w:val="left" w:pos="1832"/>
+          <w:tab w:val="left" w:pos="2748"/>
+          <w:tab w:val="left" w:pos="3664"/>
+          <w:tab w:val="left" w:pos="4580"/>
+          <w:tab w:val="left" w:pos="5496"/>
+          <w:tab w:val="left" w:pos="6412"/>
+          <w:tab w:val="left" w:pos="7328"/>
+          <w:tab w:val="left" w:pos="8244"/>
+          <w:tab w:val="left" w:pos="9160"/>
+          <w:tab w:val="left" w:pos="10076"/>
+          <w:tab w:val="left" w:pos="10992"/>
+          <w:tab w:val="left" w:pos="11908"/>
+          <w:tab w:val="left" w:pos="12824"/>
+          <w:tab w:val="left" w:pos="13740"/>
+          <w:tab w:val="left" w:pos="14656"/>
+        </w:tabs>
+        <w:spacing w:after="0" w:line="240" w:lineRule="auto"/>
+        <w:rPr>
+          <w:rFonts w:ascii="Courier New" w:eastAsia="Times New Roman" w:hAnsi="Courier New" w:cs="Courier New"/>
+          <w:kern w:val="0"/>
+          <w:sz w:val="20"/>
+          <w:szCs w:val="20"/>
+          <w:lang w:eastAsia="en-IN"/>
+          <w14:ligatures w14:val="none"/>
+        </w:rPr>
+      </w:pPr>
+      <w:proofErr w:type="spellStart"/>
+      <w:r>
+        <w:rPr>
+          <w:rFonts w:ascii="Courier New" w:eastAsia="Times New Roman" w:hAnsi="Courier New" w:cs="Courier New"/>
+          <w:kern w:val="0"/>
+          <w:sz w:val="20"/>
+          <w:szCs w:val="20"/>
+          <w:lang w:eastAsia="en-IN"/>
+          <w14:ligatures w14:val="none"/>
+        </w:rPr>
+        <w:t>india_gdp</w:t>
+      </w:r>
+      <w:proofErr w:type="spellEnd"/>
+      <w:r>
+        <w:rPr>
+          <w:rFonts w:ascii="Courier New" w:eastAsia="Times New Roman" w:hAnsi="Courier New" w:cs="Courier New"/>
+          <w:kern w:val="0"/>
+          <w:sz w:val="20"/>
+          <w:szCs w:val="20"/>
+          <w:lang w:eastAsia="en-IN"/>
+          <w14:ligatures w14:val="none"/>
+        </w:rPr>
+        <w:t>[</w:t>
+      </w:r>
+    </w:p>
+    <w:p>
+      <w:pPr>
+        <w:pStyle w:val="ListParagraph"/>
+        <w:numPr>
+          <w:ilvl w:val="0"/>
+          <w:numId w:val="49"/>
+        </w:numPr>
+        <w:tabs>
+          <w:tab w:val="left" w:pos="916"/>
+          <w:tab w:val="left" w:pos="1832"/>
+          <w:tab w:val="left" w:pos="2748"/>
+          <w:tab w:val="left" w:pos="3664"/>
+          <w:tab w:val="left" w:pos="4580"/>
+          <w:tab w:val="left" w:pos="5496"/>
+          <w:tab w:val="left" w:pos="6412"/>
+          <w:tab w:val="left" w:pos="7328"/>
+          <w:tab w:val="left" w:pos="8244"/>
+          <w:tab w:val="left" w:pos="9160"/>
+          <w:tab w:val="left" w:pos="10076"/>
+          <w:tab w:val="left" w:pos="10992"/>
+          <w:tab w:val="left" w:pos="11908"/>
+          <w:tab w:val="left" w:pos="12824"/>
+          <w:tab w:val="left" w:pos="13740"/>
+          <w:tab w:val="left" w:pos="14656"/>
+        </w:tabs>
+        <w:spacing w:after="0" w:line="240" w:lineRule="auto"/>
+        <w:rPr>
+          <w:rFonts w:ascii="Courier New" w:eastAsia="Times New Roman" w:hAnsi="Courier New" w:cs="Courier New"/>
+          <w:kern w:val="0"/>
+          <w:sz w:val="20"/>
+          <w:szCs w:val="20"/>
+          <w:lang w:eastAsia="en-IN"/>
+          <w14:ligatures w14:val="none"/>
+        </w:rPr>
+      </w:pPr>
+      <w:r>
+        <w:rPr>
+          <w:rFonts w:ascii="Courier New" w:eastAsia="Times New Roman" w:hAnsi="Courier New" w:cs="Courier New"/>
+          <w:kern w:val="0"/>
+          <w:sz w:val="20"/>
+          <w:szCs w:val="20"/>
+          <w:lang w:eastAsia="en-IN"/>
+          <w14:ligatures w14:val="none"/>
+        </w:rPr>
+        <w:t xml:space="preserve">    ["Year", "</w:t>
+      </w:r>
+      <w:proofErr w:type="spellStart"/>
+      <w:r>
+        <w:rPr>
+          <w:rFonts w:ascii="Courier New" w:eastAsia="Times New Roman" w:hAnsi="Courier New" w:cs="Courier New"/>
+          <w:kern w:val="0"/>
+          <w:sz w:val="20"/>
+          <w:szCs w:val="20"/>
+          <w:lang w:eastAsia="en-IN"/>
+          <w14:ligatures w14:val="none"/>
+        </w:rPr>
+        <w:t>GDP_Billion</w:t>
+      </w:r>
+      <w:proofErr w:type="spellEnd"/>
+      <w:r>
+        <w:rPr>
+          <w:rFonts w:ascii="Courier New" w:eastAsia="Times New Roman" w:hAnsi="Courier New" w:cs="Courier New"/>
+          <w:kern w:val="0"/>
+          <w:sz w:val="20"/>
+          <w:szCs w:val="20"/>
+          <w:lang w:eastAsia="en-IN"/>
+          <w14:ligatures w14:val="none"/>
+        </w:rPr>
+        <w:t>", "</w:t>
+      </w:r>
+      <w:proofErr w:type="spellStart"/>
+      <w:r>
+        <w:rPr>
+          <w:rFonts w:ascii="Courier New" w:eastAsia="Times New Roman" w:hAnsi="Courier New" w:cs="Courier New"/>
+          <w:kern w:val="0"/>
+          <w:sz w:val="20"/>
+          <w:szCs w:val="20"/>
+          <w:lang w:eastAsia="en-IN"/>
+          <w14:ligatures w14:val="none"/>
+        </w:rPr>
+        <w:t>GDP_YoY_Growth</w:t>
+      </w:r>
+      <w:proofErr w:type="spellEnd"/>
+      <w:r>
+        <w:rPr>
+          <w:rFonts w:ascii="Courier New" w:eastAsia="Times New Roman" w:hAnsi="Courier New" w:cs="Courier New"/>
+          <w:kern w:val="0"/>
+          <w:sz w:val="20"/>
+          <w:szCs w:val="20"/>
+          <w:lang w:eastAsia="en-IN"/>
+          <w14:ligatures w14:val="none"/>
+        </w:rPr>
+        <w:t>"]</w:t>
+      </w:r>
+    </w:p>
+    <w:p>
+      <w:pPr>
+        <w:pStyle w:val="ListParagraph"/>
+        <w:numPr>
+          <w:ilvl w:val="0"/>
+          <w:numId w:val="49"/>
+        </w:numPr>
+        <w:tabs>
+          <w:tab w:val="left" w:pos="916"/>
+          <w:tab w:val="left" w:pos="1832"/>
+          <w:tab w:val="left" w:pos="2748"/>
+          <w:tab w:val="left" w:pos="3664"/>
+          <w:tab w:val="left" w:pos="4580"/>
+          <w:tab w:val="left" w:pos="5496"/>
+          <w:tab w:val="left" w:pos="6412"/>
+          <w:tab w:val="left" w:pos="7328"/>
+          <w:tab w:val="left" w:pos="8244"/>
+          <w:tab w:val="left" w:pos="9160"/>
+          <w:tab w:val="left" w:pos="10076"/>
+          <w:tab w:val="left" w:pos="10992"/>
+          <w:tab w:val="left" w:pos="11908"/>
+          <w:tab w:val="left" w:pos="12824"/>
+          <w:tab w:val="left" w:pos="13740"/>
+          <w:tab w:val="left" w:pos="14656"/>
+        </w:tabs>
+        <w:spacing w:after="0" w:line="240" w:lineRule="auto"/>
+        <w:rPr>
+          <w:rFonts w:ascii="Courier New" w:eastAsia="Times New Roman" w:hAnsi="Courier New" w:cs="Courier New"/>
+          <w:kern w:val="0"/>
+          <w:sz w:val="20"/>
+          <w:szCs w:val="20"/>
+          <w:lang w:eastAsia="en-IN"/>
+          <w14:ligatures w14:val="none"/>
+        </w:rPr>
+      </w:pPr>
+      <w:r>
+        <w:rPr>
+          <w:rFonts w:ascii="Courier New" w:eastAsia="Times New Roman" w:hAnsi="Courier New" w:cs="Courier New"/>
+          <w:kern w:val="0"/>
+          <w:sz w:val="20"/>
+          <w:szCs w:val="20"/>
+          <w:lang w:eastAsia="en-IN"/>
+          <w14:ligatures w14:val="none"/>
+        </w:rPr>
+        <w:t>].</w:t>
+      </w:r>
+      <w:proofErr w:type="spellStart"/>
+      <w:r>
+        <w:rPr>
+          <w:rFonts w:ascii="Courier New" w:eastAsia="Times New Roman" w:hAnsi="Courier New" w:cs="Courier New"/>
+          <w:kern w:val="0"/>
+          <w:sz w:val="20"/>
+          <w:szCs w:val="20"/>
+          <w:lang w:eastAsia="en-IN"/>
+          <w14:ligatures w14:val="none"/>
+        </w:rPr>
+        <w:t>sort_values</w:t>
+      </w:r>
+      <w:proofErr w:type="spellEnd"/>
+      <w:r>
+        <w:rPr>
+          <w:rFonts w:ascii="Courier New" w:eastAsia="Times New Roman" w:hAnsi="Courier New" w:cs="Courier New"/>
+          <w:kern w:val="0"/>
+          <w:sz w:val="20"/>
+          <w:szCs w:val="20"/>
+          <w:lang w:eastAsia="en-IN"/>
+          <w14:ligatures w14:val="none"/>
+        </w:rPr>
+        <w:t>(</w:t>
+      </w:r>
+    </w:p>
+    <w:p>
+      <w:pPr>
+        <w:pStyle w:val="ListParagraph"/>
+        <w:numPr>
+          <w:ilvl w:val="0"/>
+          <w:numId w:val="49"/>
+        </w:numPr>
+        <w:tabs>
+          <w:tab w:val="left" w:pos="916"/>
+          <w:tab w:val="left" w:pos="1832"/>
+          <w:tab w:val="left" w:pos="2748"/>
+          <w:tab w:val="left" w:pos="3664"/>
+          <w:tab w:val="left" w:pos="4580"/>
+          <w:tab w:val="left" w:pos="5496"/>
+          <w:tab w:val="left" w:pos="6412"/>
+          <w:tab w:val="left" w:pos="7328"/>
+          <w:tab w:val="left" w:pos="8244"/>
+          <w:tab w:val="left" w:pos="9160"/>
+          <w:tab w:val="left" w:pos="10076"/>
+          <w:tab w:val="left" w:pos="10992"/>
+          <w:tab w:val="left" w:pos="11908"/>
+          <w:tab w:val="left" w:pos="12824"/>
+          <w:tab w:val="left" w:pos="13740"/>
+          <w:tab w:val="left" w:pos="14656"/>
+        </w:tabs>
+        <w:spacing w:after="0" w:line="240" w:lineRule="auto"/>
+        <w:rPr>
+          <w:rFonts w:ascii="Courier New" w:eastAsia="Times New Roman" w:hAnsi="Courier New" w:cs="Courier New"/>
+          <w:kern w:val="0"/>
+          <w:sz w:val="20"/>
+          <w:szCs w:val="20"/>
+          <w:lang w:eastAsia="en-IN"/>
+          <w14:ligatures w14:val="none"/>
+        </w:rPr>
+      </w:pPr>
+      <w:r>
+        <w:rPr>
+          <w:rFonts w:ascii="Courier New" w:eastAsia="Times New Roman" w:hAnsi="Courier New" w:cs="Courier New"/>
+          <w:kern w:val="0"/>
+          <w:sz w:val="20"/>
+          <w:szCs w:val="20"/>
+          <w:lang w:eastAsia="en-IN"/>
+          <w14:ligatures w14:val="none"/>
+        </w:rPr>
+        <w:t xml:space="preserve">    "</w:t>
+      </w:r>
+      <w:proofErr w:type="spellStart"/>
+      <w:r>
+        <w:rPr>
+          <w:rFonts w:ascii="Courier New" w:eastAsia="Times New Roman" w:hAnsi="Courier New" w:cs="Courier New"/>
+          <w:kern w:val="0"/>
+          <w:sz w:val="20"/>
+          <w:szCs w:val="20"/>
+          <w:lang w:eastAsia="en-IN"/>
+          <w14:ligatures w14:val="none"/>
+        </w:rPr>
+        <w:t>GDP_YoY_Growth</w:t>
+      </w:r>
+      <w:proofErr w:type="spellEnd"/>
+      <w:r>
+        <w:rPr>
+          <w:rFonts w:ascii="Courier New" w:eastAsia="Times New Roman" w:hAnsi="Courier New" w:cs="Courier New"/>
+          <w:kern w:val="0"/>
+          <w:sz w:val="20"/>
+          <w:szCs w:val="20"/>
+          <w:lang w:eastAsia="en-IN"/>
+          <w14:ligatures w14:val="none"/>
+        </w:rPr>
+        <w:t>",</w:t>
+      </w:r>
+    </w:p>
+    <w:p>
+      <w:pPr>
+        <w:pStyle w:val="ListParagraph"/>
+        <w:numPr>
+          <w:ilvl w:val="0"/>
+          <w:numId w:val="49"/>
+        </w:numPr>
+        <w:tabs>
+          <w:tab w:val="left" w:pos="916"/>
+          <w:tab w:val="left" w:pos="1832"/>
+          <w:tab w:val="left" w:pos="2748"/>
+          <w:tab w:val="left" w:pos="3664"/>
+          <w:tab w:val="left" w:pos="4580"/>
+          <w:tab w:val="left" w:pos="5496"/>
+          <w:tab w:val="left" w:pos="6412"/>
+          <w:tab w:val="left" w:pos="7328"/>
+          <w:tab w:val="left" w:pos="8244"/>
+          <w:tab w:val="left" w:pos="9160"/>
+          <w:tab w:val="left" w:pos="10076"/>
+          <w:tab w:val="left" w:pos="10992"/>
+          <w:tab w:val="left" w:pos="11908"/>
+          <w:tab w:val="left" w:pos="12824"/>
+          <w:tab w:val="left" w:pos="13740"/>
+          <w:tab w:val="left" w:pos="14656"/>
+        </w:tabs>
+        <w:spacing w:after="0" w:line="240" w:lineRule="auto"/>
+        <w:rPr>
+          <w:rFonts w:ascii="Courier New" w:eastAsia="Times New Roman" w:hAnsi="Courier New" w:cs="Courier New"/>
+          <w:kern w:val="0"/>
+          <w:sz w:val="20"/>
+          <w:szCs w:val="20"/>
+          <w:lang w:eastAsia="en-IN"/>
+          <w14:ligatures w14:val="none"/>
+        </w:rPr>
+      </w:pPr>
+      <w:r>
+        <w:rPr>
+          <w:rFonts w:ascii="Courier New" w:eastAsia="Times New Roman" w:hAnsi="Courier New" w:cs="Courier New"/>
+          <w:kern w:val="0"/>
+          <w:sz w:val="20"/>
+          <w:szCs w:val="20"/>
+          <w:lang w:eastAsia="en-IN"/>
+          <w14:ligatures w14:val="none"/>
+        </w:rPr>
+        <w:t xml:space="preserve">    ascending=False</w:t>
+      </w:r>
+    </w:p>
+    <w:p>
+      <w:pPr>
+        <w:pStyle w:val="ListParagraph"/>
+        <w:numPr>
+          <w:ilvl w:val="0"/>
+          <w:numId w:val="49"/>
+        </w:numPr>
+        <w:tabs>
+          <w:tab w:val="left" w:pos="916"/>
+          <w:tab w:val="left" w:pos="1832"/>
+          <w:tab w:val="left" w:pos="2748"/>
+          <w:tab w:val="left" w:pos="3664"/>
+          <w:tab w:val="left" w:pos="4580"/>
+          <w:tab w:val="left" w:pos="5496"/>
+          <w:tab w:val="left" w:pos="6412"/>
+          <w:tab w:val="left" w:pos="7328"/>
+          <w:tab w:val="left" w:pos="8244"/>
+          <w:tab w:val="left" w:pos="9160"/>
+          <w:tab w:val="left" w:pos="10076"/>
+          <w:tab w:val="left" w:pos="10992"/>
+          <w:tab w:val="left" w:pos="11908"/>
+          <w:tab w:val="left" w:pos="12824"/>
+          <w:tab w:val="left" w:pos="13740"/>
+          <w:tab w:val="left" w:pos="14656"/>
+        </w:tabs>
+        <w:spacing w:after="0" w:line="240" w:lineRule="auto"/>
+        <w:rPr>
+          <w:rFonts w:ascii="Courier New" w:eastAsia="Times New Roman" w:hAnsi="Courier New" w:cs="Courier New"/>
+          <w:kern w:val="0"/>
+          <w:sz w:val="20"/>
+          <w:szCs w:val="20"/>
+          <w:lang w:eastAsia="en-IN"/>
+          <w14:ligatures w14:val="none"/>
+        </w:rPr>
+      </w:pPr>
+      <w:r>
+        <w:rPr>
+          <w:rFonts w:ascii="Courier New" w:eastAsia="Times New Roman" w:hAnsi="Courier New" w:cs="Courier New"/>
+          <w:kern w:val="0"/>
+          <w:sz w:val="20"/>
+          <w:szCs w:val="20"/>
+          <w:lang w:eastAsia="en-IN"/>
+          <w14:ligatures w14:val="none"/>
+        </w:rPr>
+        <w:t>).head(10)</w:t>
+      </w:r>
+    </w:p>
+    <w:p>
+      <w:pPr>
+        <w:tabs>
+          <w:tab w:val="left" w:pos="916"/>
+          <w:tab w:val="left" w:pos="1832"/>
+          <w:tab w:val="left" w:pos="2748"/>
+          <w:tab w:val="left" w:pos="3664"/>
+          <w:tab w:val="left" w:pos="4580"/>
+          <w:tab w:val="left" w:pos="5496"/>
+          <w:tab w:val="left" w:pos="6412"/>
+          <w:tab w:val="left" w:pos="7328"/>
+          <w:tab w:val="left" w:pos="8244"/>
+          <w:tab w:val="left" w:pos="9160"/>
+          <w:tab w:val="left" w:pos="10076"/>
+          <w:tab w:val="left" w:pos="10992"/>
+          <w:tab w:val="left" w:pos="11908"/>
+          <w:tab w:val="left" w:pos="12824"/>
+          <w:tab w:val="left" w:pos="13740"/>
+          <w:tab w:val="left" w:pos="14656"/>
+        </w:tabs>
+        <w:spacing w:after="0" w:line="240" w:lineRule="auto"/>
+        <w:rPr>
+          <w:rFonts w:ascii="Courier New" w:eastAsia="Times New Roman" w:hAnsi="Courier New" w:cs="Courier New"/>
+          <w:kern w:val="0"/>
+          <w:sz w:val="20"/>
+          <w:szCs w:val="20"/>
+          <w:lang w:eastAsia="en-IN"/>
+          <w14:ligatures w14:val="none"/>
+        </w:rPr>
+      </w:pPr>
+    </w:p>
+    <w:p>
+      <w:pPr>
+        <w:tabs>
+          <w:tab w:val="left" w:pos="916"/>
+          <w:tab w:val="left" w:pos="1832"/>
+          <w:tab w:val="left" w:pos="2748"/>
+          <w:tab w:val="left" w:pos="3664"/>
+          <w:tab w:val="left" w:pos="4580"/>
+          <w:tab w:val="left" w:pos="5496"/>
+          <w:tab w:val="left" w:pos="6412"/>
+          <w:tab w:val="left" w:pos="7328"/>
+          <w:tab w:val="left" w:pos="8244"/>
+          <w:tab w:val="left" w:pos="9160"/>
+          <w:tab w:val="left" w:pos="10076"/>
+          <w:tab w:val="left" w:pos="10992"/>
+          <w:tab w:val="left" w:pos="11908"/>
+          <w:tab w:val="left" w:pos="12824"/>
+          <w:tab w:val="left" w:pos="13740"/>
+          <w:tab w:val="left" w:pos="14656"/>
+        </w:tabs>
+        <w:spacing w:after="0" w:line="240" w:lineRule="auto"/>
+        <w:rPr>
+          <w:rFonts w:ascii="Courier New" w:eastAsia="Times New Roman" w:hAnsi="Courier New" w:cs="Courier New"/>
+          <w:kern w:val="0"/>
+          <w:sz w:val="20"/>
+          <w:szCs w:val="20"/>
+          <w:lang w:eastAsia="en-IN"/>
+          <w14:ligatures w14:val="none"/>
+        </w:rPr>
+      </w:pPr>
+    </w:p>
+    <w:p>
+      <w:pPr>
+        <w:pStyle w:val="ListParagraph"/>
+        <w:numPr>
+          <w:ilvl w:val="0"/>
+          <w:numId w:val="49"/>
+        </w:numPr>
+        <w:tabs>
+          <w:tab w:val="left" w:pos="916"/>
+          <w:tab w:val="left" w:pos="1832"/>
+          <w:tab w:val="left" w:pos="2748"/>
+          <w:tab w:val="left" w:pos="3664"/>
+          <w:tab w:val="left" w:pos="4580"/>
+          <w:tab w:val="left" w:pos="5496"/>
+          <w:tab w:val="left" w:pos="6412"/>
+          <w:tab w:val="left" w:pos="7328"/>
+          <w:tab w:val="left" w:pos="8244"/>
+          <w:tab w:val="left" w:pos="9160"/>
+          <w:tab w:val="left" w:pos="10076"/>
+          <w:tab w:val="left" w:pos="10992"/>
+          <w:tab w:val="left" w:pos="11908"/>
+          <w:tab w:val="left" w:pos="12824"/>
+          <w:tab w:val="left" w:pos="13740"/>
+          <w:tab w:val="left" w:pos="14656"/>
+        </w:tabs>
+        <w:spacing w:after="0" w:line="240" w:lineRule="auto"/>
+        <w:rPr>
+          <w:rFonts w:ascii="Courier New" w:eastAsia="Times New Roman" w:hAnsi="Courier New" w:cs="Courier New"/>
+          <w:kern w:val="0"/>
+          <w:sz w:val="20"/>
+          <w:szCs w:val="20"/>
+          <w:lang w:eastAsia="en-IN"/>
+          <w14:ligatures w14:val="none"/>
+        </w:rPr>
+      </w:pPr>
+      <w:proofErr w:type="spellStart"/>
+      <w:r>
+        <w:rPr>
+          <w:rFonts w:ascii="Courier New" w:eastAsia="Times New Roman" w:hAnsi="Courier New" w:cs="Courier New"/>
+          <w:kern w:val="0"/>
+          <w:sz w:val="20"/>
+          <w:szCs w:val="20"/>
+          <w:lang w:eastAsia="en-IN"/>
+          <w14:ligatures w14:val="none"/>
+        </w:rPr>
+        <w:t>india_gdp</w:t>
+      </w:r>
+      <w:proofErr w:type="spellEnd"/>
+      <w:r>
+        <w:rPr>
+          <w:rFonts w:ascii="Courier New" w:eastAsia="Times New Roman" w:hAnsi="Courier New" w:cs="Courier New"/>
+          <w:kern w:val="0"/>
+          <w:sz w:val="20"/>
+          <w:szCs w:val="20"/>
+          <w:lang w:eastAsia="en-IN"/>
+          <w14:ligatures w14:val="none"/>
+        </w:rPr>
+        <w:t>[</w:t>
+      </w:r>
+    </w:p>
+    <w:p>
+      <w:pPr>
+        <w:pStyle w:val="ListParagraph"/>
+        <w:numPr>
+          <w:ilvl w:val="0"/>
+          <w:numId w:val="49"/>
+        </w:numPr>
+        <w:tabs>
+          <w:tab w:val="left" w:pos="916"/>
+          <w:tab w:val="left" w:pos="1832"/>
+          <w:tab w:val="left" w:pos="2748"/>
+          <w:tab w:val="left" w:pos="3664"/>
+          <w:tab w:val="left" w:pos="4580"/>
+          <w:tab w:val="left" w:pos="5496"/>
+          <w:tab w:val="left" w:pos="6412"/>
+          <w:tab w:val="left" w:pos="7328"/>
+          <w:tab w:val="left" w:pos="8244"/>
+          <w:tab w:val="left" w:pos="9160"/>
+          <w:tab w:val="left" w:pos="10076"/>
+          <w:tab w:val="left" w:pos="10992"/>
+          <w:tab w:val="left" w:pos="11908"/>
+          <w:tab w:val="left" w:pos="12824"/>
+          <w:tab w:val="left" w:pos="13740"/>
+          <w:tab w:val="left" w:pos="14656"/>
+        </w:tabs>
+        <w:spacing w:after="0" w:line="240" w:lineRule="auto"/>
+        <w:rPr>
+          <w:rFonts w:ascii="Courier New" w:eastAsia="Times New Roman" w:hAnsi="Courier New" w:cs="Courier New"/>
+          <w:kern w:val="0"/>
+          <w:sz w:val="20"/>
+          <w:szCs w:val="20"/>
+          <w:lang w:eastAsia="en-IN"/>
+          <w14:ligatures w14:val="none"/>
+        </w:rPr>
+      </w:pPr>
+      <w:r>
+        <w:rPr>
+          <w:rFonts w:ascii="Courier New" w:eastAsia="Times New Roman" w:hAnsi="Courier New" w:cs="Courier New"/>
+          <w:kern w:val="0"/>
+          <w:sz w:val="20"/>
+          <w:szCs w:val="20"/>
+          <w:lang w:eastAsia="en-IN"/>
+          <w14:ligatures w14:val="none"/>
+        </w:rPr>
+        <w:t xml:space="preserve">    ["Year", "</w:t>
+      </w:r>
+      <w:proofErr w:type="spellStart"/>
+      <w:r>
+        <w:rPr>
+          <w:rFonts w:ascii="Courier New" w:eastAsia="Times New Roman" w:hAnsi="Courier New" w:cs="Courier New"/>
+          <w:kern w:val="0"/>
+          <w:sz w:val="20"/>
+          <w:szCs w:val="20"/>
+          <w:lang w:eastAsia="en-IN"/>
+          <w14:ligatures w14:val="none"/>
+        </w:rPr>
+        <w:t>GDP_Billion</w:t>
+      </w:r>
+      <w:proofErr w:type="spellEnd"/>
+      <w:r>
+        <w:rPr>
+          <w:rFonts w:ascii="Courier New" w:eastAsia="Times New Roman" w:hAnsi="Courier New" w:cs="Courier New"/>
+          <w:kern w:val="0"/>
+          <w:sz w:val="20"/>
+          <w:szCs w:val="20"/>
+          <w:lang w:eastAsia="en-IN"/>
+          <w14:ligatures w14:val="none"/>
+        </w:rPr>
+        <w:t>", "</w:t>
+      </w:r>
+      <w:proofErr w:type="spellStart"/>
+      <w:r>
+        <w:rPr>
+          <w:rFonts w:ascii="Courier New" w:eastAsia="Times New Roman" w:hAnsi="Courier New" w:cs="Courier New"/>
+          <w:kern w:val="0"/>
+          <w:sz w:val="20"/>
+          <w:szCs w:val="20"/>
+          <w:lang w:eastAsia="en-IN"/>
+          <w14:ligatures w14:val="none"/>
+        </w:rPr>
+        <w:t>GDP_YoY_Growth</w:t>
+      </w:r>
+      <w:proofErr w:type="spellEnd"/>
+      <w:r>
+        <w:rPr>
+          <w:rFonts w:ascii="Courier New" w:eastAsia="Times New Roman" w:hAnsi="Courier New" w:cs="Courier New"/>
+          <w:kern w:val="0"/>
+          <w:sz w:val="20"/>
+          <w:szCs w:val="20"/>
+          <w:lang w:eastAsia="en-IN"/>
+          <w14:ligatures w14:val="none"/>
+        </w:rPr>
+        <w:t>"]</w:t>
+      </w:r>
+    </w:p>
+    <w:p>
+      <w:pPr>
+        <w:pStyle w:val="ListParagraph"/>
+        <w:numPr>
+          <w:ilvl w:val="0"/>
+          <w:numId w:val="49"/>
+        </w:numPr>
+        <w:tabs>
+          <w:tab w:val="left" w:pos="916"/>
+          <w:tab w:val="left" w:pos="1832"/>
+          <w:tab w:val="left" w:pos="2748"/>
+          <w:tab w:val="left" w:pos="3664"/>
+          <w:tab w:val="left" w:pos="4580"/>
+          <w:tab w:val="left" w:pos="5496"/>
+          <w:tab w:val="left" w:pos="6412"/>
+          <w:tab w:val="left" w:pos="7328"/>
+          <w:tab w:val="left" w:pos="8244"/>
+          <w:tab w:val="left" w:pos="9160"/>
+          <w:tab w:val="left" w:pos="10076"/>
+          <w:tab w:val="left" w:pos="10992"/>
+          <w:tab w:val="left" w:pos="11908"/>
+          <w:tab w:val="left" w:pos="12824"/>
+          <w:tab w:val="left" w:pos="13740"/>
+          <w:tab w:val="left" w:pos="14656"/>
+        </w:tabs>
+        <w:spacing w:after="0" w:line="240" w:lineRule="auto"/>
+        <w:rPr>
+          <w:rFonts w:ascii="Courier New" w:eastAsia="Times New Roman" w:hAnsi="Courier New" w:cs="Courier New"/>
+          <w:kern w:val="0"/>
+          <w:sz w:val="20"/>
+          <w:szCs w:val="20"/>
+          <w:lang w:eastAsia="en-IN"/>
+          <w14:ligatures w14:val="none"/>
+        </w:rPr>
+      </w:pPr>
+      <w:r>
+        <w:rPr>
+          <w:rFonts w:ascii="Courier New" w:eastAsia="Times New Roman" w:hAnsi="Courier New" w:cs="Courier New"/>
+          <w:kern w:val="0"/>
+          <w:sz w:val="20"/>
+          <w:szCs w:val="20"/>
+          <w:lang w:eastAsia="en-IN"/>
+          <w14:ligatures w14:val="none"/>
+        </w:rPr>
+        <w:t>].</w:t>
+      </w:r>
+      <w:proofErr w:type="spellStart"/>
+      <w:r>
+        <w:rPr>
+          <w:rFonts w:ascii="Courier New" w:eastAsia="Times New Roman" w:hAnsi="Courier New" w:cs="Courier New"/>
+          <w:kern w:val="0"/>
+          <w:sz w:val="20"/>
+          <w:szCs w:val="20"/>
+          <w:lang w:eastAsia="en-IN"/>
+          <w14:ligatures w14:val="none"/>
+        </w:rPr>
+        <w:t>sort_values</w:t>
+      </w:r>
+      <w:proofErr w:type="spellEnd"/>
+      <w:r>
+        <w:rPr>
+          <w:rFonts w:ascii="Courier New" w:eastAsia="Times New Roman" w:hAnsi="Courier New" w:cs="Courier New"/>
+          <w:kern w:val="0"/>
+          <w:sz w:val="20"/>
+          <w:szCs w:val="20"/>
+          <w:lang w:eastAsia="en-IN"/>
+          <w14:ligatures w14:val="none"/>
+        </w:rPr>
+        <w:t>(</w:t>
+      </w:r>
+    </w:p>
+    <w:p>
+      <w:pPr>
+        <w:pStyle w:val="ListParagraph"/>
+        <w:numPr>
+          <w:ilvl w:val="0"/>
+          <w:numId w:val="49"/>
+        </w:numPr>
+        <w:tabs>
+          <w:tab w:val="left" w:pos="916"/>
+          <w:tab w:val="left" w:pos="1832"/>
+          <w:tab w:val="left" w:pos="2748"/>
+          <w:tab w:val="left" w:pos="3664"/>
+          <w:tab w:val="left" w:pos="4580"/>
+          <w:tab w:val="left" w:pos="5496"/>
+          <w:tab w:val="left" w:pos="6412"/>
+          <w:tab w:val="left" w:pos="7328"/>
+          <w:tab w:val="left" w:pos="8244"/>
+          <w:tab w:val="left" w:pos="9160"/>
+          <w:tab w:val="left" w:pos="10076"/>
+          <w:tab w:val="left" w:pos="10992"/>
+          <w:tab w:val="left" w:pos="11908"/>
+          <w:tab w:val="left" w:pos="12824"/>
+          <w:tab w:val="left" w:pos="13740"/>
+          <w:tab w:val="left" w:pos="14656"/>
+        </w:tabs>
+        <w:spacing w:after="0" w:line="240" w:lineRule="auto"/>
+        <w:rPr>
+          <w:rFonts w:ascii="Courier New" w:eastAsia="Times New Roman" w:hAnsi="Courier New" w:cs="Courier New"/>
+          <w:kern w:val="0"/>
+          <w:sz w:val="20"/>
+          <w:szCs w:val="20"/>
+          <w:lang w:eastAsia="en-IN"/>
+          <w14:ligatures w14:val="none"/>
+        </w:rPr>
+      </w:pPr>
+      <w:r>
+        <w:rPr>
+          <w:rFonts w:ascii="Courier New" w:eastAsia="Times New Roman" w:hAnsi="Courier New" w:cs="Courier New"/>
+          <w:kern w:val="0"/>
+          <w:sz w:val="20"/>
+          <w:szCs w:val="20"/>
+          <w:lang w:eastAsia="en-IN"/>
+          <w14:ligatures w14:val="none"/>
+        </w:rPr>
+        <w:t xml:space="preserve">    "</w:t>
+      </w:r>
+      <w:proofErr w:type="spellStart"/>
+      <w:r>
+        <w:rPr>
+          <w:rFonts w:ascii="Courier New" w:eastAsia="Times New Roman" w:hAnsi="Courier New" w:cs="Courier New"/>
+          <w:kern w:val="0"/>
+          <w:sz w:val="20"/>
+          <w:szCs w:val="20"/>
+          <w:lang w:eastAsia="en-IN"/>
+          <w14:ligatures w14:val="none"/>
+        </w:rPr>
+        <w:t>GDP_YoY_Growth</w:t>
+      </w:r>
+      <w:proofErr w:type="spellEnd"/>
+      <w:r>
+        <w:rPr>
+          <w:rFonts w:ascii="Courier New" w:eastAsia="Times New Roman" w:hAnsi="Courier New" w:cs="Courier New"/>
+          <w:kern w:val="0"/>
+          <w:sz w:val="20"/>
+          <w:szCs w:val="20"/>
+          <w:lang w:eastAsia="en-IN"/>
+          <w14:ligatures w14:val="none"/>
+        </w:rPr>
+        <w:t>",</w:t>
+      </w:r>
+    </w:p>
+    <w:p>
+      <w:pPr>
+        <w:pStyle w:val="ListParagraph"/>
+        <w:numPr>
+          <w:ilvl w:val="0"/>
+          <w:numId w:val="49"/>
+        </w:numPr>
+        <w:tabs>
+          <w:tab w:val="left" w:pos="916"/>
+          <w:tab w:val="left" w:pos="1832"/>
+          <w:tab w:val="left" w:pos="2748"/>
+          <w:tab w:val="left" w:pos="3664"/>
+          <w:tab w:val="left" w:pos="4580"/>
+          <w:tab w:val="left" w:pos="5496"/>
+          <w:tab w:val="left" w:pos="6412"/>
+          <w:tab w:val="left" w:pos="7328"/>
+          <w:tab w:val="left" w:pos="8244"/>
+          <w:tab w:val="left" w:pos="9160"/>
+          <w:tab w:val="left" w:pos="10076"/>
+          <w:tab w:val="left" w:pos="10992"/>
+          <w:tab w:val="left" w:pos="11908"/>
+          <w:tab w:val="left" w:pos="12824"/>
+          <w:tab w:val="left" w:pos="13740"/>
+          <w:tab w:val="left" w:pos="14656"/>
+        </w:tabs>
+        <w:spacing w:after="0" w:line="240" w:lineRule="auto"/>
+        <w:rPr>
+          <w:rFonts w:ascii="Courier New" w:eastAsia="Times New Roman" w:hAnsi="Courier New" w:cs="Courier New"/>
+          <w:kern w:val="0"/>
+          <w:sz w:val="20"/>
+          <w:szCs w:val="20"/>
+          <w:lang w:eastAsia="en-IN"/>
+          <w14:ligatures w14:val="none"/>
+        </w:rPr>
+      </w:pPr>
+      <w:r>
+        <w:rPr>
+          <w:rFonts w:ascii="Courier New" w:eastAsia="Times New Roman" w:hAnsi="Courier New" w:cs="Courier New"/>
+          <w:kern w:val="0"/>
+          <w:sz w:val="20"/>
+          <w:szCs w:val="20"/>
+          <w:lang w:eastAsia="en-IN"/>
+          <w14:ligatures w14:val="none"/>
+        </w:rPr>
+        <w:t xml:space="preserve">    ascending=True</w:t>
+      </w:r>
+    </w:p>
+    <w:p>
+      <w:pPr>
+        <w:pStyle w:val="ListParagraph"/>
+        <w:numPr>
+          <w:ilvl w:val="0"/>
+          <w:numId w:val="49"/>
+        </w:numPr>
+        <w:tabs>
+          <w:tab w:val="left" w:pos="916"/>
+          <w:tab w:val="left" w:pos="1832"/>
+          <w:tab w:val="left" w:pos="2748"/>
+          <w:tab w:val="left" w:pos="3664"/>
+          <w:tab w:val="left" w:pos="4580"/>
+          <w:tab w:val="left" w:pos="5496"/>
+          <w:tab w:val="left" w:pos="6412"/>
+          <w:tab w:val="left" w:pos="7328"/>
+          <w:tab w:val="left" w:pos="8244"/>
+          <w:tab w:val="left" w:pos="9160"/>
+          <w:tab w:val="left" w:pos="10076"/>
+          <w:tab w:val="left" w:pos="10992"/>
+          <w:tab w:val="left" w:pos="11908"/>
+          <w:tab w:val="left" w:pos="12824"/>
+          <w:tab w:val="left" w:pos="13740"/>
+          <w:tab w:val="left" w:pos="14656"/>
+        </w:tabs>
+        <w:spacing w:after="0" w:line="240" w:lineRule="auto"/>
+        <w:rPr>
+          <w:rFonts w:ascii="Courier New" w:eastAsia="Times New Roman" w:hAnsi="Courier New" w:cs="Courier New"/>
+          <w:kern w:val="0"/>
+          <w:sz w:val="20"/>
+          <w:szCs w:val="20"/>
+          <w:lang w:eastAsia="en-IN"/>
+          <w14:ligatures w14:val="none"/>
+        </w:rPr>
+      </w:pPr>
+      <w:r>
+        <w:rPr>
+          <w:rFonts w:ascii="Courier New" w:eastAsia="Times New Roman" w:hAnsi="Courier New" w:cs="Courier New"/>
+          <w:kern w:val="0"/>
+          <w:sz w:val="20"/>
+          <w:szCs w:val="20"/>
+          <w:lang w:eastAsia="en-IN"/>
+          <w14:ligatures w14:val="none"/>
+        </w:rPr>
+        <w:t>).head(10)</w:t>
+      </w:r>
+    </w:p>
+    <w:p>
+      <w:pPr>
+        <w:tabs>
+          <w:tab w:val="left" w:pos="916"/>
+          <w:tab w:val="left" w:pos="1832"/>
+          <w:tab w:val="left" w:pos="2748"/>
+          <w:tab w:val="left" w:pos="3664"/>
+          <w:tab w:val="left" w:pos="4580"/>
+          <w:tab w:val="left" w:pos="5496"/>
+          <w:tab w:val="left" w:pos="6412"/>
+          <w:tab w:val="left" w:pos="7328"/>
+          <w:tab w:val="left" w:pos="8244"/>
+          <w:tab w:val="left" w:pos="9160"/>
+          <w:tab w:val="left" w:pos="10076"/>
+          <w:tab w:val="left" w:pos="10992"/>
+          <w:tab w:val="left" w:pos="11908"/>
+          <w:tab w:val="left" w:pos="12824"/>
+          <w:tab w:val="left" w:pos="13740"/>
+          <w:tab w:val="left" w:pos="14656"/>
+        </w:tabs>
+        <w:spacing w:after="0" w:line="240" w:lineRule="auto"/>
+        <w:rPr>
+          <w:rFonts w:ascii="Courier New" w:eastAsia="Times New Roman" w:hAnsi="Courier New" w:cs="Courier New"/>
+          <w:kern w:val="0"/>
+          <w:sz w:val="20"/>
+          <w:szCs w:val="20"/>
+          <w:lang w:eastAsia="en-IN"/>
+          <w14:ligatures w14:val="none"/>
+        </w:rPr>
+      </w:pPr>
+    </w:p>
+    <w:p>
+      <w:pPr>
+        <w:tabs>
+          <w:tab w:val="left" w:pos="916"/>
+          <w:tab w:val="left" w:pos="1832"/>
+          <w:tab w:val="left" w:pos="2748"/>
+          <w:tab w:val="left" w:pos="3664"/>
+          <w:tab w:val="left" w:pos="4580"/>
+          <w:tab w:val="left" w:pos="5496"/>
+          <w:tab w:val="left" w:pos="6412"/>
+          <w:tab w:val="left" w:pos="7328"/>
+          <w:tab w:val="left" w:pos="8244"/>
+          <w:tab w:val="left" w:pos="9160"/>
+          <w:tab w:val="left" w:pos="10076"/>
+          <w:tab w:val="left" w:pos="10992"/>
+          <w:tab w:val="left" w:pos="11908"/>
+          <w:tab w:val="left" w:pos="12824"/>
+          <w:tab w:val="left" w:pos="13740"/>
+          <w:tab w:val="left" w:pos="14656"/>
+        </w:tabs>
+        <w:spacing w:after="0" w:line="240" w:lineRule="auto"/>
+        <w:rPr>
+          <w:rFonts w:ascii="Courier New" w:eastAsia="Times New Roman" w:hAnsi="Courier New" w:cs="Courier New"/>
+          <w:kern w:val="0"/>
+          <w:sz w:val="20"/>
+          <w:szCs w:val="20"/>
+          <w:lang w:eastAsia="en-IN"/>
+          <w14:ligatures w14:val="none"/>
+        </w:rPr>
+      </w:pPr>
+    </w:p>
+    <w:p>
+      <w:pPr>
+        <w:pStyle w:val="ListParagraph"/>
+        <w:numPr>
+          <w:ilvl w:val="0"/>
+          <w:numId w:val="49"/>
+        </w:numPr>
+        <w:tabs>
+          <w:tab w:val="left" w:pos="916"/>
+          <w:tab w:val="left" w:pos="1832"/>
+          <w:tab w:val="left" w:pos="2748"/>
+          <w:tab w:val="left" w:pos="3664"/>
+          <w:tab w:val="left" w:pos="4580"/>
+          <w:tab w:val="left" w:pos="5496"/>
+          <w:tab w:val="left" w:pos="6412"/>
+          <w:tab w:val="left" w:pos="7328"/>
+          <w:tab w:val="left" w:pos="8244"/>
+          <w:tab w:val="left" w:pos="9160"/>
+          <w:tab w:val="left" w:pos="10076"/>
+          <w:tab w:val="left" w:pos="10992"/>
+          <w:tab w:val="left" w:pos="11908"/>
+          <w:tab w:val="left" w:pos="12824"/>
+          <w:tab w:val="left" w:pos="13740"/>
+          <w:tab w:val="left" w:pos="14656"/>
+        </w:tabs>
+        <w:spacing w:after="0" w:line="240" w:lineRule="auto"/>
+        <w:rPr>
+          <w:rFonts w:ascii="Times New Roman" w:eastAsia="Times New Roman" w:hAnsi="Times New Roman" w:cs="Times New Roman"/>
+          <w:kern w:val="0"/>
+          <w:sz w:val="20"/>
+          <w:szCs w:val="20"/>
+          <w:lang w:eastAsia="en-IN"/>
+          <w14:ligatures w14:val="none"/>
+        </w:rPr>
+      </w:pPr>
+      <w:proofErr w:type="spellStart"/>
+      <w:r>
+        <w:rPr>
+          <w:rFonts w:ascii="Times New Roman" w:eastAsia="Times New Roman" w:hAnsi="Times New Roman" w:cs="Times New Roman"/>
+          <w:kern w:val="0"/>
+          <w:sz w:val="20"/>
+          <w:szCs w:val="20"/>
+          <w:lang w:eastAsia="en-IN"/>
+          <w14:ligatures w14:val="none"/>
+        </w:rPr>
+        <w:t>plt.figure</w:t>
+      </w:r>
+      <w:proofErr w:type="spellEnd"/>
+      <w:r>
+        <w:rPr>
+          <w:rFonts w:ascii="Times New Roman" w:eastAsia="Times New Roman" w:hAnsi="Times New Roman" w:cs="Times New Roman"/>
+          <w:kern w:val="0"/>
+          <w:sz w:val="20"/>
+          <w:szCs w:val="20"/>
+          <w:lang w:eastAsia="en-IN"/>
+          <w14:ligatures w14:val="none"/>
+        </w:rPr>
+        <w:t>(</w:t>
+      </w:r>
+      <w:proofErr w:type="spellStart"/>
+      <w:r>
+        <w:rPr>
+          <w:rFonts w:ascii="Times New Roman" w:eastAsia="Times New Roman" w:hAnsi="Times New Roman" w:cs="Times New Roman"/>
+          <w:kern w:val="0"/>
+          <w:sz w:val="20"/>
+          <w:szCs w:val="20"/>
+          <w:lang w:eastAsia="en-IN"/>
+          <w14:ligatures w14:val="none"/>
+        </w:rPr>
+        <w:t>figsize</w:t>
+      </w:r>
+      <w:proofErr w:type="spellEnd"/>
+      <w:r>
+        <w:rPr>
+          <w:rFonts w:ascii="Times New Roman" w:eastAsia="Times New Roman" w:hAnsi="Times New Roman" w:cs="Times New Roman"/>
+          <w:kern w:val="0"/>
+          <w:sz w:val="20"/>
+          <w:szCs w:val="20"/>
+          <w:lang w:eastAsia="en-IN"/>
+          <w14:ligatures w14:val="none"/>
+        </w:rPr>
+        <w:t>=(12, 6))</w:t>
+      </w:r>
+    </w:p>
+    <w:p>
+      <w:pPr>
+        <w:pStyle w:val="ListParagraph"/>
+        <w:numPr>
+          <w:ilvl w:val="0"/>
+          <w:numId w:val="49"/>
+        </w:numPr>
+        <w:tabs>
+          <w:tab w:val="left" w:pos="916"/>
+          <w:tab w:val="left" w:pos="1832"/>
+          <w:tab w:val="left" w:pos="2748"/>
+          <w:tab w:val="left" w:pos="3664"/>
+          <w:tab w:val="left" w:pos="4580"/>
+          <w:tab w:val="left" w:pos="5496"/>
+          <w:tab w:val="left" w:pos="6412"/>
+          <w:tab w:val="left" w:pos="7328"/>
+          <w:tab w:val="left" w:pos="8244"/>
+          <w:tab w:val="left" w:pos="9160"/>
+          <w:tab w:val="left" w:pos="10076"/>
+          <w:tab w:val="left" w:pos="10992"/>
+          <w:tab w:val="left" w:pos="11908"/>
+          <w:tab w:val="left" w:pos="12824"/>
+          <w:tab w:val="left" w:pos="13740"/>
+          <w:tab w:val="left" w:pos="14656"/>
+        </w:tabs>
+        <w:spacing w:after="0" w:line="240" w:lineRule="auto"/>
+        <w:rPr>
+          <w:rFonts w:ascii="Times New Roman" w:eastAsia="Times New Roman" w:hAnsi="Times New Roman" w:cs="Times New Roman"/>
+          <w:kern w:val="0"/>
+          <w:sz w:val="20"/>
+          <w:szCs w:val="20"/>
+          <w:lang w:eastAsia="en-IN"/>
+          <w14:ligatures w14:val="none"/>
+        </w:rPr>
+      </w:pPr>
+      <w:proofErr w:type="spellStart"/>
+      <w:r>
+        <w:rPr>
+          <w:rFonts w:ascii="Times New Roman" w:eastAsia="Times New Roman" w:hAnsi="Times New Roman" w:cs="Times New Roman"/>
+          <w:kern w:val="0"/>
+          <w:sz w:val="20"/>
+          <w:szCs w:val="20"/>
+          <w:lang w:eastAsia="en-IN"/>
+          <w14:ligatures w14:val="none"/>
+        </w:rPr>
+        <w:t>plt.plot</w:t>
+      </w:r>
+      <w:proofErr w:type="spellEnd"/>
+      <w:r>
+        <w:rPr>
+          <w:rFonts w:ascii="Times New Roman" w:eastAsia="Times New Roman" w:hAnsi="Times New Roman" w:cs="Times New Roman"/>
+          <w:kern w:val="0"/>
+          <w:sz w:val="20"/>
+          <w:szCs w:val="20"/>
+          <w:lang w:eastAsia="en-IN"/>
+          <w14:ligatures w14:val="none"/>
+        </w:rPr>
+        <w:t>(</w:t>
+      </w:r>
+    </w:p>
+    <w:p>
+      <w:pPr>
+        <w:pStyle w:val="ListParagraph"/>
+        <w:numPr>
+          <w:ilvl w:val="0"/>
+          <w:numId w:val="49"/>
+        </w:numPr>
+        <w:tabs>
+          <w:tab w:val="left" w:pos="916"/>
+          <w:tab w:val="left" w:pos="1832"/>
+          <w:tab w:val="left" w:pos="2748"/>
+          <w:tab w:val="left" w:pos="3664"/>
+          <w:tab w:val="left" w:pos="4580"/>
+          <w:tab w:val="left" w:pos="5496"/>
+          <w:tab w:val="left" w:pos="6412"/>
+          <w:tab w:val="left" w:pos="7328"/>
+          <w:tab w:val="left" w:pos="8244"/>
+          <w:tab w:val="left" w:pos="9160"/>
+          <w:tab w:val="left" w:pos="10076"/>
+          <w:tab w:val="left" w:pos="10992"/>
+          <w:tab w:val="left" w:pos="11908"/>
+          <w:tab w:val="left" w:pos="12824"/>
+          <w:tab w:val="left" w:pos="13740"/>
+          <w:tab w:val="left" w:pos="14656"/>
+        </w:tabs>
+        <w:spacing w:after="0" w:line="240" w:lineRule="auto"/>
+        <w:rPr>
+          <w:rFonts w:ascii="Times New Roman" w:eastAsia="Times New Roman" w:hAnsi="Times New Roman" w:cs="Times New Roman"/>
+          <w:kern w:val="0"/>
+          <w:sz w:val="20"/>
+          <w:szCs w:val="20"/>
+          <w:lang w:eastAsia="en-IN"/>
+          <w14:ligatures w14:val="none"/>
+        </w:rPr>
+      </w:pPr>
+      <w:r>
+        <w:rPr>
+          <w:rFonts w:ascii="Times New Roman" w:eastAsia="Times New Roman" w:hAnsi="Times New Roman" w:cs="Times New Roman"/>
+          <w:kern w:val="0"/>
+          <w:sz w:val="20"/>
+          <w:szCs w:val="20"/>
+          <w:lang w:eastAsia="en-IN"/>
+          <w14:ligatures w14:val="none"/>
+        </w:rPr>
+        <w:t xml:space="preserve">    </w:t>
+      </w:r>
+      <w:proofErr w:type="spellStart"/>
+      <w:r>
+        <w:rPr>
+          <w:rFonts w:ascii="Times New Roman" w:eastAsia="Times New Roman" w:hAnsi="Times New Roman" w:cs="Times New Roman"/>
+          <w:kern w:val="0"/>
+          <w:sz w:val="20"/>
+          <w:szCs w:val="20"/>
+          <w:lang w:eastAsia="en-IN"/>
+          <w14:ligatures w14:val="none"/>
+        </w:rPr>
+        <w:t>india_gdp</w:t>
+      </w:r>
+      <w:proofErr w:type="spellEnd"/>
+      <w:r>
+        <w:rPr>
+          <w:rFonts w:ascii="Times New Roman" w:eastAsia="Times New Roman" w:hAnsi="Times New Roman" w:cs="Times New Roman"/>
+          <w:kern w:val="0"/>
+          <w:sz w:val="20"/>
+          <w:szCs w:val="20"/>
+          <w:lang w:eastAsia="en-IN"/>
+          <w14:ligatures w14:val="none"/>
+        </w:rPr>
+        <w:t>["Year"],</w:t>
+      </w:r>
+    </w:p>
+    <w:p>
+      <w:pPr>
+        <w:pStyle w:val="ListParagraph"/>
+        <w:numPr>
+          <w:ilvl w:val="0"/>
+          <w:numId w:val="49"/>
+        </w:numPr>
+        <w:tabs>
+          <w:tab w:val="left" w:pos="916"/>
+          <w:tab w:val="left" w:pos="1832"/>
+          <w:tab w:val="left" w:pos="2748"/>
+          <w:tab w:val="left" w:pos="3664"/>
+          <w:tab w:val="left" w:pos="4580"/>
+          <w:tab w:val="left" w:pos="5496"/>
+          <w:tab w:val="left" w:pos="6412"/>
+          <w:tab w:val="left" w:pos="7328"/>
+          <w:tab w:val="left" w:pos="8244"/>
+          <w:tab w:val="left" w:pos="9160"/>
+          <w:tab w:val="left" w:pos="10076"/>
+          <w:tab w:val="left" w:pos="10992"/>
+          <w:tab w:val="left" w:pos="11908"/>
+          <w:tab w:val="left" w:pos="12824"/>
+          <w:tab w:val="left" w:pos="13740"/>
+          <w:tab w:val="left" w:pos="14656"/>
+        </w:tabs>
+        <w:spacing w:after="0" w:line="240" w:lineRule="auto"/>
+        <w:rPr>
+          <w:rFonts w:ascii="Times New Roman" w:eastAsia="Times New Roman" w:hAnsi="Times New Roman" w:cs="Times New Roman"/>
+          <w:kern w:val="0"/>
+          <w:sz w:val="20"/>
+          <w:szCs w:val="20"/>
+          <w:lang w:eastAsia="en-IN"/>
+          <w14:ligatures w14:val="none"/>
+        </w:rPr>
+      </w:pPr>
+      <w:r>
+        <w:rPr>
+          <w:rFonts w:ascii="Times New Roman" w:eastAsia="Times New Roman" w:hAnsi="Times New Roman" w:cs="Times New Roman"/>
+          <w:kern w:val="0"/>
+          <w:sz w:val="20"/>
+          <w:szCs w:val="20"/>
+          <w:lang w:eastAsia="en-IN"/>
+          <w14:ligatures w14:val="none"/>
+        </w:rPr>
+        <w:t xml:space="preserve">    </w:t>
+      </w:r>
+      <w:proofErr w:type="spellStart"/>
+      <w:r>
+        <w:rPr>
+          <w:rFonts w:ascii="Times New Roman" w:eastAsia="Times New Roman" w:hAnsi="Times New Roman" w:cs="Times New Roman"/>
+          <w:kern w:val="0"/>
+          <w:sz w:val="20"/>
+          <w:szCs w:val="20"/>
+          <w:lang w:eastAsia="en-IN"/>
+          <w14:ligatures w14:val="none"/>
+        </w:rPr>
+        <w:t>india_gdp</w:t>
+      </w:r>
+      <w:proofErr w:type="spellEnd"/>
+      <w:r>
+        <w:rPr>
+          <w:rFonts w:ascii="Times New Roman" w:eastAsia="Times New Roman" w:hAnsi="Times New Roman" w:cs="Times New Roman"/>
+          <w:kern w:val="0"/>
+          <w:sz w:val="20"/>
+          <w:szCs w:val="20"/>
+          <w:lang w:eastAsia="en-IN"/>
+          <w14:ligatures w14:val="none"/>
+        </w:rPr>
+        <w:t>["</w:t>
+      </w:r>
+      <w:proofErr w:type="spellStart"/>
+      <w:r>
+        <w:rPr>
+          <w:rFonts w:ascii="Times New Roman" w:eastAsia="Times New Roman" w:hAnsi="Times New Roman" w:cs="Times New Roman"/>
+          <w:kern w:val="0"/>
+          <w:sz w:val="20"/>
+          <w:szCs w:val="20"/>
+          <w:lang w:eastAsia="en-IN"/>
+          <w14:ligatures w14:val="none"/>
+        </w:rPr>
+        <w:t>GDP_YoY_Growth</w:t>
+      </w:r>
+      <w:proofErr w:type="spellEnd"/>
+      <w:r>
+        <w:rPr>
+          <w:rFonts w:ascii="Times New Roman" w:eastAsia="Times New Roman" w:hAnsi="Times New Roman" w:cs="Times New Roman"/>
+          <w:kern w:val="0"/>
+          <w:sz w:val="20"/>
+          <w:szCs w:val="20"/>
+          <w:lang w:eastAsia="en-IN"/>
+          <w14:ligatures w14:val="none"/>
+        </w:rPr>
+        <w:t>"],</w:t>
+      </w:r>
+    </w:p>
+    <w:p>
+      <w:pPr>
+        <w:pStyle w:val="ListParagraph"/>
+        <w:numPr>
+          <w:ilvl w:val="0"/>
+          <w:numId w:val="49"/>
+        </w:numPr>
+        <w:tabs>
+          <w:tab w:val="left" w:pos="916"/>
+          <w:tab w:val="left" w:pos="1832"/>
+          <w:tab w:val="left" w:pos="2748"/>
+          <w:tab w:val="left" w:pos="3664"/>
+          <w:tab w:val="left" w:pos="4580"/>
+          <w:tab w:val="left" w:pos="5496"/>
+          <w:tab w:val="left" w:pos="6412"/>
+          <w:tab w:val="left" w:pos="7328"/>
+          <w:tab w:val="left" w:pos="8244"/>
+          <w:tab w:val="left" w:pos="9160"/>
+          <w:tab w:val="left" w:pos="10076"/>
+          <w:tab w:val="left" w:pos="10992"/>
+          <w:tab w:val="left" w:pos="11908"/>
+          <w:tab w:val="left" w:pos="12824"/>
+          <w:tab w:val="left" w:pos="13740"/>
+          <w:tab w:val="left" w:pos="14656"/>
+        </w:tabs>
+        <w:spacing w:after="0" w:line="240" w:lineRule="auto"/>
+        <w:rPr>
+          <w:rFonts w:ascii="Times New Roman" w:eastAsia="Times New Roman" w:hAnsi="Times New Roman" w:cs="Times New Roman"/>
+          <w:kern w:val="0"/>
+          <w:sz w:val="20"/>
+          <w:szCs w:val="20"/>
+          <w:lang w:eastAsia="en-IN"/>
+          <w14:ligatures w14:val="none"/>
+        </w:rPr>
+      </w:pPr>
+      <w:r>
+        <w:rPr>
+          <w:rFonts w:ascii="Times New Roman" w:eastAsia="Times New Roman" w:hAnsi="Times New Roman" w:cs="Times New Roman"/>
+          <w:kern w:val="0"/>
+          <w:sz w:val="20"/>
+          <w:szCs w:val="20"/>
+          <w:lang w:eastAsia="en-IN"/>
+          <w14:ligatures w14:val="none"/>
+        </w:rPr>
+        <w:t xml:space="preserve">    label="GDP YoY Growth"</w:t>
+      </w:r>
+    </w:p>
+    <w:p>
+      <w:pPr>
+        <w:pStyle w:val="ListParagraph"/>
+        <w:numPr>
+          <w:ilvl w:val="0"/>
+          <w:numId w:val="49"/>
+        </w:numPr>
+        <w:tabs>
+          <w:tab w:val="left" w:pos="916"/>
+          <w:tab w:val="left" w:pos="1832"/>
+          <w:tab w:val="left" w:pos="2748"/>
+          <w:tab w:val="left" w:pos="3664"/>
+          <w:tab w:val="left" w:pos="4580"/>
+          <w:tab w:val="left" w:pos="5496"/>
+          <w:tab w:val="left" w:pos="6412"/>
+          <w:tab w:val="left" w:pos="7328"/>
+          <w:tab w:val="left" w:pos="8244"/>
+          <w:tab w:val="left" w:pos="9160"/>
+          <w:tab w:val="left" w:pos="10076"/>
+          <w:tab w:val="left" w:pos="10992"/>
+          <w:tab w:val="left" w:pos="11908"/>
+          <w:tab w:val="left" w:pos="12824"/>
+          <w:tab w:val="left" w:pos="13740"/>
+          <w:tab w:val="left" w:pos="14656"/>
+        </w:tabs>
+        <w:spacing w:after="0" w:line="240" w:lineRule="auto"/>
+        <w:rPr>
+          <w:rFonts w:ascii="Times New Roman" w:eastAsia="Times New Roman" w:hAnsi="Times New Roman" w:cs="Times New Roman"/>
+          <w:kern w:val="0"/>
+          <w:sz w:val="20"/>
+          <w:szCs w:val="20"/>
+          <w:lang w:eastAsia="en-IN"/>
+          <w14:ligatures w14:val="none"/>
+        </w:rPr>
+      </w:pPr>
+      <w:r>
+        <w:rPr>
+          <w:rFonts w:ascii="Times New Roman" w:eastAsia="Times New Roman" w:hAnsi="Times New Roman" w:cs="Times New Roman"/>
+          <w:kern w:val="0"/>
+          <w:sz w:val="20"/>
+          <w:szCs w:val="20"/>
+          <w:lang w:eastAsia="en-IN"/>
+          <w14:ligatures w14:val="none"/>
+        </w:rPr>
+        <w:t>)</w:t>
+      </w:r>
+    </w:p>
+    <w:p>
+      <w:pPr>
+        <w:pStyle w:val="ListParagraph"/>
+        <w:numPr>
+          <w:ilvl w:val="0"/>
+          <w:numId w:val="49"/>
+        </w:numPr>
+        <w:tabs>
+          <w:tab w:val="left" w:pos="916"/>
+          <w:tab w:val="left" w:pos="1832"/>
+          <w:tab w:val="left" w:pos="2748"/>
+          <w:tab w:val="left" w:pos="3664"/>
+          <w:tab w:val="left" w:pos="4580"/>
+          <w:tab w:val="left" w:pos="5496"/>
+          <w:tab w:val="left" w:pos="6412"/>
+          <w:tab w:val="left" w:pos="7328"/>
+          <w:tab w:val="left" w:pos="8244"/>
+          <w:tab w:val="left" w:pos="9160"/>
+          <w:tab w:val="left" w:pos="10076"/>
+          <w:tab w:val="left" w:pos="10992"/>
+          <w:tab w:val="left" w:pos="11908"/>
+          <w:tab w:val="left" w:pos="12824"/>
+          <w:tab w:val="left" w:pos="13740"/>
+          <w:tab w:val="left" w:pos="14656"/>
+        </w:tabs>
+        <w:spacing w:after="0" w:line="240" w:lineRule="auto"/>
+        <w:rPr>
+          <w:rFonts w:ascii="Times New Roman" w:eastAsia="Times New Roman" w:hAnsi="Times New Roman" w:cs="Times New Roman"/>
+          <w:kern w:val="0"/>
+          <w:sz w:val="20"/>
+          <w:szCs w:val="20"/>
+          <w:lang w:eastAsia="en-IN"/>
+          <w14:ligatures w14:val="none"/>
+        </w:rPr>
+      </w:pPr>
+      <w:proofErr w:type="spellStart"/>
+      <w:r>
+        <w:rPr>
+          <w:rFonts w:ascii="Times New Roman" w:eastAsia="Times New Roman" w:hAnsi="Times New Roman" w:cs="Times New Roman"/>
+          <w:kern w:val="0"/>
+          <w:sz w:val="20"/>
+          <w:szCs w:val="20"/>
+          <w:lang w:eastAsia="en-IN"/>
+          <w14:ligatures w14:val="none"/>
+        </w:rPr>
+        <w:t>plt.axhline</w:t>
+      </w:r>
+      <w:proofErr w:type="spellEnd"/>
+      <w:r>
+        <w:rPr>
+          <w:rFonts w:ascii="Times New Roman" w:eastAsia="Times New Roman" w:hAnsi="Times New Roman" w:cs="Times New Roman"/>
+          <w:kern w:val="0"/>
+          <w:sz w:val="20"/>
+          <w:szCs w:val="20"/>
+          <w:lang w:eastAsia="en-IN"/>
+          <w14:ligatures w14:val="none"/>
+        </w:rPr>
+        <w:t xml:space="preserve">(0, </w:t>
+      </w:r>
+      <w:proofErr w:type="spellStart"/>
+      <w:r>
+        <w:rPr>
+          <w:rFonts w:ascii="Times New Roman" w:eastAsia="Times New Roman" w:hAnsi="Times New Roman" w:cs="Times New Roman"/>
+          <w:kern w:val="0"/>
+          <w:sz w:val="20"/>
+          <w:szCs w:val="20"/>
+          <w:lang w:eastAsia="en-IN"/>
+          <w14:ligatures w14:val="none"/>
+        </w:rPr>
+        <w:t>linestyle</w:t>
+      </w:r>
+      <w:proofErr w:type="spellEnd"/>
+      <w:r>
+        <w:rPr>
+          <w:rFonts w:ascii="Times New Roman" w:eastAsia="Times New Roman" w:hAnsi="Times New Roman" w:cs="Times New Roman"/>
+          <w:kern w:val="0"/>
+          <w:sz w:val="20"/>
+          <w:szCs w:val="20"/>
+          <w:lang w:eastAsia="en-IN"/>
+          <w14:ligatures w14:val="none"/>
+        </w:rPr>
+        <w:t>="--")</w:t>
+      </w:r>
+    </w:p>
+    <w:p>
+      <w:pPr>
+        <w:pStyle w:val="ListParagraph"/>
+        <w:numPr>
+          <w:ilvl w:val="0"/>
+          <w:numId w:val="49"/>
+        </w:numPr>
+        <w:tabs>
+          <w:tab w:val="left" w:pos="916"/>
+          <w:tab w:val="left" w:pos="1832"/>
+          <w:tab w:val="left" w:pos="2748"/>
+          <w:tab w:val="left" w:pos="3664"/>
+          <w:tab w:val="left" w:pos="4580"/>
+          <w:tab w:val="left" w:pos="5496"/>
+          <w:tab w:val="left" w:pos="6412"/>
+          <w:tab w:val="left" w:pos="7328"/>
+          <w:tab w:val="left" w:pos="8244"/>
+          <w:tab w:val="left" w:pos="9160"/>
+          <w:tab w:val="left" w:pos="10076"/>
+          <w:tab w:val="left" w:pos="10992"/>
+          <w:tab w:val="left" w:pos="11908"/>
+          <w:tab w:val="left" w:pos="12824"/>
+          <w:tab w:val="left" w:pos="13740"/>
+          <w:tab w:val="left" w:pos="14656"/>
+        </w:tabs>
+        <w:spacing w:after="0" w:line="240" w:lineRule="auto"/>
+        <w:rPr>
+          <w:rFonts w:ascii="Times New Roman" w:eastAsia="Times New Roman" w:hAnsi="Times New Roman" w:cs="Times New Roman"/>
+          <w:kern w:val="0"/>
+          <w:sz w:val="20"/>
+          <w:szCs w:val="20"/>
+          <w:lang w:eastAsia="en-IN"/>
+          <w14:ligatures w14:val="none"/>
+        </w:rPr>
+      </w:pPr>
+      <w:proofErr w:type="spellStart"/>
+      <w:r>
+        <w:rPr>
+          <w:rFonts w:ascii="Times New Roman" w:eastAsia="Times New Roman" w:hAnsi="Times New Roman" w:cs="Times New Roman"/>
+          <w:kern w:val="0"/>
+          <w:sz w:val="20"/>
+          <w:szCs w:val="20"/>
+          <w:lang w:eastAsia="en-IN"/>
+          <w14:ligatures w14:val="none"/>
+        </w:rPr>
+        <w:t>plt.xlabel</w:t>
+      </w:r>
+      <w:proofErr w:type="spellEnd"/>
+      <w:r>
+        <w:rPr>
+          <w:rFonts w:ascii="Times New Roman" w:eastAsia="Times New Roman" w:hAnsi="Times New Roman" w:cs="Times New Roman"/>
+          <w:kern w:val="0"/>
+          <w:sz w:val="20"/>
+          <w:szCs w:val="20"/>
+          <w:lang w:eastAsia="en-IN"/>
+          <w14:ligatures w14:val="none"/>
+        </w:rPr>
+        <w:t>("Year")</w:t>
+      </w:r>
+    </w:p>
+    <w:p>
+      <w:pPr>
+        <w:pStyle w:val="ListParagraph"/>
+        <w:numPr>
+          <w:ilvl w:val="0"/>
+          <w:numId w:val="49"/>
+        </w:numPr>
+        <w:tabs>
+          <w:tab w:val="left" w:pos="916"/>
+          <w:tab w:val="left" w:pos="1832"/>
+          <w:tab w:val="left" w:pos="2748"/>
+          <w:tab w:val="left" w:pos="3664"/>
+          <w:tab w:val="left" w:pos="4580"/>
+          <w:tab w:val="left" w:pos="5496"/>
+          <w:tab w:val="left" w:pos="6412"/>
+          <w:tab w:val="left" w:pos="7328"/>
+          <w:tab w:val="left" w:pos="8244"/>
+          <w:tab w:val="left" w:pos="9160"/>
+          <w:tab w:val="left" w:pos="10076"/>
+          <w:tab w:val="left" w:pos="10992"/>
+          <w:tab w:val="left" w:pos="11908"/>
+          <w:tab w:val="left" w:pos="12824"/>
+          <w:tab w:val="left" w:pos="13740"/>
+          <w:tab w:val="left" w:pos="14656"/>
+        </w:tabs>
+        <w:spacing w:after="0" w:line="240" w:lineRule="auto"/>
+        <w:rPr>
+          <w:rFonts w:ascii="Times New Roman" w:eastAsia="Times New Roman" w:hAnsi="Times New Roman" w:cs="Times New Roman"/>
+          <w:kern w:val="0"/>
+          <w:sz w:val="20"/>
+          <w:szCs w:val="20"/>
+          <w:lang w:eastAsia="en-IN"/>
+          <w14:ligatures w14:val="none"/>
+        </w:rPr>
+      </w:pPr>
+      <w:proofErr w:type="spellStart"/>
+      <w:r>
+        <w:rPr>
+          <w:rFonts w:ascii="Times New Roman" w:eastAsia="Times New Roman" w:hAnsi="Times New Roman" w:cs="Times New Roman"/>
+          <w:kern w:val="0"/>
+          <w:sz w:val="20"/>
+          <w:szCs w:val="20"/>
+          <w:lang w:eastAsia="en-IN"/>
+          <w14:ligatures w14:val="none"/>
+        </w:rPr>
+        <w:t>plt.ylabel</w:t>
+      </w:r>
+      <w:proofErr w:type="spellEnd"/>
+      <w:r>
+        <w:rPr>
+          <w:rFonts w:ascii="Times New Roman" w:eastAsia="Times New Roman" w:hAnsi="Times New Roman" w:cs="Times New Roman"/>
+          <w:kern w:val="0"/>
+          <w:sz w:val="20"/>
+          <w:szCs w:val="20"/>
+          <w:lang w:eastAsia="en-IN"/>
+          <w14:ligatures w14:val="none"/>
+        </w:rPr>
+        <w:t>("GDP YoY Growth (%)")</w:t>
+      </w:r>
+    </w:p>
+    <w:p>
+      <w:pPr>
+        <w:pStyle w:val="ListParagraph"/>
+        <w:numPr>
+          <w:ilvl w:val="0"/>
+          <w:numId w:val="49"/>
+        </w:numPr>
+        <w:tabs>
+          <w:tab w:val="left" w:pos="916"/>
+          <w:tab w:val="left" w:pos="1832"/>
+          <w:tab w:val="left" w:pos="2748"/>
+          <w:tab w:val="left" w:pos="3664"/>
+          <w:tab w:val="left" w:pos="4580"/>
+          <w:tab w:val="left" w:pos="5496"/>
+          <w:tab w:val="left" w:pos="6412"/>
+          <w:tab w:val="left" w:pos="7328"/>
+          <w:tab w:val="left" w:pos="8244"/>
+          <w:tab w:val="left" w:pos="9160"/>
+          <w:tab w:val="left" w:pos="10076"/>
+          <w:tab w:val="left" w:pos="10992"/>
+          <w:tab w:val="left" w:pos="11908"/>
+          <w:tab w:val="left" w:pos="12824"/>
+          <w:tab w:val="left" w:pos="13740"/>
+          <w:tab w:val="left" w:pos="14656"/>
+        </w:tabs>
+        <w:spacing w:after="0" w:line="240" w:lineRule="auto"/>
+        <w:rPr>
+          <w:rFonts w:ascii="Times New Roman" w:eastAsia="Times New Roman" w:hAnsi="Times New Roman" w:cs="Times New Roman"/>
+          <w:kern w:val="0"/>
+          <w:sz w:val="20"/>
+          <w:szCs w:val="20"/>
+          <w:lang w:eastAsia="en-IN"/>
+          <w14:ligatures w14:val="none"/>
+        </w:rPr>
+      </w:pPr>
+      <w:proofErr w:type="spellStart"/>
+      <w:r>
+        <w:rPr>
+          <w:rFonts w:ascii="Times New Roman" w:eastAsia="Times New Roman" w:hAnsi="Times New Roman" w:cs="Times New Roman"/>
+          <w:kern w:val="0"/>
+          <w:sz w:val="20"/>
+          <w:szCs w:val="20"/>
+          <w:lang w:eastAsia="en-IN"/>
+          <w14:ligatures w14:val="none"/>
+        </w:rPr>
+        <w:t>plt.title</w:t>
+      </w:r>
+      <w:proofErr w:type="spellEnd"/>
+      <w:r>
+        <w:rPr>
+          <w:rFonts w:ascii="Times New Roman" w:eastAsia="Times New Roman" w:hAnsi="Times New Roman" w:cs="Times New Roman"/>
+          <w:kern w:val="0"/>
+          <w:sz w:val="20"/>
+          <w:szCs w:val="20"/>
+          <w:lang w:eastAsia="en-IN"/>
+          <w14:ligatures w14:val="none"/>
+        </w:rPr>
+        <w:t>("India GDP Year-on-Year Growth, 1960–2024")</w:t>
+      </w:r>
+    </w:p>
+    <w:p>
+      <w:pPr>
+        <w:pStyle w:val="ListParagraph"/>
+        <w:numPr>
+          <w:ilvl w:val="0"/>
+          <w:numId w:val="49"/>
+        </w:numPr>
+        <w:tabs>
+          <w:tab w:val="left" w:pos="916"/>
+          <w:tab w:val="left" w:pos="1832"/>
+          <w:tab w:val="left" w:pos="2748"/>
+          <w:tab w:val="left" w:pos="3664"/>
+          <w:tab w:val="left" w:pos="4580"/>
+          <w:tab w:val="left" w:pos="5496"/>
+          <w:tab w:val="left" w:pos="6412"/>
+          <w:tab w:val="left" w:pos="7328"/>
+          <w:tab w:val="left" w:pos="8244"/>
+          <w:tab w:val="left" w:pos="9160"/>
+          <w:tab w:val="left" w:pos="10076"/>
+          <w:tab w:val="left" w:pos="10992"/>
+          <w:tab w:val="left" w:pos="11908"/>
+          <w:tab w:val="left" w:pos="12824"/>
+          <w:tab w:val="left" w:pos="13740"/>
+          <w:tab w:val="left" w:pos="14656"/>
+        </w:tabs>
+        <w:spacing w:after="0" w:line="240" w:lineRule="auto"/>
+        <w:rPr>
+          <w:rFonts w:ascii="Times New Roman" w:eastAsia="Times New Roman" w:hAnsi="Times New Roman" w:cs="Times New Roman"/>
+          <w:kern w:val="0"/>
+          <w:sz w:val="20"/>
+          <w:szCs w:val="20"/>
+          <w:lang w:eastAsia="en-IN"/>
+          <w14:ligatures w14:val="none"/>
+        </w:rPr>
+      </w:pPr>
+      <w:proofErr w:type="spellStart"/>
+      <w:r>
+        <w:rPr>
+          <w:rFonts w:ascii="Times New Roman" w:eastAsia="Times New Roman" w:hAnsi="Times New Roman" w:cs="Times New Roman"/>
+          <w:kern w:val="0"/>
+          <w:sz w:val="20"/>
+          <w:szCs w:val="20"/>
+          <w:lang w:eastAsia="en-IN"/>
+          <w14:ligatures w14:val="none"/>
+        </w:rPr>
+        <w:t>plt.legend</w:t>
+      </w:r>
+      <w:proofErr w:type="spellEnd"/>
+      <w:r>
+        <w:rPr>
+          <w:rFonts w:ascii="Times New Roman" w:eastAsia="Times New Roman" w:hAnsi="Times New Roman" w:cs="Times New Roman"/>
+          <w:kern w:val="0"/>
+          <w:sz w:val="20"/>
+          <w:szCs w:val="20"/>
+          <w:lang w:eastAsia="en-IN"/>
+          <w14:ligatures w14:val="none"/>
+        </w:rPr>
+        <w:t>()</w:t>
+      </w:r>
+    </w:p>
+    <w:p>
+      <w:pPr>
+        <w:pStyle w:val="ListParagraph"/>
+        <w:numPr>
+          <w:ilvl w:val="0"/>
+          <w:numId w:val="49"/>
+        </w:numPr>
+        <w:tabs>
+          <w:tab w:val="left" w:pos="916"/>
+          <w:tab w:val="left" w:pos="1832"/>
+          <w:tab w:val="left" w:pos="2748"/>
+          <w:tab w:val="left" w:pos="3664"/>
+          <w:tab w:val="left" w:pos="4580"/>
+          <w:tab w:val="left" w:pos="5496"/>
+          <w:tab w:val="left" w:pos="6412"/>
+          <w:tab w:val="left" w:pos="7328"/>
+          <w:tab w:val="left" w:pos="8244"/>
+          <w:tab w:val="left" w:pos="9160"/>
+          <w:tab w:val="left" w:pos="10076"/>
+          <w:tab w:val="left" w:pos="10992"/>
+          <w:tab w:val="left" w:pos="11908"/>
+          <w:tab w:val="left" w:pos="12824"/>
+          <w:tab w:val="left" w:pos="13740"/>
+          <w:tab w:val="left" w:pos="14656"/>
+        </w:tabs>
+        <w:spacing w:after="0" w:line="240" w:lineRule="auto"/>
+        <w:rPr>
+          <w:rFonts w:ascii="Times New Roman" w:eastAsia="Times New Roman" w:hAnsi="Times New Roman" w:cs="Times New Roman"/>
+          <w:kern w:val="0"/>
+          <w:sz w:val="20"/>
+          <w:szCs w:val="20"/>
+          <w:lang w:eastAsia="en-IN"/>
+          <w14:ligatures w14:val="none"/>
+        </w:rPr>
+      </w:pPr>
+      <w:proofErr w:type="spellStart"/>
+      <w:r>
+        <w:rPr>
+          <w:rFonts w:ascii="Times New Roman" w:eastAsia="Times New Roman" w:hAnsi="Times New Roman" w:cs="Times New Roman"/>
+          <w:kern w:val="0"/>
+          <w:sz w:val="20"/>
+          <w:szCs w:val="20"/>
+          <w:lang w:eastAsia="en-IN"/>
+          <w14:ligatures w14:val="none"/>
+        </w:rPr>
+        <w:t>plt.tight_layout</w:t>
+      </w:r>
+      <w:proofErr w:type="spellEnd"/>
+      <w:r>
+        <w:rPr>
+          <w:rFonts w:ascii="Times New Roman" w:eastAsia="Times New Roman" w:hAnsi="Times New Roman" w:cs="Times New Roman"/>
+          <w:kern w:val="0"/>
+          <w:sz w:val="20"/>
+          <w:szCs w:val="20"/>
+          <w:lang w:eastAsia="en-IN"/>
+          <w14:ligatures w14:val="none"/>
+        </w:rPr>
+        <w:t>()</w:t>
+      </w:r>
+    </w:p>
+    <w:p>
+      <w:pPr>
+        <w:pStyle w:val="ListParagraph"/>
+        <w:numPr>
+          <w:ilvl w:val="0"/>
+          <w:numId w:val="49"/>
+        </w:numPr>
+        <w:tabs>
+          <w:tab w:val="left" w:pos="916"/>
+          <w:tab w:val="left" w:pos="1832"/>
+          <w:tab w:val="left" w:pos="2748"/>
+          <w:tab w:val="left" w:pos="3664"/>
+          <w:tab w:val="left" w:pos="4580"/>
+          <w:tab w:val="left" w:pos="5496"/>
+          <w:tab w:val="left" w:pos="6412"/>
+          <w:tab w:val="left" w:pos="7328"/>
+          <w:tab w:val="left" w:pos="8244"/>
+          <w:tab w:val="left" w:pos="9160"/>
+          <w:tab w:val="left" w:pos="10076"/>
+          <w:tab w:val="left" w:pos="10992"/>
+          <w:tab w:val="left" w:pos="11908"/>
+          <w:tab w:val="left" w:pos="12824"/>
+          <w:tab w:val="left" w:pos="13740"/>
+          <w:tab w:val="left" w:pos="14656"/>
+        </w:tabs>
+        <w:spacing w:after="0" w:line="240" w:lineRule="auto"/>
+        <w:rPr>
+          <w:rFonts w:ascii="Times New Roman" w:eastAsia="Times New Roman" w:hAnsi="Times New Roman" w:cs="Times New Roman"/>
+          <w:kern w:val="0"/>
+          <w:sz w:val="20"/>
+          <w:szCs w:val="20"/>
+          <w:lang w:eastAsia="en-IN"/>
+          <w14:ligatures w14:val="none"/>
+        </w:rPr>
+      </w:pPr>
+      <w:proofErr w:type="spellStart"/>
+      <w:r>
+        <w:rPr>
+          <w:rFonts w:ascii="Times New Roman" w:eastAsia="Times New Roman" w:hAnsi="Times New Roman" w:cs="Times New Roman"/>
+          <w:kern w:val="0"/>
+          <w:sz w:val="20"/>
+          <w:szCs w:val="20"/>
+          <w:lang w:eastAsia="en-IN"/>
+          <w14:ligatures w14:val="none"/>
+        </w:rPr>
+        <w:t>plt.show</w:t>
+      </w:r>
+      <w:proofErr w:type="spellEnd"/>
+      <w:r>
+        <w:rPr>
+          <w:rFonts w:ascii="Times New Roman" w:eastAsia="Times New Roman" w:hAnsi="Times New Roman" w:cs="Times New Roman"/>
+          <w:kern w:val="0"/>
+          <w:sz w:val="20"/>
+          <w:szCs w:val="20"/>
+          <w:lang w:eastAsia="en-IN"/>
+          <w14:ligatures w14:val="none"/>
+        </w:rPr>
+        <w:t>()</w:t>
+      </w:r>
+    </w:p>
+    <w:p>
+      <w:pPr>
+        <w:tabs>
+          <w:tab w:val="left" w:pos="916"/>
+          <w:tab w:val="left" w:pos="1832"/>
+          <w:tab w:val="left" w:pos="2748"/>
+          <w:tab w:val="left" w:pos="3664"/>
+          <w:tab w:val="left" w:pos="4580"/>
+          <w:tab w:val="left" w:pos="5496"/>
+          <w:tab w:val="left" w:pos="6412"/>
+          <w:tab w:val="left" w:pos="7328"/>
+          <w:tab w:val="left" w:pos="8244"/>
+          <w:tab w:val="left" w:pos="9160"/>
+          <w:tab w:val="left" w:pos="10076"/>
+          <w:tab w:val="left" w:pos="10992"/>
+          <w:tab w:val="left" w:pos="11908"/>
+          <w:tab w:val="left" w:pos="12824"/>
+          <w:tab w:val="left" w:pos="13740"/>
+          <w:tab w:val="left" w:pos="14656"/>
+        </w:tabs>
+        <w:spacing w:after="0" w:line="240" w:lineRule="auto"/>
+        <w:rPr>
+          <w:rFonts w:ascii="Times New Roman" w:eastAsia="Times New Roman" w:hAnsi="Times New Roman" w:cs="Times New Roman"/>
+          <w:kern w:val="0"/>
+          <w:sz w:val="20"/>
+          <w:szCs w:val="20"/>
+          <w:lang w:eastAsia="en-IN"/>
+          <w14:ligatures w14:val="none"/>
+        </w:rPr>
+      </w:pPr>
+      <w:r>
+        <w:rPr>
+          <w:rFonts w:ascii="Times New Roman" w:eastAsia="Times New Roman" w:hAnsi="Times New Roman" w:cs="Times New Roman"/>
+          <w:kern w:val="0"/>
+          <w:sz w:val="20"/>
+          <w:szCs w:val="20"/>
+          <w:lang w:eastAsia="en-IN"/>
+          <w14:ligatures w14:val="none"/>
+        </w:rPr>
+        <w:lastRenderedPageBreak/>
+        <w:drawing>
+          <wp:inline distT="0" distB="0" distL="0" distR="0" wp14:anchorId="04CFA6D3" wp14:editId="2A3FCF43">
+            <wp:extent cx="6263640" cy="3105785"/>
+            <wp:effectExtent l="0" t="0" r="3810" b="0"/>
+            <wp:docPr id="1175100790" name="Picture 1"/>
+            <wp:cNvGraphicFramePr>
+              <a:graphicFrameLocks xmlns:a="http://schemas.openxmlformats.org/drawingml/2006/main" noChangeAspect="1"/>
+            </wp:cNvGraphicFramePr>
+            <a:graphic xmlns:a="http://schemas.openxmlformats.org/drawingml/2006/main">
+              <a:graphicData uri="http://schemas.openxmlformats.org/drawingml/2006/picture">
+                <pic:pic xmlns:pic="http://schemas.openxmlformats.org/drawingml/2006/picture">
+                  <pic:nvPicPr>
+                    <pic:cNvPr id="1175100790" name=""/>
+                    <pic:cNvPicPr/>
+                  </pic:nvPicPr>
+                  <pic:blipFill>
+                    <a:blip r:embed="rId28"/>
+                    <a:stretch>
+                      <a:fillRect/>
+                    </a:stretch>
+                  </pic:blipFill>
+                  <pic:spPr>
+                    <a:xfrm>
+                      <a:off x="0" y="0"/>
+                      <a:ext cx="6263640" cy="3105785"/>
+                    </a:xfrm>
+                    <a:prstGeom prst="rect">
+                      <a:avLst/>
+                    </a:prstGeom>
+                  </pic:spPr>
+                </pic:pic>
+              </a:graphicData>
+            </a:graphic>
+          </wp:inline>
+        </w:drawing>
+      </w:r>
+    </w:p>
+    <w:p>
+      <w:pPr>
+        <w:tabs>
+          <w:tab w:val="left" w:pos="916"/>
+          <w:tab w:val="left" w:pos="1832"/>
+          <w:tab w:val="left" w:pos="2748"/>
+          <w:tab w:val="left" w:pos="3664"/>
+          <w:tab w:val="left" w:pos="4580"/>
+          <w:tab w:val="left" w:pos="5496"/>
+          <w:tab w:val="left" w:pos="6412"/>
+          <w:tab w:val="left" w:pos="7328"/>
+          <w:tab w:val="left" w:pos="8244"/>
+          <w:tab w:val="left" w:pos="9160"/>
+          <w:tab w:val="left" w:pos="10076"/>
+          <w:tab w:val="left" w:pos="10992"/>
+          <w:tab w:val="left" w:pos="11908"/>
+          <w:tab w:val="left" w:pos="12824"/>
+          <w:tab w:val="left" w:pos="13740"/>
+          <w:tab w:val="left" w:pos="14656"/>
+        </w:tabs>
+        <w:spacing w:after="0" w:line="240" w:lineRule="auto"/>
+        <w:rPr>
+          <w:rFonts w:ascii="Courier New" w:eastAsia="Times New Roman" w:hAnsi="Courier New" w:cs="Courier New"/>
+          <w:kern w:val="0"/>
+          <w:sz w:val="20"/>
+          <w:szCs w:val="20"/>
+          <w:lang w:eastAsia="en-IN"/>
+          <w14:ligatures w14:val="none"/>
+        </w:rPr>
+      </w:pPr>
+    </w:p>
+    <w:p>
+      <w:pPr>
+        <w:tabs>
+          <w:tab w:val="left" w:pos="916"/>
+          <w:tab w:val="left" w:pos="1832"/>
+          <w:tab w:val="left" w:pos="2748"/>
+          <w:tab w:val="left" w:pos="3664"/>
+          <w:tab w:val="left" w:pos="4580"/>
+          <w:tab w:val="left" w:pos="5496"/>
+          <w:tab w:val="left" w:pos="6412"/>
+          <w:tab w:val="left" w:pos="7328"/>
+          <w:tab w:val="left" w:pos="8244"/>
+          <w:tab w:val="left" w:pos="9160"/>
+          <w:tab w:val="left" w:pos="10076"/>
+          <w:tab w:val="left" w:pos="10992"/>
+          <w:tab w:val="left" w:pos="11908"/>
+          <w:tab w:val="left" w:pos="12824"/>
+          <w:tab w:val="left" w:pos="13740"/>
+          <w:tab w:val="left" w:pos="14656"/>
+        </w:tabs>
+        <w:spacing w:after="0" w:line="240" w:lineRule="auto"/>
+        <w:rPr>
+          <w:rFonts w:ascii="Courier New" w:eastAsia="Times New Roman" w:hAnsi="Courier New" w:cs="Courier New"/>
+          <w:kern w:val="0"/>
+          <w:sz w:val="20"/>
+          <w:szCs w:val="20"/>
+          <w:lang w:eastAsia="en-IN"/>
+          <w14:ligatures w14:val="none"/>
+        </w:rPr>
+      </w:pPr>
+    </w:p>
+    <w:p>
+      <w:pPr>
+        <w:tabs>
+          <w:tab w:val="left" w:pos="916"/>
+          <w:tab w:val="left" w:pos="1832"/>
+          <w:tab w:val="left" w:pos="2748"/>
+          <w:tab w:val="left" w:pos="3664"/>
+          <w:tab w:val="left" w:pos="4580"/>
+          <w:tab w:val="left" w:pos="5496"/>
+          <w:tab w:val="left" w:pos="6412"/>
+          <w:tab w:val="left" w:pos="7328"/>
+          <w:tab w:val="left" w:pos="8244"/>
+          <w:tab w:val="left" w:pos="9160"/>
+          <w:tab w:val="left" w:pos="10076"/>
+          <w:tab w:val="left" w:pos="10992"/>
+          <w:tab w:val="left" w:pos="11908"/>
+          <w:tab w:val="left" w:pos="12824"/>
+          <w:tab w:val="left" w:pos="13740"/>
+          <w:tab w:val="left" w:pos="14656"/>
+        </w:tabs>
+        <w:spacing w:after="0" w:line="240" w:lineRule="auto"/>
+        <w:rPr>
+          <w:rFonts w:ascii="Courier New" w:eastAsia="Times New Roman" w:hAnsi="Courier New" w:cs="Courier New"/>
+          <w:kern w:val="0"/>
+          <w:sz w:val="20"/>
+          <w:szCs w:val="20"/>
+          <w:lang w:eastAsia="en-IN"/>
+          <w14:ligatures w14:val="none"/>
+        </w:rPr>
+      </w:pPr>
+    </w:p>
+    <w:p>
+      <w:pPr>
+        <w:pStyle w:val="NormalWeb"/>
+      </w:pPr>
+    </w:p>
+    <w:p>
+      <w:pPr>
+        <w:pStyle w:val="NormalWeb"/>
+      </w:pPr>
+    </w:p>
+    <w:p>
+      <w:pPr>
+        <w:pStyle w:val="NormalWeb"/>
+      </w:pPr>
+    </w:p>
+    <w:p>
+      <w:pPr>
+        <w:pStyle w:val="NormalWeb"/>
+      </w:pPr>
     </w:p>
     <w:p>
       <w:pPr>
@@ -48651,122 +50723,9 @@
     </w:lvl>
   </w:abstractNum>
   <w:abstractNum w:abstractNumId="23" w15:restartNumberingAfterBreak="0">
-    <w:nsid w:val="375609F0"/>
+    <w:nsid w:val="36825F7E"/>
     <w:multiLevelType w:val="hybridMultilevel"/>
-    <w:tmpl w:val="CFA0CEB4"/>
-    <w:lvl w:ilvl="0" w:tplc="40090001">
-      <w:start w:val="1"/>
-      <w:numFmt w:val="bullet"/>
-      <w:lvlText w:val=""/>
-      <w:lvlJc w:val="left"/>
-      <w:pPr>
-        <w:ind w:left="720" w:hanging="360"/>
-      </w:pPr>
-      <w:rPr>
-        <w:rFonts w:ascii="Symbol" w:hAnsi="Symbol" w:hint="default"/>
-      </w:rPr>
-    </w:lvl>
-    <w:lvl w:ilvl="1" w:tplc="40090003" w:tentative="1">
-      <w:start w:val="1"/>
-      <w:numFmt w:val="bullet"/>
-      <w:lvlText w:val="o"/>
-      <w:lvlJc w:val="left"/>
-      <w:pPr>
-        <w:ind w:left="1440" w:hanging="360"/>
-      </w:pPr>
-      <w:rPr>
-        <w:rFonts w:ascii="Courier New" w:hAnsi="Courier New" w:cs="Courier New" w:hint="default"/>
-      </w:rPr>
-    </w:lvl>
-    <w:lvl w:ilvl="2" w:tplc="40090005" w:tentative="1">
-      <w:start w:val="1"/>
-      <w:numFmt w:val="bullet"/>
-      <w:lvlText w:val=""/>
-      <w:lvlJc w:val="left"/>
-      <w:pPr>
-        <w:ind w:left="2160" w:hanging="360"/>
-      </w:pPr>
-      <w:rPr>
-        <w:rFonts w:ascii="Wingdings" w:hAnsi="Wingdings" w:hint="default"/>
-      </w:rPr>
-    </w:lvl>
-    <w:lvl w:ilvl="3" w:tplc="40090001" w:tentative="1">
-      <w:start w:val="1"/>
-      <w:numFmt w:val="bullet"/>
-      <w:lvlText w:val=""/>
-      <w:lvlJc w:val="left"/>
-      <w:pPr>
-        <w:ind w:left="2880" w:hanging="360"/>
-      </w:pPr>
-      <w:rPr>
-        <w:rFonts w:ascii="Symbol" w:hAnsi="Symbol" w:hint="default"/>
-      </w:rPr>
-    </w:lvl>
-    <w:lvl w:ilvl="4" w:tplc="40090003" w:tentative="1">
-      <w:start w:val="1"/>
-      <w:numFmt w:val="bullet"/>
-      <w:lvlText w:val="o"/>
-      <w:lvlJc w:val="left"/>
-      <w:pPr>
-        <w:ind w:left="3600" w:hanging="360"/>
-      </w:pPr>
-      <w:rPr>
-        <w:rFonts w:ascii="Courier New" w:hAnsi="Courier New" w:cs="Courier New" w:hint="default"/>
-      </w:rPr>
-    </w:lvl>
-    <w:lvl w:ilvl="5" w:tplc="40090005" w:tentative="1">
-      <w:start w:val="1"/>
-      <w:numFmt w:val="bullet"/>
-      <w:lvlText w:val=""/>
-      <w:lvlJc w:val="left"/>
-      <w:pPr>
-        <w:ind w:left="4320" w:hanging="360"/>
-      </w:pPr>
-      <w:rPr>
-        <w:rFonts w:ascii="Wingdings" w:hAnsi="Wingdings" w:hint="default"/>
-      </w:rPr>
-    </w:lvl>
-    <w:lvl w:ilvl="6" w:tplc="40090001" w:tentative="1">
-      <w:start w:val="1"/>
-      <w:numFmt w:val="bullet"/>
-      <w:lvlText w:val=""/>
-      <w:lvlJc w:val="left"/>
-      <w:pPr>
-        <w:ind w:left="5040" w:hanging="360"/>
-      </w:pPr>
-      <w:rPr>
-        <w:rFonts w:ascii="Symbol" w:hAnsi="Symbol" w:hint="default"/>
-      </w:rPr>
-    </w:lvl>
-    <w:lvl w:ilvl="7" w:tplc="40090003" w:tentative="1">
-      <w:start w:val="1"/>
-      <w:numFmt w:val="bullet"/>
-      <w:lvlText w:val="o"/>
-      <w:lvlJc w:val="left"/>
-      <w:pPr>
-        <w:ind w:left="5760" w:hanging="360"/>
-      </w:pPr>
-      <w:rPr>
-        <w:rFonts w:ascii="Courier New" w:hAnsi="Courier New" w:cs="Courier New" w:hint="default"/>
-      </w:rPr>
-    </w:lvl>
-    <w:lvl w:ilvl="8" w:tplc="40090005" w:tentative="1">
-      <w:start w:val="1"/>
-      <w:numFmt w:val="bullet"/>
-      <w:lvlText w:val=""/>
-      <w:lvlJc w:val="left"/>
-      <w:pPr>
-        <w:ind w:left="6480" w:hanging="360"/>
-      </w:pPr>
-      <w:rPr>
-        <w:rFonts w:ascii="Wingdings" w:hAnsi="Wingdings" w:hint="default"/>
-      </w:rPr>
-    </w:lvl>
-  </w:abstractNum>
-  <w:abstractNum w:abstractNumId="24" w15:restartNumberingAfterBreak="0">
-    <w:nsid w:val="3A2F6153"/>
-    <w:multiLevelType w:val="hybridMultilevel"/>
-    <w:tmpl w:val="6B868652"/>
+    <w:tmpl w:val="0A6E5978"/>
     <w:lvl w:ilvl="0" w:tplc="9768F0A0">
       <w:start w:val="1"/>
       <w:numFmt w:val="bullet"/>
@@ -48878,10 +50837,123 @@
       </w:rPr>
     </w:lvl>
   </w:abstractNum>
+  <w:abstractNum w:abstractNumId="24" w15:restartNumberingAfterBreak="0">
+    <w:nsid w:val="375609F0"/>
+    <w:multiLevelType w:val="hybridMultilevel"/>
+    <w:tmpl w:val="CFA0CEB4"/>
+    <w:lvl w:ilvl="0" w:tplc="40090001">
+      <w:start w:val="1"/>
+      <w:numFmt w:val="bullet"/>
+      <w:lvlText w:val=""/>
+      <w:lvlJc w:val="left"/>
+      <w:pPr>
+        <w:ind w:left="720" w:hanging="360"/>
+      </w:pPr>
+      <w:rPr>
+        <w:rFonts w:ascii="Symbol" w:hAnsi="Symbol" w:hint="default"/>
+      </w:rPr>
+    </w:lvl>
+    <w:lvl w:ilvl="1" w:tplc="40090003" w:tentative="1">
+      <w:start w:val="1"/>
+      <w:numFmt w:val="bullet"/>
+      <w:lvlText w:val="o"/>
+      <w:lvlJc w:val="left"/>
+      <w:pPr>
+        <w:ind w:left="1440" w:hanging="360"/>
+      </w:pPr>
+      <w:rPr>
+        <w:rFonts w:ascii="Courier New" w:hAnsi="Courier New" w:cs="Courier New" w:hint="default"/>
+      </w:rPr>
+    </w:lvl>
+    <w:lvl w:ilvl="2" w:tplc="40090005" w:tentative="1">
+      <w:start w:val="1"/>
+      <w:numFmt w:val="bullet"/>
+      <w:lvlText w:val=""/>
+      <w:lvlJc w:val="left"/>
+      <w:pPr>
+        <w:ind w:left="2160" w:hanging="360"/>
+      </w:pPr>
+      <w:rPr>
+        <w:rFonts w:ascii="Wingdings" w:hAnsi="Wingdings" w:hint="default"/>
+      </w:rPr>
+    </w:lvl>
+    <w:lvl w:ilvl="3" w:tplc="40090001" w:tentative="1">
+      <w:start w:val="1"/>
+      <w:numFmt w:val="bullet"/>
+      <w:lvlText w:val=""/>
+      <w:lvlJc w:val="left"/>
+      <w:pPr>
+        <w:ind w:left="2880" w:hanging="360"/>
+      </w:pPr>
+      <w:rPr>
+        <w:rFonts w:ascii="Symbol" w:hAnsi="Symbol" w:hint="default"/>
+      </w:rPr>
+    </w:lvl>
+    <w:lvl w:ilvl="4" w:tplc="40090003" w:tentative="1">
+      <w:start w:val="1"/>
+      <w:numFmt w:val="bullet"/>
+      <w:lvlText w:val="o"/>
+      <w:lvlJc w:val="left"/>
+      <w:pPr>
+        <w:ind w:left="3600" w:hanging="360"/>
+      </w:pPr>
+      <w:rPr>
+        <w:rFonts w:ascii="Courier New" w:hAnsi="Courier New" w:cs="Courier New" w:hint="default"/>
+      </w:rPr>
+    </w:lvl>
+    <w:lvl w:ilvl="5" w:tplc="40090005" w:tentative="1">
+      <w:start w:val="1"/>
+      <w:numFmt w:val="bullet"/>
+      <w:lvlText w:val=""/>
+      <w:lvlJc w:val="left"/>
+      <w:pPr>
+        <w:ind w:left="4320" w:hanging="360"/>
+      </w:pPr>
+      <w:rPr>
+        <w:rFonts w:ascii="Wingdings" w:hAnsi="Wingdings" w:hint="default"/>
+      </w:rPr>
+    </w:lvl>
+    <w:lvl w:ilvl="6" w:tplc="40090001" w:tentative="1">
+      <w:start w:val="1"/>
+      <w:numFmt w:val="bullet"/>
+      <w:lvlText w:val=""/>
+      <w:lvlJc w:val="left"/>
+      <w:pPr>
+        <w:ind w:left="5040" w:hanging="360"/>
+      </w:pPr>
+      <w:rPr>
+        <w:rFonts w:ascii="Symbol" w:hAnsi="Symbol" w:hint="default"/>
+      </w:rPr>
+    </w:lvl>
+    <w:lvl w:ilvl="7" w:tplc="40090003" w:tentative="1">
+      <w:start w:val="1"/>
+      <w:numFmt w:val="bullet"/>
+      <w:lvlText w:val="o"/>
+      <w:lvlJc w:val="left"/>
+      <w:pPr>
+        <w:ind w:left="5760" w:hanging="360"/>
+      </w:pPr>
+      <w:rPr>
+        <w:rFonts w:ascii="Courier New" w:hAnsi="Courier New" w:cs="Courier New" w:hint="default"/>
+      </w:rPr>
+    </w:lvl>
+    <w:lvl w:ilvl="8" w:tplc="40090005" w:tentative="1">
+      <w:start w:val="1"/>
+      <w:numFmt w:val="bullet"/>
+      <w:lvlText w:val=""/>
+      <w:lvlJc w:val="left"/>
+      <w:pPr>
+        <w:ind w:left="6480" w:hanging="360"/>
+      </w:pPr>
+      <w:rPr>
+        <w:rFonts w:ascii="Wingdings" w:hAnsi="Wingdings" w:hint="default"/>
+      </w:rPr>
+    </w:lvl>
+  </w:abstractNum>
   <w:abstractNum w:abstractNumId="25" w15:restartNumberingAfterBreak="0">
-    <w:nsid w:val="3A8A7F87"/>
+    <w:nsid w:val="3A2F6153"/>
     <w:multiLevelType w:val="hybridMultilevel"/>
-    <w:tmpl w:val="52A2962E"/>
+    <w:tmpl w:val="6B868652"/>
     <w:lvl w:ilvl="0" w:tplc="9768F0A0">
       <w:start w:val="1"/>
       <w:numFmt w:val="bullet"/>
@@ -48994,9 +51066,9 @@
     </w:lvl>
   </w:abstractNum>
   <w:abstractNum w:abstractNumId="26" w15:restartNumberingAfterBreak="0">
-    <w:nsid w:val="4035009E"/>
+    <w:nsid w:val="3A8A7F87"/>
     <w:multiLevelType w:val="hybridMultilevel"/>
-    <w:tmpl w:val="F24C098E"/>
+    <w:tmpl w:val="52A2962E"/>
     <w:lvl w:ilvl="0" w:tplc="9768F0A0">
       <w:start w:val="1"/>
       <w:numFmt w:val="bullet"/>
@@ -49109,9 +51181,9 @@
     </w:lvl>
   </w:abstractNum>
   <w:abstractNum w:abstractNumId="27" w15:restartNumberingAfterBreak="0">
-    <w:nsid w:val="42B607C0"/>
+    <w:nsid w:val="4035009E"/>
     <w:multiLevelType w:val="hybridMultilevel"/>
-    <w:tmpl w:val="1F36CBFE"/>
+    <w:tmpl w:val="F24C098E"/>
     <w:lvl w:ilvl="0" w:tplc="9768F0A0">
       <w:start w:val="1"/>
       <w:numFmt w:val="bullet"/>
@@ -49224,16 +51296,16 @@
     </w:lvl>
   </w:abstractNum>
   <w:abstractNum w:abstractNumId="28" w15:restartNumberingAfterBreak="0">
-    <w:nsid w:val="446341C4"/>
+    <w:nsid w:val="42B607C0"/>
     <w:multiLevelType w:val="hybridMultilevel"/>
-    <w:tmpl w:val="30F445F0"/>
+    <w:tmpl w:val="1F36CBFE"/>
     <w:lvl w:ilvl="0" w:tplc="9768F0A0">
       <w:start w:val="1"/>
       <w:numFmt w:val="bullet"/>
       <w:lvlText w:val=""/>
       <w:lvlJc w:val="left"/>
       <w:pPr>
-        <w:ind w:left="1080" w:hanging="360"/>
+        <w:ind w:left="720" w:hanging="360"/>
       </w:pPr>
       <w:rPr>
         <w:rFonts w:ascii="Wingdings" w:hAnsi="Wingdings" w:hint="default"/>
@@ -49247,7 +51319,7 @@
       <w:lvlText w:val="o"/>
       <w:lvlJc w:val="left"/>
       <w:pPr>
-        <w:ind w:left="1800" w:hanging="360"/>
+        <w:ind w:left="1440" w:hanging="360"/>
       </w:pPr>
       <w:rPr>
         <w:rFonts w:ascii="Courier New" w:hAnsi="Courier New" w:cs="Courier New" w:hint="default"/>
@@ -49259,7 +51331,7 @@
       <w:lvlText w:val=""/>
       <w:lvlJc w:val="left"/>
       <w:pPr>
-        <w:ind w:left="2520" w:hanging="360"/>
+        <w:ind w:left="2160" w:hanging="360"/>
       </w:pPr>
       <w:rPr>
         <w:rFonts w:ascii="Wingdings" w:hAnsi="Wingdings" w:hint="default"/>
@@ -49271,7 +51343,7 @@
       <w:lvlText w:val=""/>
       <w:lvlJc w:val="left"/>
       <w:pPr>
-        <w:ind w:left="3240" w:hanging="360"/>
+        <w:ind w:left="2880" w:hanging="360"/>
       </w:pPr>
       <w:rPr>
         <w:rFonts w:ascii="Symbol" w:hAnsi="Symbol" w:hint="default"/>
@@ -49283,7 +51355,7 @@
       <w:lvlText w:val="o"/>
       <w:lvlJc w:val="left"/>
       <w:pPr>
-        <w:ind w:left="3960" w:hanging="360"/>
+        <w:ind w:left="3600" w:hanging="360"/>
       </w:pPr>
       <w:rPr>
         <w:rFonts w:ascii="Courier New" w:hAnsi="Courier New" w:cs="Courier New" w:hint="default"/>
@@ -49295,7 +51367,7 @@
       <w:lvlText w:val=""/>
       <w:lvlJc w:val="left"/>
       <w:pPr>
-        <w:ind w:left="4680" w:hanging="360"/>
+        <w:ind w:left="4320" w:hanging="360"/>
       </w:pPr>
       <w:rPr>
         <w:rFonts w:ascii="Wingdings" w:hAnsi="Wingdings" w:hint="default"/>
@@ -49307,7 +51379,7 @@
       <w:lvlText w:val=""/>
       <w:lvlJc w:val="left"/>
       <w:pPr>
-        <w:ind w:left="5400" w:hanging="360"/>
+        <w:ind w:left="5040" w:hanging="360"/>
       </w:pPr>
       <w:rPr>
         <w:rFonts w:ascii="Symbol" w:hAnsi="Symbol" w:hint="default"/>
@@ -49319,7 +51391,7 @@
       <w:lvlText w:val="o"/>
       <w:lvlJc w:val="left"/>
       <w:pPr>
-        <w:ind w:left="6120" w:hanging="360"/>
+        <w:ind w:left="5760" w:hanging="360"/>
       </w:pPr>
       <w:rPr>
         <w:rFonts w:ascii="Courier New" w:hAnsi="Courier New" w:cs="Courier New" w:hint="default"/>
@@ -49331,7 +51403,7 @@
       <w:lvlText w:val=""/>
       <w:lvlJc w:val="left"/>
       <w:pPr>
-        <w:ind w:left="6840" w:hanging="360"/>
+        <w:ind w:left="6480" w:hanging="360"/>
       </w:pPr>
       <w:rPr>
         <w:rFonts w:ascii="Wingdings" w:hAnsi="Wingdings" w:hint="default"/>
@@ -49339,16 +51411,16 @@
     </w:lvl>
   </w:abstractNum>
   <w:abstractNum w:abstractNumId="29" w15:restartNumberingAfterBreak="0">
-    <w:nsid w:val="49A32D91"/>
+    <w:nsid w:val="446341C4"/>
     <w:multiLevelType w:val="hybridMultilevel"/>
-    <w:tmpl w:val="9F586C38"/>
+    <w:tmpl w:val="30F445F0"/>
     <w:lvl w:ilvl="0" w:tplc="9768F0A0">
       <w:start w:val="1"/>
       <w:numFmt w:val="bullet"/>
       <w:lvlText w:val=""/>
       <w:lvlJc w:val="left"/>
       <w:pPr>
-        <w:ind w:left="720" w:hanging="360"/>
+        <w:ind w:left="1080" w:hanging="360"/>
       </w:pPr>
       <w:rPr>
         <w:rFonts w:ascii="Wingdings" w:hAnsi="Wingdings" w:hint="default"/>
@@ -49362,7 +51434,7 @@
       <w:lvlText w:val="o"/>
       <w:lvlJc w:val="left"/>
       <w:pPr>
-        <w:ind w:left="1440" w:hanging="360"/>
+        <w:ind w:left="1800" w:hanging="360"/>
       </w:pPr>
       <w:rPr>
         <w:rFonts w:ascii="Courier New" w:hAnsi="Courier New" w:cs="Courier New" w:hint="default"/>
@@ -49374,7 +51446,7 @@
       <w:lvlText w:val=""/>
       <w:lvlJc w:val="left"/>
       <w:pPr>
-        <w:ind w:left="2160" w:hanging="360"/>
+        <w:ind w:left="2520" w:hanging="360"/>
       </w:pPr>
       <w:rPr>
         <w:rFonts w:ascii="Wingdings" w:hAnsi="Wingdings" w:hint="default"/>
@@ -49386,7 +51458,7 @@
       <w:lvlText w:val=""/>
       <w:lvlJc w:val="left"/>
       <w:pPr>
-        <w:ind w:left="2880" w:hanging="360"/>
+        <w:ind w:left="3240" w:hanging="360"/>
       </w:pPr>
       <w:rPr>
         <w:rFonts w:ascii="Symbol" w:hAnsi="Symbol" w:hint="default"/>
@@ -49398,7 +51470,7 @@
       <w:lvlText w:val="o"/>
       <w:lvlJc w:val="left"/>
       <w:pPr>
-        <w:ind w:left="3600" w:hanging="360"/>
+        <w:ind w:left="3960" w:hanging="360"/>
       </w:pPr>
       <w:rPr>
         <w:rFonts w:ascii="Courier New" w:hAnsi="Courier New" w:cs="Courier New" w:hint="default"/>
@@ -49410,7 +51482,7 @@
       <w:lvlText w:val=""/>
       <w:lvlJc w:val="left"/>
       <w:pPr>
-        <w:ind w:left="4320" w:hanging="360"/>
+        <w:ind w:left="4680" w:hanging="360"/>
       </w:pPr>
       <w:rPr>
         <w:rFonts w:ascii="Wingdings" w:hAnsi="Wingdings" w:hint="default"/>
@@ -49422,7 +51494,7 @@
       <w:lvlText w:val=""/>
       <w:lvlJc w:val="left"/>
       <w:pPr>
-        <w:ind w:left="5040" w:hanging="360"/>
+        <w:ind w:left="5400" w:hanging="360"/>
       </w:pPr>
       <w:rPr>
         <w:rFonts w:ascii="Symbol" w:hAnsi="Symbol" w:hint="default"/>
@@ -49434,7 +51506,7 @@
       <w:lvlText w:val="o"/>
       <w:lvlJc w:val="left"/>
       <w:pPr>
-        <w:ind w:left="5760" w:hanging="360"/>
+        <w:ind w:left="6120" w:hanging="360"/>
       </w:pPr>
       <w:rPr>
         <w:rFonts w:ascii="Courier New" w:hAnsi="Courier New" w:cs="Courier New" w:hint="default"/>
@@ -49446,7 +51518,7 @@
       <w:lvlText w:val=""/>
       <w:lvlJc w:val="left"/>
       <w:pPr>
-        <w:ind w:left="6480" w:hanging="360"/>
+        <w:ind w:left="6840" w:hanging="360"/>
       </w:pPr>
       <w:rPr>
         <w:rFonts w:ascii="Wingdings" w:hAnsi="Wingdings" w:hint="default"/>
@@ -49454,158 +51526,9 @@
     </w:lvl>
   </w:abstractNum>
   <w:abstractNum w:abstractNumId="30" w15:restartNumberingAfterBreak="0">
-    <w:nsid w:val="4B605E1D"/>
-    <w:multiLevelType w:val="multilevel"/>
-    <w:tmpl w:val="7046A172"/>
-    <w:lvl w:ilvl="0">
-      <w:start w:val="1"/>
-      <w:numFmt w:val="bullet"/>
-      <w:lvlText w:val=""/>
-      <w:lvlJc w:val="left"/>
-      <w:pPr>
-        <w:tabs>
-          <w:tab w:val="num" w:pos="720"/>
-        </w:tabs>
-        <w:ind w:left="720" w:hanging="360"/>
-      </w:pPr>
-      <w:rPr>
-        <w:rFonts w:ascii="Symbol" w:hAnsi="Symbol" w:hint="default"/>
-        <w:sz w:val="20"/>
-      </w:rPr>
-    </w:lvl>
-    <w:lvl w:ilvl="1" w:tentative="1">
-      <w:start w:val="1"/>
-      <w:numFmt w:val="bullet"/>
-      <w:lvlText w:val="o"/>
-      <w:lvlJc w:val="left"/>
-      <w:pPr>
-        <w:tabs>
-          <w:tab w:val="num" w:pos="1440"/>
-        </w:tabs>
-        <w:ind w:left="1440" w:hanging="360"/>
-      </w:pPr>
-      <w:rPr>
-        <w:rFonts w:ascii="Courier New" w:hAnsi="Courier New" w:hint="default"/>
-        <w:sz w:val="20"/>
-      </w:rPr>
-    </w:lvl>
-    <w:lvl w:ilvl="2" w:tentative="1">
-      <w:start w:val="1"/>
-      <w:numFmt w:val="bullet"/>
-      <w:lvlText w:val=""/>
-      <w:lvlJc w:val="left"/>
-      <w:pPr>
-        <w:tabs>
-          <w:tab w:val="num" w:pos="2160"/>
-        </w:tabs>
-        <w:ind w:left="2160" w:hanging="360"/>
-      </w:pPr>
-      <w:rPr>
-        <w:rFonts w:ascii="Wingdings" w:hAnsi="Wingdings" w:hint="default"/>
-        <w:sz w:val="20"/>
-      </w:rPr>
-    </w:lvl>
-    <w:lvl w:ilvl="3" w:tentative="1">
-      <w:start w:val="1"/>
-      <w:numFmt w:val="bullet"/>
-      <w:lvlText w:val=""/>
-      <w:lvlJc w:val="left"/>
-      <w:pPr>
-        <w:tabs>
-          <w:tab w:val="num" w:pos="2880"/>
-        </w:tabs>
-        <w:ind w:left="2880" w:hanging="360"/>
-      </w:pPr>
-      <w:rPr>
-        <w:rFonts w:ascii="Wingdings" w:hAnsi="Wingdings" w:hint="default"/>
-        <w:sz w:val="20"/>
-      </w:rPr>
-    </w:lvl>
-    <w:lvl w:ilvl="4" w:tentative="1">
-      <w:start w:val="1"/>
-      <w:numFmt w:val="bullet"/>
-      <w:lvlText w:val=""/>
-      <w:lvlJc w:val="left"/>
-      <w:pPr>
-        <w:tabs>
-          <w:tab w:val="num" w:pos="3600"/>
-        </w:tabs>
-        <w:ind w:left="3600" w:hanging="360"/>
-      </w:pPr>
-      <w:rPr>
-        <w:rFonts w:ascii="Wingdings" w:hAnsi="Wingdings" w:hint="default"/>
-        <w:sz w:val="20"/>
-      </w:rPr>
-    </w:lvl>
-    <w:lvl w:ilvl="5" w:tentative="1">
-      <w:start w:val="1"/>
-      <w:numFmt w:val="bullet"/>
-      <w:lvlText w:val=""/>
-      <w:lvlJc w:val="left"/>
-      <w:pPr>
-        <w:tabs>
-          <w:tab w:val="num" w:pos="4320"/>
-        </w:tabs>
-        <w:ind w:left="4320" w:hanging="360"/>
-      </w:pPr>
-      <w:rPr>
-        <w:rFonts w:ascii="Wingdings" w:hAnsi="Wingdings" w:hint="default"/>
-        <w:sz w:val="20"/>
-      </w:rPr>
-    </w:lvl>
-    <w:lvl w:ilvl="6" w:tentative="1">
-      <w:start w:val="1"/>
-      <w:numFmt w:val="bullet"/>
-      <w:lvlText w:val=""/>
-      <w:lvlJc w:val="left"/>
-      <w:pPr>
-        <w:tabs>
-          <w:tab w:val="num" w:pos="5040"/>
-        </w:tabs>
-        <w:ind w:left="5040" w:hanging="360"/>
-      </w:pPr>
-      <w:rPr>
-        <w:rFonts w:ascii="Wingdings" w:hAnsi="Wingdings" w:hint="default"/>
-        <w:sz w:val="20"/>
-      </w:rPr>
-    </w:lvl>
-    <w:lvl w:ilvl="7" w:tentative="1">
-      <w:start w:val="1"/>
-      <w:numFmt w:val="bullet"/>
-      <w:lvlText w:val=""/>
-      <w:lvlJc w:val="left"/>
-      <w:pPr>
-        <w:tabs>
-          <w:tab w:val="num" w:pos="5760"/>
-        </w:tabs>
-        <w:ind w:left="5760" w:hanging="360"/>
-      </w:pPr>
-      <w:rPr>
-        <w:rFonts w:ascii="Wingdings" w:hAnsi="Wingdings" w:hint="default"/>
-        <w:sz w:val="20"/>
-      </w:rPr>
-    </w:lvl>
-    <w:lvl w:ilvl="8" w:tentative="1">
-      <w:start w:val="1"/>
-      <w:numFmt w:val="bullet"/>
-      <w:lvlText w:val=""/>
-      <w:lvlJc w:val="left"/>
-      <w:pPr>
-        <w:tabs>
-          <w:tab w:val="num" w:pos="6480"/>
-        </w:tabs>
-        <w:ind w:left="6480" w:hanging="360"/>
-      </w:pPr>
-      <w:rPr>
-        <w:rFonts w:ascii="Wingdings" w:hAnsi="Wingdings" w:hint="default"/>
-        <w:sz w:val="20"/>
-      </w:rPr>
-    </w:lvl>
-  </w:abstractNum>
-  <w:abstractNum w:abstractNumId="31" w15:restartNumberingAfterBreak="0">
-    <w:nsid w:val="516B3F1D"/>
+    <w:nsid w:val="49A32D91"/>
     <w:multiLevelType w:val="hybridMultilevel"/>
-    <w:tmpl w:val="2C8AF14A"/>
+    <w:tmpl w:val="9F586C38"/>
     <w:lvl w:ilvl="0" w:tplc="9768F0A0">
       <w:start w:val="1"/>
       <w:numFmt w:val="bullet"/>
@@ -49717,10 +51640,159 @@
       </w:rPr>
     </w:lvl>
   </w:abstractNum>
+  <w:abstractNum w:abstractNumId="31" w15:restartNumberingAfterBreak="0">
+    <w:nsid w:val="4B605E1D"/>
+    <w:multiLevelType w:val="multilevel"/>
+    <w:tmpl w:val="7046A172"/>
+    <w:lvl w:ilvl="0">
+      <w:start w:val="1"/>
+      <w:numFmt w:val="bullet"/>
+      <w:lvlText w:val=""/>
+      <w:lvlJc w:val="left"/>
+      <w:pPr>
+        <w:tabs>
+          <w:tab w:val="num" w:pos="720"/>
+        </w:tabs>
+        <w:ind w:left="720" w:hanging="360"/>
+      </w:pPr>
+      <w:rPr>
+        <w:rFonts w:ascii="Symbol" w:hAnsi="Symbol" w:hint="default"/>
+        <w:sz w:val="20"/>
+      </w:rPr>
+    </w:lvl>
+    <w:lvl w:ilvl="1" w:tentative="1">
+      <w:start w:val="1"/>
+      <w:numFmt w:val="bullet"/>
+      <w:lvlText w:val="o"/>
+      <w:lvlJc w:val="left"/>
+      <w:pPr>
+        <w:tabs>
+          <w:tab w:val="num" w:pos="1440"/>
+        </w:tabs>
+        <w:ind w:left="1440" w:hanging="360"/>
+      </w:pPr>
+      <w:rPr>
+        <w:rFonts w:ascii="Courier New" w:hAnsi="Courier New" w:hint="default"/>
+        <w:sz w:val="20"/>
+      </w:rPr>
+    </w:lvl>
+    <w:lvl w:ilvl="2" w:tentative="1">
+      <w:start w:val="1"/>
+      <w:numFmt w:val="bullet"/>
+      <w:lvlText w:val=""/>
+      <w:lvlJc w:val="left"/>
+      <w:pPr>
+        <w:tabs>
+          <w:tab w:val="num" w:pos="2160"/>
+        </w:tabs>
+        <w:ind w:left="2160" w:hanging="360"/>
+      </w:pPr>
+      <w:rPr>
+        <w:rFonts w:ascii="Wingdings" w:hAnsi="Wingdings" w:hint="default"/>
+        <w:sz w:val="20"/>
+      </w:rPr>
+    </w:lvl>
+    <w:lvl w:ilvl="3" w:tentative="1">
+      <w:start w:val="1"/>
+      <w:numFmt w:val="bullet"/>
+      <w:lvlText w:val=""/>
+      <w:lvlJc w:val="left"/>
+      <w:pPr>
+        <w:tabs>
+          <w:tab w:val="num" w:pos="2880"/>
+        </w:tabs>
+        <w:ind w:left="2880" w:hanging="360"/>
+      </w:pPr>
+      <w:rPr>
+        <w:rFonts w:ascii="Wingdings" w:hAnsi="Wingdings" w:hint="default"/>
+        <w:sz w:val="20"/>
+      </w:rPr>
+    </w:lvl>
+    <w:lvl w:ilvl="4" w:tentative="1">
+      <w:start w:val="1"/>
+      <w:numFmt w:val="bullet"/>
+      <w:lvlText w:val=""/>
+      <w:lvlJc w:val="left"/>
+      <w:pPr>
+        <w:tabs>
+          <w:tab w:val="num" w:pos="3600"/>
+        </w:tabs>
+        <w:ind w:left="3600" w:hanging="360"/>
+      </w:pPr>
+      <w:rPr>
+        <w:rFonts w:ascii="Wingdings" w:hAnsi="Wingdings" w:hint="default"/>
+        <w:sz w:val="20"/>
+      </w:rPr>
+    </w:lvl>
+    <w:lvl w:ilvl="5" w:tentative="1">
+      <w:start w:val="1"/>
+      <w:numFmt w:val="bullet"/>
+      <w:lvlText w:val=""/>
+      <w:lvlJc w:val="left"/>
+      <w:pPr>
+        <w:tabs>
+          <w:tab w:val="num" w:pos="4320"/>
+        </w:tabs>
+        <w:ind w:left="4320" w:hanging="360"/>
+      </w:pPr>
+      <w:rPr>
+        <w:rFonts w:ascii="Wingdings" w:hAnsi="Wingdings" w:hint="default"/>
+        <w:sz w:val="20"/>
+      </w:rPr>
+    </w:lvl>
+    <w:lvl w:ilvl="6" w:tentative="1">
+      <w:start w:val="1"/>
+      <w:numFmt w:val="bullet"/>
+      <w:lvlText w:val=""/>
+      <w:lvlJc w:val="left"/>
+      <w:pPr>
+        <w:tabs>
+          <w:tab w:val="num" w:pos="5040"/>
+        </w:tabs>
+        <w:ind w:left="5040" w:hanging="360"/>
+      </w:pPr>
+      <w:rPr>
+        <w:rFonts w:ascii="Wingdings" w:hAnsi="Wingdings" w:hint="default"/>
+        <w:sz w:val="20"/>
+      </w:rPr>
+    </w:lvl>
+    <w:lvl w:ilvl="7" w:tentative="1">
+      <w:start w:val="1"/>
+      <w:numFmt w:val="bullet"/>
+      <w:lvlText w:val=""/>
+      <w:lvlJc w:val="left"/>
+      <w:pPr>
+        <w:tabs>
+          <w:tab w:val="num" w:pos="5760"/>
+        </w:tabs>
+        <w:ind w:left="5760" w:hanging="360"/>
+      </w:pPr>
+      <w:rPr>
+        <w:rFonts w:ascii="Wingdings" w:hAnsi="Wingdings" w:hint="default"/>
+        <w:sz w:val="20"/>
+      </w:rPr>
+    </w:lvl>
+    <w:lvl w:ilvl="8" w:tentative="1">
+      <w:start w:val="1"/>
+      <w:numFmt w:val="bullet"/>
+      <w:lvlText w:val=""/>
+      <w:lvlJc w:val="left"/>
+      <w:pPr>
+        <w:tabs>
+          <w:tab w:val="num" w:pos="6480"/>
+        </w:tabs>
+        <w:ind w:left="6480" w:hanging="360"/>
+      </w:pPr>
+      <w:rPr>
+        <w:rFonts w:ascii="Wingdings" w:hAnsi="Wingdings" w:hint="default"/>
+        <w:sz w:val="20"/>
+      </w:rPr>
+    </w:lvl>
+  </w:abstractNum>
   <w:abstractNum w:abstractNumId="32" w15:restartNumberingAfterBreak="0">
-    <w:nsid w:val="535079E5"/>
+    <w:nsid w:val="516B3F1D"/>
     <w:multiLevelType w:val="hybridMultilevel"/>
-    <w:tmpl w:val="2D22C648"/>
+    <w:tmpl w:val="2C8AF14A"/>
     <w:lvl w:ilvl="0" w:tplc="9768F0A0">
       <w:start w:val="1"/>
       <w:numFmt w:val="bullet"/>
@@ -49833,122 +51905,9 @@
     </w:lvl>
   </w:abstractNum>
   <w:abstractNum w:abstractNumId="33" w15:restartNumberingAfterBreak="0">
-    <w:nsid w:val="59A6768C"/>
+    <w:nsid w:val="535079E5"/>
     <w:multiLevelType w:val="hybridMultilevel"/>
-    <w:tmpl w:val="46906C38"/>
-    <w:lvl w:ilvl="0" w:tplc="40090001">
-      <w:start w:val="1"/>
-      <w:numFmt w:val="bullet"/>
-      <w:lvlText w:val=""/>
-      <w:lvlJc w:val="left"/>
-      <w:pPr>
-        <w:ind w:left="720" w:hanging="360"/>
-      </w:pPr>
-      <w:rPr>
-        <w:rFonts w:ascii="Symbol" w:hAnsi="Symbol" w:hint="default"/>
-      </w:rPr>
-    </w:lvl>
-    <w:lvl w:ilvl="1" w:tplc="40090003" w:tentative="1">
-      <w:start w:val="1"/>
-      <w:numFmt w:val="bullet"/>
-      <w:lvlText w:val="o"/>
-      <w:lvlJc w:val="left"/>
-      <w:pPr>
-        <w:ind w:left="1440" w:hanging="360"/>
-      </w:pPr>
-      <w:rPr>
-        <w:rFonts w:ascii="Courier New" w:hAnsi="Courier New" w:cs="Courier New" w:hint="default"/>
-      </w:rPr>
-    </w:lvl>
-    <w:lvl w:ilvl="2" w:tplc="40090005" w:tentative="1">
-      <w:start w:val="1"/>
-      <w:numFmt w:val="bullet"/>
-      <w:lvlText w:val=""/>
-      <w:lvlJc w:val="left"/>
-      <w:pPr>
-        <w:ind w:left="2160" w:hanging="360"/>
-      </w:pPr>
-      <w:rPr>
-        <w:rFonts w:ascii="Wingdings" w:hAnsi="Wingdings" w:hint="default"/>
-      </w:rPr>
-    </w:lvl>
-    <w:lvl w:ilvl="3" w:tplc="40090001" w:tentative="1">
-      <w:start w:val="1"/>
-      <w:numFmt w:val="bullet"/>
-      <w:lvlText w:val=""/>
-      <w:lvlJc w:val="left"/>
-      <w:pPr>
-        <w:ind w:left="2880" w:hanging="360"/>
-      </w:pPr>
-      <w:rPr>
-        <w:rFonts w:ascii="Symbol" w:hAnsi="Symbol" w:hint="default"/>
-      </w:rPr>
-    </w:lvl>
-    <w:lvl w:ilvl="4" w:tplc="40090003" w:tentative="1">
-      <w:start w:val="1"/>
-      <w:numFmt w:val="bullet"/>
-      <w:lvlText w:val="o"/>
-      <w:lvlJc w:val="left"/>
-      <w:pPr>
-        <w:ind w:left="3600" w:hanging="360"/>
-      </w:pPr>
-      <w:rPr>
-        <w:rFonts w:ascii="Courier New" w:hAnsi="Courier New" w:cs="Courier New" w:hint="default"/>
-      </w:rPr>
-    </w:lvl>
-    <w:lvl w:ilvl="5" w:tplc="40090005" w:tentative="1">
-      <w:start w:val="1"/>
-      <w:numFmt w:val="bullet"/>
-      <w:lvlText w:val=""/>
-      <w:lvlJc w:val="left"/>
-      <w:pPr>
-        <w:ind w:left="4320" w:hanging="360"/>
-      </w:pPr>
-      <w:rPr>
-        <w:rFonts w:ascii="Wingdings" w:hAnsi="Wingdings" w:hint="default"/>
-      </w:rPr>
-    </w:lvl>
-    <w:lvl w:ilvl="6" w:tplc="40090001" w:tentative="1">
-      <w:start w:val="1"/>
-      <w:numFmt w:val="bullet"/>
-      <w:lvlText w:val=""/>
-      <w:lvlJc w:val="left"/>
-      <w:pPr>
-        <w:ind w:left="5040" w:hanging="360"/>
-      </w:pPr>
-      <w:rPr>
-        <w:rFonts w:ascii="Symbol" w:hAnsi="Symbol" w:hint="default"/>
-      </w:rPr>
-    </w:lvl>
-    <w:lvl w:ilvl="7" w:tplc="40090003" w:tentative="1">
-      <w:start w:val="1"/>
-      <w:numFmt w:val="bullet"/>
-      <w:lvlText w:val="o"/>
-      <w:lvlJc w:val="left"/>
-      <w:pPr>
-        <w:ind w:left="5760" w:hanging="360"/>
-      </w:pPr>
-      <w:rPr>
-        <w:rFonts w:ascii="Courier New" w:hAnsi="Courier New" w:cs="Courier New" w:hint="default"/>
-      </w:rPr>
-    </w:lvl>
-    <w:lvl w:ilvl="8" w:tplc="40090005" w:tentative="1">
-      <w:start w:val="1"/>
-      <w:numFmt w:val="bullet"/>
-      <w:lvlText w:val=""/>
-      <w:lvlJc w:val="left"/>
-      <w:pPr>
-        <w:ind w:left="6480" w:hanging="360"/>
-      </w:pPr>
-      <w:rPr>
-        <w:rFonts w:ascii="Wingdings" w:hAnsi="Wingdings" w:hint="default"/>
-      </w:rPr>
-    </w:lvl>
-  </w:abstractNum>
-  <w:abstractNum w:abstractNumId="34" w15:restartNumberingAfterBreak="0">
-    <w:nsid w:val="5BBA3EBE"/>
-    <w:multiLevelType w:val="hybridMultilevel"/>
-    <w:tmpl w:val="2F2C1290"/>
+    <w:tmpl w:val="2D22C648"/>
     <w:lvl w:ilvl="0" w:tplc="9768F0A0">
       <w:start w:val="1"/>
       <w:numFmt w:val="bullet"/>
@@ -50060,10 +52019,123 @@
       </w:rPr>
     </w:lvl>
   </w:abstractNum>
+  <w:abstractNum w:abstractNumId="34" w15:restartNumberingAfterBreak="0">
+    <w:nsid w:val="59A6768C"/>
+    <w:multiLevelType w:val="hybridMultilevel"/>
+    <w:tmpl w:val="46906C38"/>
+    <w:lvl w:ilvl="0" w:tplc="40090001">
+      <w:start w:val="1"/>
+      <w:numFmt w:val="bullet"/>
+      <w:lvlText w:val=""/>
+      <w:lvlJc w:val="left"/>
+      <w:pPr>
+        <w:ind w:left="720" w:hanging="360"/>
+      </w:pPr>
+      <w:rPr>
+        <w:rFonts w:ascii="Symbol" w:hAnsi="Symbol" w:hint="default"/>
+      </w:rPr>
+    </w:lvl>
+    <w:lvl w:ilvl="1" w:tplc="40090003" w:tentative="1">
+      <w:start w:val="1"/>
+      <w:numFmt w:val="bullet"/>
+      <w:lvlText w:val="o"/>
+      <w:lvlJc w:val="left"/>
+      <w:pPr>
+        <w:ind w:left="1440" w:hanging="360"/>
+      </w:pPr>
+      <w:rPr>
+        <w:rFonts w:ascii="Courier New" w:hAnsi="Courier New" w:cs="Courier New" w:hint="default"/>
+      </w:rPr>
+    </w:lvl>
+    <w:lvl w:ilvl="2" w:tplc="40090005" w:tentative="1">
+      <w:start w:val="1"/>
+      <w:numFmt w:val="bullet"/>
+      <w:lvlText w:val=""/>
+      <w:lvlJc w:val="left"/>
+      <w:pPr>
+        <w:ind w:left="2160" w:hanging="360"/>
+      </w:pPr>
+      <w:rPr>
+        <w:rFonts w:ascii="Wingdings" w:hAnsi="Wingdings" w:hint="default"/>
+      </w:rPr>
+    </w:lvl>
+    <w:lvl w:ilvl="3" w:tplc="40090001" w:tentative="1">
+      <w:start w:val="1"/>
+      <w:numFmt w:val="bullet"/>
+      <w:lvlText w:val=""/>
+      <w:lvlJc w:val="left"/>
+      <w:pPr>
+        <w:ind w:left="2880" w:hanging="360"/>
+      </w:pPr>
+      <w:rPr>
+        <w:rFonts w:ascii="Symbol" w:hAnsi="Symbol" w:hint="default"/>
+      </w:rPr>
+    </w:lvl>
+    <w:lvl w:ilvl="4" w:tplc="40090003" w:tentative="1">
+      <w:start w:val="1"/>
+      <w:numFmt w:val="bullet"/>
+      <w:lvlText w:val="o"/>
+      <w:lvlJc w:val="left"/>
+      <w:pPr>
+        <w:ind w:left="3600" w:hanging="360"/>
+      </w:pPr>
+      <w:rPr>
+        <w:rFonts w:ascii="Courier New" w:hAnsi="Courier New" w:cs="Courier New" w:hint="default"/>
+      </w:rPr>
+    </w:lvl>
+    <w:lvl w:ilvl="5" w:tplc="40090005" w:tentative="1">
+      <w:start w:val="1"/>
+      <w:numFmt w:val="bullet"/>
+      <w:lvlText w:val=""/>
+      <w:lvlJc w:val="left"/>
+      <w:pPr>
+        <w:ind w:left="4320" w:hanging="360"/>
+      </w:pPr>
+      <w:rPr>
+        <w:rFonts w:ascii="Wingdings" w:hAnsi="Wingdings" w:hint="default"/>
+      </w:rPr>
+    </w:lvl>
+    <w:lvl w:ilvl="6" w:tplc="40090001" w:tentative="1">
+      <w:start w:val="1"/>
+      <w:numFmt w:val="bullet"/>
+      <w:lvlText w:val=""/>
+      <w:lvlJc w:val="left"/>
+      <w:pPr>
+        <w:ind w:left="5040" w:hanging="360"/>
+      </w:pPr>
+      <w:rPr>
+        <w:rFonts w:ascii="Symbol" w:hAnsi="Symbol" w:hint="default"/>
+      </w:rPr>
+    </w:lvl>
+    <w:lvl w:ilvl="7" w:tplc="40090003" w:tentative="1">
+      <w:start w:val="1"/>
+      <w:numFmt w:val="bullet"/>
+      <w:lvlText w:val="o"/>
+      <w:lvlJc w:val="left"/>
+      <w:pPr>
+        <w:ind w:left="5760" w:hanging="360"/>
+      </w:pPr>
+      <w:rPr>
+        <w:rFonts w:ascii="Courier New" w:hAnsi="Courier New" w:cs="Courier New" w:hint="default"/>
+      </w:rPr>
+    </w:lvl>
+    <w:lvl w:ilvl="8" w:tplc="40090005" w:tentative="1">
+      <w:start w:val="1"/>
+      <w:numFmt w:val="bullet"/>
+      <w:lvlText w:val=""/>
+      <w:lvlJc w:val="left"/>
+      <w:pPr>
+        <w:ind w:left="6480" w:hanging="360"/>
+      </w:pPr>
+      <w:rPr>
+        <w:rFonts w:ascii="Wingdings" w:hAnsi="Wingdings" w:hint="default"/>
+      </w:rPr>
+    </w:lvl>
+  </w:abstractNum>
   <w:abstractNum w:abstractNumId="35" w15:restartNumberingAfterBreak="0">
-    <w:nsid w:val="5D23483C"/>
+    <w:nsid w:val="5BBA3EBE"/>
     <w:multiLevelType w:val="hybridMultilevel"/>
-    <w:tmpl w:val="D752F2A2"/>
+    <w:tmpl w:val="2F2C1290"/>
     <w:lvl w:ilvl="0" w:tplc="9768F0A0">
       <w:start w:val="1"/>
       <w:numFmt w:val="bullet"/>
@@ -50176,9 +52248,9 @@
     </w:lvl>
   </w:abstractNum>
   <w:abstractNum w:abstractNumId="36" w15:restartNumberingAfterBreak="0">
-    <w:nsid w:val="6625741A"/>
+    <w:nsid w:val="5D23483C"/>
     <w:multiLevelType w:val="hybridMultilevel"/>
-    <w:tmpl w:val="D53277D8"/>
+    <w:tmpl w:val="D752F2A2"/>
     <w:lvl w:ilvl="0" w:tplc="9768F0A0">
       <w:start w:val="1"/>
       <w:numFmt w:val="bullet"/>
@@ -50291,9 +52363,9 @@
     </w:lvl>
   </w:abstractNum>
   <w:abstractNum w:abstractNumId="37" w15:restartNumberingAfterBreak="0">
-    <w:nsid w:val="6CE25B83"/>
+    <w:nsid w:val="6625741A"/>
     <w:multiLevelType w:val="hybridMultilevel"/>
-    <w:tmpl w:val="E93A17AC"/>
+    <w:tmpl w:val="D53277D8"/>
     <w:lvl w:ilvl="0" w:tplc="9768F0A0">
       <w:start w:val="1"/>
       <w:numFmt w:val="bullet"/>
@@ -50406,122 +52478,9 @@
     </w:lvl>
   </w:abstractNum>
   <w:abstractNum w:abstractNumId="38" w15:restartNumberingAfterBreak="0">
-    <w:nsid w:val="6F2D64DB"/>
+    <w:nsid w:val="6CE25B83"/>
     <w:multiLevelType w:val="hybridMultilevel"/>
-    <w:tmpl w:val="F9E805F2"/>
-    <w:lvl w:ilvl="0" w:tplc="40090001">
-      <w:start w:val="1"/>
-      <w:numFmt w:val="bullet"/>
-      <w:lvlText w:val=""/>
-      <w:lvlJc w:val="left"/>
-      <w:pPr>
-        <w:ind w:left="720" w:hanging="360"/>
-      </w:pPr>
-      <w:rPr>
-        <w:rFonts w:ascii="Symbol" w:hAnsi="Symbol" w:hint="default"/>
-      </w:rPr>
-    </w:lvl>
-    <w:lvl w:ilvl="1" w:tplc="40090003" w:tentative="1">
-      <w:start w:val="1"/>
-      <w:numFmt w:val="bullet"/>
-      <w:lvlText w:val="o"/>
-      <w:lvlJc w:val="left"/>
-      <w:pPr>
-        <w:ind w:left="1440" w:hanging="360"/>
-      </w:pPr>
-      <w:rPr>
-        <w:rFonts w:ascii="Courier New" w:hAnsi="Courier New" w:cs="Courier New" w:hint="default"/>
-      </w:rPr>
-    </w:lvl>
-    <w:lvl w:ilvl="2" w:tplc="40090005" w:tentative="1">
-      <w:start w:val="1"/>
-      <w:numFmt w:val="bullet"/>
-      <w:lvlText w:val=""/>
-      <w:lvlJc w:val="left"/>
-      <w:pPr>
-        <w:ind w:left="2160" w:hanging="360"/>
-      </w:pPr>
-      <w:rPr>
-        <w:rFonts w:ascii="Wingdings" w:hAnsi="Wingdings" w:hint="default"/>
-      </w:rPr>
-    </w:lvl>
-    <w:lvl w:ilvl="3" w:tplc="40090001" w:tentative="1">
-      <w:start w:val="1"/>
-      <w:numFmt w:val="bullet"/>
-      <w:lvlText w:val=""/>
-      <w:lvlJc w:val="left"/>
-      <w:pPr>
-        <w:ind w:left="2880" w:hanging="360"/>
-      </w:pPr>
-      <w:rPr>
-        <w:rFonts w:ascii="Symbol" w:hAnsi="Symbol" w:hint="default"/>
-      </w:rPr>
-    </w:lvl>
-    <w:lvl w:ilvl="4" w:tplc="40090003" w:tentative="1">
-      <w:start w:val="1"/>
-      <w:numFmt w:val="bullet"/>
-      <w:lvlText w:val="o"/>
-      <w:lvlJc w:val="left"/>
-      <w:pPr>
-        <w:ind w:left="3600" w:hanging="360"/>
-      </w:pPr>
-      <w:rPr>
-        <w:rFonts w:ascii="Courier New" w:hAnsi="Courier New" w:cs="Courier New" w:hint="default"/>
-      </w:rPr>
-    </w:lvl>
-    <w:lvl w:ilvl="5" w:tplc="40090005" w:tentative="1">
-      <w:start w:val="1"/>
-      <w:numFmt w:val="bullet"/>
-      <w:lvlText w:val=""/>
-      <w:lvlJc w:val="left"/>
-      <w:pPr>
-        <w:ind w:left="4320" w:hanging="360"/>
-      </w:pPr>
-      <w:rPr>
-        <w:rFonts w:ascii="Wingdings" w:hAnsi="Wingdings" w:hint="default"/>
-      </w:rPr>
-    </w:lvl>
-    <w:lvl w:ilvl="6" w:tplc="40090001" w:tentative="1">
-      <w:start w:val="1"/>
-      <w:numFmt w:val="bullet"/>
-      <w:lvlText w:val=""/>
-      <w:lvlJc w:val="left"/>
-      <w:pPr>
-        <w:ind w:left="5040" w:hanging="360"/>
-      </w:pPr>
-      <w:rPr>
-        <w:rFonts w:ascii="Symbol" w:hAnsi="Symbol" w:hint="default"/>
-      </w:rPr>
-    </w:lvl>
-    <w:lvl w:ilvl="7" w:tplc="40090003" w:tentative="1">
-      <w:start w:val="1"/>
-      <w:numFmt w:val="bullet"/>
-      <w:lvlText w:val="o"/>
-      <w:lvlJc w:val="left"/>
-      <w:pPr>
-        <w:ind w:left="5760" w:hanging="360"/>
-      </w:pPr>
-      <w:rPr>
-        <w:rFonts w:ascii="Courier New" w:hAnsi="Courier New" w:cs="Courier New" w:hint="default"/>
-      </w:rPr>
-    </w:lvl>
-    <w:lvl w:ilvl="8" w:tplc="40090005" w:tentative="1">
-      <w:start w:val="1"/>
-      <w:numFmt w:val="bullet"/>
-      <w:lvlText w:val=""/>
-      <w:lvlJc w:val="left"/>
-      <w:pPr>
-        <w:ind w:left="6480" w:hanging="360"/>
-      </w:pPr>
-      <w:rPr>
-        <w:rFonts w:ascii="Wingdings" w:hAnsi="Wingdings" w:hint="default"/>
-      </w:rPr>
-    </w:lvl>
-  </w:abstractNum>
-  <w:abstractNum w:abstractNumId="39" w15:restartNumberingAfterBreak="0">
-    <w:nsid w:val="6F722858"/>
-    <w:multiLevelType w:val="hybridMultilevel"/>
-    <w:tmpl w:val="DEA89684"/>
+    <w:tmpl w:val="E93A17AC"/>
     <w:lvl w:ilvl="0" w:tplc="9768F0A0">
       <w:start w:val="1"/>
       <w:numFmt w:val="bullet"/>
@@ -50633,17 +52592,130 @@
       </w:rPr>
     </w:lvl>
   </w:abstractNum>
+  <w:abstractNum w:abstractNumId="39" w15:restartNumberingAfterBreak="0">
+    <w:nsid w:val="6F2D64DB"/>
+    <w:multiLevelType w:val="hybridMultilevel"/>
+    <w:tmpl w:val="F9E805F2"/>
+    <w:lvl w:ilvl="0" w:tplc="40090001">
+      <w:start w:val="1"/>
+      <w:numFmt w:val="bullet"/>
+      <w:lvlText w:val=""/>
+      <w:lvlJc w:val="left"/>
+      <w:pPr>
+        <w:ind w:left="720" w:hanging="360"/>
+      </w:pPr>
+      <w:rPr>
+        <w:rFonts w:ascii="Symbol" w:hAnsi="Symbol" w:hint="default"/>
+      </w:rPr>
+    </w:lvl>
+    <w:lvl w:ilvl="1" w:tplc="40090003" w:tentative="1">
+      <w:start w:val="1"/>
+      <w:numFmt w:val="bullet"/>
+      <w:lvlText w:val="o"/>
+      <w:lvlJc w:val="left"/>
+      <w:pPr>
+        <w:ind w:left="1440" w:hanging="360"/>
+      </w:pPr>
+      <w:rPr>
+        <w:rFonts w:ascii="Courier New" w:hAnsi="Courier New" w:cs="Courier New" w:hint="default"/>
+      </w:rPr>
+    </w:lvl>
+    <w:lvl w:ilvl="2" w:tplc="40090005" w:tentative="1">
+      <w:start w:val="1"/>
+      <w:numFmt w:val="bullet"/>
+      <w:lvlText w:val=""/>
+      <w:lvlJc w:val="left"/>
+      <w:pPr>
+        <w:ind w:left="2160" w:hanging="360"/>
+      </w:pPr>
+      <w:rPr>
+        <w:rFonts w:ascii="Wingdings" w:hAnsi="Wingdings" w:hint="default"/>
+      </w:rPr>
+    </w:lvl>
+    <w:lvl w:ilvl="3" w:tplc="40090001" w:tentative="1">
+      <w:start w:val="1"/>
+      <w:numFmt w:val="bullet"/>
+      <w:lvlText w:val=""/>
+      <w:lvlJc w:val="left"/>
+      <w:pPr>
+        <w:ind w:left="2880" w:hanging="360"/>
+      </w:pPr>
+      <w:rPr>
+        <w:rFonts w:ascii="Symbol" w:hAnsi="Symbol" w:hint="default"/>
+      </w:rPr>
+    </w:lvl>
+    <w:lvl w:ilvl="4" w:tplc="40090003" w:tentative="1">
+      <w:start w:val="1"/>
+      <w:numFmt w:val="bullet"/>
+      <w:lvlText w:val="o"/>
+      <w:lvlJc w:val="left"/>
+      <w:pPr>
+        <w:ind w:left="3600" w:hanging="360"/>
+      </w:pPr>
+      <w:rPr>
+        <w:rFonts w:ascii="Courier New" w:hAnsi="Courier New" w:cs="Courier New" w:hint="default"/>
+      </w:rPr>
+    </w:lvl>
+    <w:lvl w:ilvl="5" w:tplc="40090005" w:tentative="1">
+      <w:start w:val="1"/>
+      <w:numFmt w:val="bullet"/>
+      <w:lvlText w:val=""/>
+      <w:lvlJc w:val="left"/>
+      <w:pPr>
+        <w:ind w:left="4320" w:hanging="360"/>
+      </w:pPr>
+      <w:rPr>
+        <w:rFonts w:ascii="Wingdings" w:hAnsi="Wingdings" w:hint="default"/>
+      </w:rPr>
+    </w:lvl>
+    <w:lvl w:ilvl="6" w:tplc="40090001" w:tentative="1">
+      <w:start w:val="1"/>
+      <w:numFmt w:val="bullet"/>
+      <w:lvlText w:val=""/>
+      <w:lvlJc w:val="left"/>
+      <w:pPr>
+        <w:ind w:left="5040" w:hanging="360"/>
+      </w:pPr>
+      <w:rPr>
+        <w:rFonts w:ascii="Symbol" w:hAnsi="Symbol" w:hint="default"/>
+      </w:rPr>
+    </w:lvl>
+    <w:lvl w:ilvl="7" w:tplc="40090003" w:tentative="1">
+      <w:start w:val="1"/>
+      <w:numFmt w:val="bullet"/>
+      <w:lvlText w:val="o"/>
+      <w:lvlJc w:val="left"/>
+      <w:pPr>
+        <w:ind w:left="5760" w:hanging="360"/>
+      </w:pPr>
+      <w:rPr>
+        <w:rFonts w:ascii="Courier New" w:hAnsi="Courier New" w:cs="Courier New" w:hint="default"/>
+      </w:rPr>
+    </w:lvl>
+    <w:lvl w:ilvl="8" w:tplc="40090005" w:tentative="1">
+      <w:start w:val="1"/>
+      <w:numFmt w:val="bullet"/>
+      <w:lvlText w:val=""/>
+      <w:lvlJc w:val="left"/>
+      <w:pPr>
+        <w:ind w:left="6480" w:hanging="360"/>
+      </w:pPr>
+      <w:rPr>
+        <w:rFonts w:ascii="Wingdings" w:hAnsi="Wingdings" w:hint="default"/>
+      </w:rPr>
+    </w:lvl>
+  </w:abstractNum>
   <w:abstractNum w:abstractNumId="40" w15:restartNumberingAfterBreak="0">
-    <w:nsid w:val="6FF026B1"/>
+    <w:nsid w:val="6F722858"/>
     <w:multiLevelType w:val="hybridMultilevel"/>
-    <w:tmpl w:val="3272AB5A"/>
+    <w:tmpl w:val="DEA89684"/>
     <w:lvl w:ilvl="0" w:tplc="9768F0A0">
       <w:start w:val="1"/>
       <w:numFmt w:val="bullet"/>
       <w:lvlText w:val=""/>
       <w:lvlJc w:val="left"/>
       <w:pPr>
-        <w:ind w:left="1080" w:hanging="360"/>
+        <w:ind w:left="720" w:hanging="360"/>
       </w:pPr>
       <w:rPr>
         <w:rFonts w:ascii="Wingdings" w:hAnsi="Wingdings" w:hint="default"/>
@@ -50657,7 +52729,7 @@
       <w:lvlText w:val="o"/>
       <w:lvlJc w:val="left"/>
       <w:pPr>
-        <w:ind w:left="1800" w:hanging="360"/>
+        <w:ind w:left="1440" w:hanging="360"/>
       </w:pPr>
       <w:rPr>
         <w:rFonts w:ascii="Courier New" w:hAnsi="Courier New" w:cs="Courier New" w:hint="default"/>
@@ -50669,7 +52741,7 @@
       <w:lvlText w:val=""/>
       <w:lvlJc w:val="left"/>
       <w:pPr>
-        <w:ind w:left="2520" w:hanging="360"/>
+        <w:ind w:left="2160" w:hanging="360"/>
       </w:pPr>
       <w:rPr>
         <w:rFonts w:ascii="Wingdings" w:hAnsi="Wingdings" w:hint="default"/>
@@ -50681,7 +52753,7 @@
       <w:lvlText w:val=""/>
       <w:lvlJc w:val="left"/>
       <w:pPr>
-        <w:ind w:left="3240" w:hanging="360"/>
+        <w:ind w:left="2880" w:hanging="360"/>
       </w:pPr>
       <w:rPr>
         <w:rFonts w:ascii="Symbol" w:hAnsi="Symbol" w:hint="default"/>
@@ -50693,7 +52765,7 @@
       <w:lvlText w:val="o"/>
       <w:lvlJc w:val="left"/>
       <w:pPr>
-        <w:ind w:left="3960" w:hanging="360"/>
+        <w:ind w:left="3600" w:hanging="360"/>
       </w:pPr>
       <w:rPr>
         <w:rFonts w:ascii="Courier New" w:hAnsi="Courier New" w:cs="Courier New" w:hint="default"/>
@@ -50705,7 +52777,7 @@
       <w:lvlText w:val=""/>
       <w:lvlJc w:val="left"/>
       <w:pPr>
-        <w:ind w:left="4680" w:hanging="360"/>
+        <w:ind w:left="4320" w:hanging="360"/>
       </w:pPr>
       <w:rPr>
         <w:rFonts w:ascii="Wingdings" w:hAnsi="Wingdings" w:hint="default"/>
@@ -50717,7 +52789,7 @@
       <w:lvlText w:val=""/>
       <w:lvlJc w:val="left"/>
       <w:pPr>
-        <w:ind w:left="5400" w:hanging="360"/>
+        <w:ind w:left="5040" w:hanging="360"/>
       </w:pPr>
       <w:rPr>
         <w:rFonts w:ascii="Symbol" w:hAnsi="Symbol" w:hint="default"/>
@@ -50729,7 +52801,7 @@
       <w:lvlText w:val="o"/>
       <w:lvlJc w:val="left"/>
       <w:pPr>
-        <w:ind w:left="6120" w:hanging="360"/>
+        <w:ind w:left="5760" w:hanging="360"/>
       </w:pPr>
       <w:rPr>
         <w:rFonts w:ascii="Courier New" w:hAnsi="Courier New" w:cs="Courier New" w:hint="default"/>
@@ -50741,7 +52813,7 @@
       <w:lvlText w:val=""/>
       <w:lvlJc w:val="left"/>
       <w:pPr>
-        <w:ind w:left="6840" w:hanging="360"/>
+        <w:ind w:left="6480" w:hanging="360"/>
       </w:pPr>
       <w:rPr>
         <w:rFonts w:ascii="Wingdings" w:hAnsi="Wingdings" w:hint="default"/>
@@ -50749,9 +52821,9 @@
     </w:lvl>
   </w:abstractNum>
   <w:abstractNum w:abstractNumId="41" w15:restartNumberingAfterBreak="0">
-    <w:nsid w:val="73E037C5"/>
+    <w:nsid w:val="6FF026B1"/>
     <w:multiLevelType w:val="hybridMultilevel"/>
-    <w:tmpl w:val="7D18604A"/>
+    <w:tmpl w:val="3272AB5A"/>
     <w:lvl w:ilvl="0" w:tplc="9768F0A0">
       <w:start w:val="1"/>
       <w:numFmt w:val="bullet"/>
@@ -50864,242 +52936,16 @@
     </w:lvl>
   </w:abstractNum>
   <w:abstractNum w:abstractNumId="42" w15:restartNumberingAfterBreak="0">
-    <w:nsid w:val="747C7CE5"/>
+    <w:nsid w:val="73E037C5"/>
     <w:multiLevelType w:val="hybridMultilevel"/>
-    <w:tmpl w:val="50CABD78"/>
-    <w:lvl w:ilvl="0" w:tplc="40090001">
-      <w:start w:val="1"/>
-      <w:numFmt w:val="bullet"/>
-      <w:lvlText w:val=""/>
-      <w:lvlJc w:val="left"/>
-      <w:pPr>
-        <w:ind w:left="720" w:hanging="360"/>
-      </w:pPr>
-      <w:rPr>
-        <w:rFonts w:ascii="Symbol" w:hAnsi="Symbol" w:hint="default"/>
-      </w:rPr>
-    </w:lvl>
-    <w:lvl w:ilvl="1" w:tplc="40090003" w:tentative="1">
-      <w:start w:val="1"/>
-      <w:numFmt w:val="bullet"/>
-      <w:lvlText w:val="o"/>
-      <w:lvlJc w:val="left"/>
-      <w:pPr>
-        <w:ind w:left="1440" w:hanging="360"/>
-      </w:pPr>
-      <w:rPr>
-        <w:rFonts w:ascii="Courier New" w:hAnsi="Courier New" w:cs="Courier New" w:hint="default"/>
-      </w:rPr>
-    </w:lvl>
-    <w:lvl w:ilvl="2" w:tplc="40090005" w:tentative="1">
-      <w:start w:val="1"/>
-      <w:numFmt w:val="bullet"/>
-      <w:lvlText w:val=""/>
-      <w:lvlJc w:val="left"/>
-      <w:pPr>
-        <w:ind w:left="2160" w:hanging="360"/>
-      </w:pPr>
-      <w:rPr>
-        <w:rFonts w:ascii="Wingdings" w:hAnsi="Wingdings" w:hint="default"/>
-      </w:rPr>
-    </w:lvl>
-    <w:lvl w:ilvl="3" w:tplc="40090001" w:tentative="1">
-      <w:start w:val="1"/>
-      <w:numFmt w:val="bullet"/>
-      <w:lvlText w:val=""/>
-      <w:lvlJc w:val="left"/>
-      <w:pPr>
-        <w:ind w:left="2880" w:hanging="360"/>
-      </w:pPr>
-      <w:rPr>
-        <w:rFonts w:ascii="Symbol" w:hAnsi="Symbol" w:hint="default"/>
-      </w:rPr>
-    </w:lvl>
-    <w:lvl w:ilvl="4" w:tplc="40090003" w:tentative="1">
-      <w:start w:val="1"/>
-      <w:numFmt w:val="bullet"/>
-      <w:lvlText w:val="o"/>
-      <w:lvlJc w:val="left"/>
-      <w:pPr>
-        <w:ind w:left="3600" w:hanging="360"/>
-      </w:pPr>
-      <w:rPr>
-        <w:rFonts w:ascii="Courier New" w:hAnsi="Courier New" w:cs="Courier New" w:hint="default"/>
-      </w:rPr>
-    </w:lvl>
-    <w:lvl w:ilvl="5" w:tplc="40090005" w:tentative="1">
-      <w:start w:val="1"/>
-      <w:numFmt w:val="bullet"/>
-      <w:lvlText w:val=""/>
-      <w:lvlJc w:val="left"/>
-      <w:pPr>
-        <w:ind w:left="4320" w:hanging="360"/>
-      </w:pPr>
-      <w:rPr>
-        <w:rFonts w:ascii="Wingdings" w:hAnsi="Wingdings" w:hint="default"/>
-      </w:rPr>
-    </w:lvl>
-    <w:lvl w:ilvl="6" w:tplc="40090001" w:tentative="1">
-      <w:start w:val="1"/>
-      <w:numFmt w:val="bullet"/>
-      <w:lvlText w:val=""/>
-      <w:lvlJc w:val="left"/>
-      <w:pPr>
-        <w:ind w:left="5040" w:hanging="360"/>
-      </w:pPr>
-      <w:rPr>
-        <w:rFonts w:ascii="Symbol" w:hAnsi="Symbol" w:hint="default"/>
-      </w:rPr>
-    </w:lvl>
-    <w:lvl w:ilvl="7" w:tplc="40090003" w:tentative="1">
-      <w:start w:val="1"/>
-      <w:numFmt w:val="bullet"/>
-      <w:lvlText w:val="o"/>
-      <w:lvlJc w:val="left"/>
-      <w:pPr>
-        <w:ind w:left="5760" w:hanging="360"/>
-      </w:pPr>
-      <w:rPr>
-        <w:rFonts w:ascii="Courier New" w:hAnsi="Courier New" w:cs="Courier New" w:hint="default"/>
-      </w:rPr>
-    </w:lvl>
-    <w:lvl w:ilvl="8" w:tplc="40090005" w:tentative="1">
-      <w:start w:val="1"/>
-      <w:numFmt w:val="bullet"/>
-      <w:lvlText w:val=""/>
-      <w:lvlJc w:val="left"/>
-      <w:pPr>
-        <w:ind w:left="6480" w:hanging="360"/>
-      </w:pPr>
-      <w:rPr>
-        <w:rFonts w:ascii="Wingdings" w:hAnsi="Wingdings" w:hint="default"/>
-      </w:rPr>
-    </w:lvl>
-  </w:abstractNum>
-  <w:abstractNum w:abstractNumId="43" w15:restartNumberingAfterBreak="0">
-    <w:nsid w:val="7895381B"/>
-    <w:multiLevelType w:val="hybridMultilevel"/>
-    <w:tmpl w:val="3B0CC914"/>
-    <w:lvl w:ilvl="0" w:tplc="40090001">
-      <w:start w:val="1"/>
-      <w:numFmt w:val="bullet"/>
-      <w:lvlText w:val=""/>
-      <w:lvlJc w:val="left"/>
-      <w:pPr>
-        <w:ind w:left="720" w:hanging="360"/>
-      </w:pPr>
-      <w:rPr>
-        <w:rFonts w:ascii="Symbol" w:hAnsi="Symbol" w:hint="default"/>
-      </w:rPr>
-    </w:lvl>
-    <w:lvl w:ilvl="1" w:tplc="40090003" w:tentative="1">
-      <w:start w:val="1"/>
-      <w:numFmt w:val="bullet"/>
-      <w:lvlText w:val="o"/>
-      <w:lvlJc w:val="left"/>
-      <w:pPr>
-        <w:ind w:left="1440" w:hanging="360"/>
-      </w:pPr>
-      <w:rPr>
-        <w:rFonts w:ascii="Courier New" w:hAnsi="Courier New" w:cs="Courier New" w:hint="default"/>
-      </w:rPr>
-    </w:lvl>
-    <w:lvl w:ilvl="2" w:tplc="40090005" w:tentative="1">
-      <w:start w:val="1"/>
-      <w:numFmt w:val="bullet"/>
-      <w:lvlText w:val=""/>
-      <w:lvlJc w:val="left"/>
-      <w:pPr>
-        <w:ind w:left="2160" w:hanging="360"/>
-      </w:pPr>
-      <w:rPr>
-        <w:rFonts w:ascii="Wingdings" w:hAnsi="Wingdings" w:hint="default"/>
-      </w:rPr>
-    </w:lvl>
-    <w:lvl w:ilvl="3" w:tplc="40090001" w:tentative="1">
-      <w:start w:val="1"/>
-      <w:numFmt w:val="bullet"/>
-      <w:lvlText w:val=""/>
-      <w:lvlJc w:val="left"/>
-      <w:pPr>
-        <w:ind w:left="2880" w:hanging="360"/>
-      </w:pPr>
-      <w:rPr>
-        <w:rFonts w:ascii="Symbol" w:hAnsi="Symbol" w:hint="default"/>
-      </w:rPr>
-    </w:lvl>
-    <w:lvl w:ilvl="4" w:tplc="40090003" w:tentative="1">
-      <w:start w:val="1"/>
-      <w:numFmt w:val="bullet"/>
-      <w:lvlText w:val="o"/>
-      <w:lvlJc w:val="left"/>
-      <w:pPr>
-        <w:ind w:left="3600" w:hanging="360"/>
-      </w:pPr>
-      <w:rPr>
-        <w:rFonts w:ascii="Courier New" w:hAnsi="Courier New" w:cs="Courier New" w:hint="default"/>
-      </w:rPr>
-    </w:lvl>
-    <w:lvl w:ilvl="5" w:tplc="40090005" w:tentative="1">
-      <w:start w:val="1"/>
-      <w:numFmt w:val="bullet"/>
-      <w:lvlText w:val=""/>
-      <w:lvlJc w:val="left"/>
-      <w:pPr>
-        <w:ind w:left="4320" w:hanging="360"/>
-      </w:pPr>
-      <w:rPr>
-        <w:rFonts w:ascii="Wingdings" w:hAnsi="Wingdings" w:hint="default"/>
-      </w:rPr>
-    </w:lvl>
-    <w:lvl w:ilvl="6" w:tplc="40090001" w:tentative="1">
-      <w:start w:val="1"/>
-      <w:numFmt w:val="bullet"/>
-      <w:lvlText w:val=""/>
-      <w:lvlJc w:val="left"/>
-      <w:pPr>
-        <w:ind w:left="5040" w:hanging="360"/>
-      </w:pPr>
-      <w:rPr>
-        <w:rFonts w:ascii="Symbol" w:hAnsi="Symbol" w:hint="default"/>
-      </w:rPr>
-    </w:lvl>
-    <w:lvl w:ilvl="7" w:tplc="40090003" w:tentative="1">
-      <w:start w:val="1"/>
-      <w:numFmt w:val="bullet"/>
-      <w:lvlText w:val="o"/>
-      <w:lvlJc w:val="left"/>
-      <w:pPr>
-        <w:ind w:left="5760" w:hanging="360"/>
-      </w:pPr>
-      <w:rPr>
-        <w:rFonts w:ascii="Courier New" w:hAnsi="Courier New" w:cs="Courier New" w:hint="default"/>
-      </w:rPr>
-    </w:lvl>
-    <w:lvl w:ilvl="8" w:tplc="40090005" w:tentative="1">
-      <w:start w:val="1"/>
-      <w:numFmt w:val="bullet"/>
-      <w:lvlText w:val=""/>
-      <w:lvlJc w:val="left"/>
-      <w:pPr>
-        <w:ind w:left="6480" w:hanging="360"/>
-      </w:pPr>
-      <w:rPr>
-        <w:rFonts w:ascii="Wingdings" w:hAnsi="Wingdings" w:hint="default"/>
-      </w:rPr>
-    </w:lvl>
-  </w:abstractNum>
-  <w:abstractNum w:abstractNumId="44" w15:restartNumberingAfterBreak="0">
-    <w:nsid w:val="7A6539D3"/>
-    <w:multiLevelType w:val="hybridMultilevel"/>
-    <w:tmpl w:val="5C9AE758"/>
+    <w:tmpl w:val="7D18604A"/>
     <w:lvl w:ilvl="0" w:tplc="9768F0A0">
       <w:start w:val="1"/>
       <w:numFmt w:val="bullet"/>
       <w:lvlText w:val=""/>
       <w:lvlJc w:val="left"/>
       <w:pPr>
-        <w:ind w:left="720" w:hanging="360"/>
+        <w:ind w:left="1080" w:hanging="360"/>
       </w:pPr>
       <w:rPr>
         <w:rFonts w:ascii="Wingdings" w:hAnsi="Wingdings" w:hint="default"/>
@@ -51113,7 +52959,7 @@
       <w:lvlText w:val="o"/>
       <w:lvlJc w:val="left"/>
       <w:pPr>
-        <w:ind w:left="1440" w:hanging="360"/>
+        <w:ind w:left="1800" w:hanging="360"/>
       </w:pPr>
       <w:rPr>
         <w:rFonts w:ascii="Courier New" w:hAnsi="Courier New" w:cs="Courier New" w:hint="default"/>
@@ -51125,7 +52971,7 @@
       <w:lvlText w:val=""/>
       <w:lvlJc w:val="left"/>
       <w:pPr>
-        <w:ind w:left="2160" w:hanging="360"/>
+        <w:ind w:left="2520" w:hanging="360"/>
       </w:pPr>
       <w:rPr>
         <w:rFonts w:ascii="Wingdings" w:hAnsi="Wingdings" w:hint="default"/>
@@ -51137,7 +52983,7 @@
       <w:lvlText w:val=""/>
       <w:lvlJc w:val="left"/>
       <w:pPr>
-        <w:ind w:left="2880" w:hanging="360"/>
+        <w:ind w:left="3240" w:hanging="360"/>
       </w:pPr>
       <w:rPr>
         <w:rFonts w:ascii="Symbol" w:hAnsi="Symbol" w:hint="default"/>
@@ -51149,7 +52995,7 @@
       <w:lvlText w:val="o"/>
       <w:lvlJc w:val="left"/>
       <w:pPr>
-        <w:ind w:left="3600" w:hanging="360"/>
+        <w:ind w:left="3960" w:hanging="360"/>
       </w:pPr>
       <w:rPr>
         <w:rFonts w:ascii="Courier New" w:hAnsi="Courier New" w:cs="Courier New" w:hint="default"/>
@@ -51161,7 +53007,7 @@
       <w:lvlText w:val=""/>
       <w:lvlJc w:val="left"/>
       <w:pPr>
-        <w:ind w:left="4320" w:hanging="360"/>
+        <w:ind w:left="4680" w:hanging="360"/>
       </w:pPr>
       <w:rPr>
         <w:rFonts w:ascii="Wingdings" w:hAnsi="Wingdings" w:hint="default"/>
@@ -51173,7 +53019,7 @@
       <w:lvlText w:val=""/>
       <w:lvlJc w:val="left"/>
       <w:pPr>
-        <w:ind w:left="5040" w:hanging="360"/>
+        <w:ind w:left="5400" w:hanging="360"/>
       </w:pPr>
       <w:rPr>
         <w:rFonts w:ascii="Symbol" w:hAnsi="Symbol" w:hint="default"/>
@@ -51185,7 +53031,7 @@
       <w:lvlText w:val="o"/>
       <w:lvlJc w:val="left"/>
       <w:pPr>
-        <w:ind w:left="5760" w:hanging="360"/>
+        <w:ind w:left="6120" w:hanging="360"/>
       </w:pPr>
       <w:rPr>
         <w:rFonts w:ascii="Courier New" w:hAnsi="Courier New" w:cs="Courier New" w:hint="default"/>
@@ -51197,6 +53043,232 @@
       <w:lvlText w:val=""/>
       <w:lvlJc w:val="left"/>
       <w:pPr>
+        <w:ind w:left="6840" w:hanging="360"/>
+      </w:pPr>
+      <w:rPr>
+        <w:rFonts w:ascii="Wingdings" w:hAnsi="Wingdings" w:hint="default"/>
+      </w:rPr>
+    </w:lvl>
+  </w:abstractNum>
+  <w:abstractNum w:abstractNumId="43" w15:restartNumberingAfterBreak="0">
+    <w:nsid w:val="747C7CE5"/>
+    <w:multiLevelType w:val="hybridMultilevel"/>
+    <w:tmpl w:val="50CABD78"/>
+    <w:lvl w:ilvl="0" w:tplc="40090001">
+      <w:start w:val="1"/>
+      <w:numFmt w:val="bullet"/>
+      <w:lvlText w:val=""/>
+      <w:lvlJc w:val="left"/>
+      <w:pPr>
+        <w:ind w:left="720" w:hanging="360"/>
+      </w:pPr>
+      <w:rPr>
+        <w:rFonts w:ascii="Symbol" w:hAnsi="Symbol" w:hint="default"/>
+      </w:rPr>
+    </w:lvl>
+    <w:lvl w:ilvl="1" w:tplc="40090003" w:tentative="1">
+      <w:start w:val="1"/>
+      <w:numFmt w:val="bullet"/>
+      <w:lvlText w:val="o"/>
+      <w:lvlJc w:val="left"/>
+      <w:pPr>
+        <w:ind w:left="1440" w:hanging="360"/>
+      </w:pPr>
+      <w:rPr>
+        <w:rFonts w:ascii="Courier New" w:hAnsi="Courier New" w:cs="Courier New" w:hint="default"/>
+      </w:rPr>
+    </w:lvl>
+    <w:lvl w:ilvl="2" w:tplc="40090005" w:tentative="1">
+      <w:start w:val="1"/>
+      <w:numFmt w:val="bullet"/>
+      <w:lvlText w:val=""/>
+      <w:lvlJc w:val="left"/>
+      <w:pPr>
+        <w:ind w:left="2160" w:hanging="360"/>
+      </w:pPr>
+      <w:rPr>
+        <w:rFonts w:ascii="Wingdings" w:hAnsi="Wingdings" w:hint="default"/>
+      </w:rPr>
+    </w:lvl>
+    <w:lvl w:ilvl="3" w:tplc="40090001" w:tentative="1">
+      <w:start w:val="1"/>
+      <w:numFmt w:val="bullet"/>
+      <w:lvlText w:val=""/>
+      <w:lvlJc w:val="left"/>
+      <w:pPr>
+        <w:ind w:left="2880" w:hanging="360"/>
+      </w:pPr>
+      <w:rPr>
+        <w:rFonts w:ascii="Symbol" w:hAnsi="Symbol" w:hint="default"/>
+      </w:rPr>
+    </w:lvl>
+    <w:lvl w:ilvl="4" w:tplc="40090003" w:tentative="1">
+      <w:start w:val="1"/>
+      <w:numFmt w:val="bullet"/>
+      <w:lvlText w:val="o"/>
+      <w:lvlJc w:val="left"/>
+      <w:pPr>
+        <w:ind w:left="3600" w:hanging="360"/>
+      </w:pPr>
+      <w:rPr>
+        <w:rFonts w:ascii="Courier New" w:hAnsi="Courier New" w:cs="Courier New" w:hint="default"/>
+      </w:rPr>
+    </w:lvl>
+    <w:lvl w:ilvl="5" w:tplc="40090005" w:tentative="1">
+      <w:start w:val="1"/>
+      <w:numFmt w:val="bullet"/>
+      <w:lvlText w:val=""/>
+      <w:lvlJc w:val="left"/>
+      <w:pPr>
+        <w:ind w:left="4320" w:hanging="360"/>
+      </w:pPr>
+      <w:rPr>
+        <w:rFonts w:ascii="Wingdings" w:hAnsi="Wingdings" w:hint="default"/>
+      </w:rPr>
+    </w:lvl>
+    <w:lvl w:ilvl="6" w:tplc="40090001" w:tentative="1">
+      <w:start w:val="1"/>
+      <w:numFmt w:val="bullet"/>
+      <w:lvlText w:val=""/>
+      <w:lvlJc w:val="left"/>
+      <w:pPr>
+        <w:ind w:left="5040" w:hanging="360"/>
+      </w:pPr>
+      <w:rPr>
+        <w:rFonts w:ascii="Symbol" w:hAnsi="Symbol" w:hint="default"/>
+      </w:rPr>
+    </w:lvl>
+    <w:lvl w:ilvl="7" w:tplc="40090003" w:tentative="1">
+      <w:start w:val="1"/>
+      <w:numFmt w:val="bullet"/>
+      <w:lvlText w:val="o"/>
+      <w:lvlJc w:val="left"/>
+      <w:pPr>
+        <w:ind w:left="5760" w:hanging="360"/>
+      </w:pPr>
+      <w:rPr>
+        <w:rFonts w:ascii="Courier New" w:hAnsi="Courier New" w:cs="Courier New" w:hint="default"/>
+      </w:rPr>
+    </w:lvl>
+    <w:lvl w:ilvl="8" w:tplc="40090005" w:tentative="1">
+      <w:start w:val="1"/>
+      <w:numFmt w:val="bullet"/>
+      <w:lvlText w:val=""/>
+      <w:lvlJc w:val="left"/>
+      <w:pPr>
+        <w:ind w:left="6480" w:hanging="360"/>
+      </w:pPr>
+      <w:rPr>
+        <w:rFonts w:ascii="Wingdings" w:hAnsi="Wingdings" w:hint="default"/>
+      </w:rPr>
+    </w:lvl>
+  </w:abstractNum>
+  <w:abstractNum w:abstractNumId="44" w15:restartNumberingAfterBreak="0">
+    <w:nsid w:val="7895381B"/>
+    <w:multiLevelType w:val="hybridMultilevel"/>
+    <w:tmpl w:val="3B0CC914"/>
+    <w:lvl w:ilvl="0" w:tplc="40090001">
+      <w:start w:val="1"/>
+      <w:numFmt w:val="bullet"/>
+      <w:lvlText w:val=""/>
+      <w:lvlJc w:val="left"/>
+      <w:pPr>
+        <w:ind w:left="720" w:hanging="360"/>
+      </w:pPr>
+      <w:rPr>
+        <w:rFonts w:ascii="Symbol" w:hAnsi="Symbol" w:hint="default"/>
+      </w:rPr>
+    </w:lvl>
+    <w:lvl w:ilvl="1" w:tplc="40090003" w:tentative="1">
+      <w:start w:val="1"/>
+      <w:numFmt w:val="bullet"/>
+      <w:lvlText w:val="o"/>
+      <w:lvlJc w:val="left"/>
+      <w:pPr>
+        <w:ind w:left="1440" w:hanging="360"/>
+      </w:pPr>
+      <w:rPr>
+        <w:rFonts w:ascii="Courier New" w:hAnsi="Courier New" w:cs="Courier New" w:hint="default"/>
+      </w:rPr>
+    </w:lvl>
+    <w:lvl w:ilvl="2" w:tplc="40090005" w:tentative="1">
+      <w:start w:val="1"/>
+      <w:numFmt w:val="bullet"/>
+      <w:lvlText w:val=""/>
+      <w:lvlJc w:val="left"/>
+      <w:pPr>
+        <w:ind w:left="2160" w:hanging="360"/>
+      </w:pPr>
+      <w:rPr>
+        <w:rFonts w:ascii="Wingdings" w:hAnsi="Wingdings" w:hint="default"/>
+      </w:rPr>
+    </w:lvl>
+    <w:lvl w:ilvl="3" w:tplc="40090001" w:tentative="1">
+      <w:start w:val="1"/>
+      <w:numFmt w:val="bullet"/>
+      <w:lvlText w:val=""/>
+      <w:lvlJc w:val="left"/>
+      <w:pPr>
+        <w:ind w:left="2880" w:hanging="360"/>
+      </w:pPr>
+      <w:rPr>
+        <w:rFonts w:ascii="Symbol" w:hAnsi="Symbol" w:hint="default"/>
+      </w:rPr>
+    </w:lvl>
+    <w:lvl w:ilvl="4" w:tplc="40090003" w:tentative="1">
+      <w:start w:val="1"/>
+      <w:numFmt w:val="bullet"/>
+      <w:lvlText w:val="o"/>
+      <w:lvlJc w:val="left"/>
+      <w:pPr>
+        <w:ind w:left="3600" w:hanging="360"/>
+      </w:pPr>
+      <w:rPr>
+        <w:rFonts w:ascii="Courier New" w:hAnsi="Courier New" w:cs="Courier New" w:hint="default"/>
+      </w:rPr>
+    </w:lvl>
+    <w:lvl w:ilvl="5" w:tplc="40090005" w:tentative="1">
+      <w:start w:val="1"/>
+      <w:numFmt w:val="bullet"/>
+      <w:lvlText w:val=""/>
+      <w:lvlJc w:val="left"/>
+      <w:pPr>
+        <w:ind w:left="4320" w:hanging="360"/>
+      </w:pPr>
+      <w:rPr>
+        <w:rFonts w:ascii="Wingdings" w:hAnsi="Wingdings" w:hint="default"/>
+      </w:rPr>
+    </w:lvl>
+    <w:lvl w:ilvl="6" w:tplc="40090001" w:tentative="1">
+      <w:start w:val="1"/>
+      <w:numFmt w:val="bullet"/>
+      <w:lvlText w:val=""/>
+      <w:lvlJc w:val="left"/>
+      <w:pPr>
+        <w:ind w:left="5040" w:hanging="360"/>
+      </w:pPr>
+      <w:rPr>
+        <w:rFonts w:ascii="Symbol" w:hAnsi="Symbol" w:hint="default"/>
+      </w:rPr>
+    </w:lvl>
+    <w:lvl w:ilvl="7" w:tplc="40090003" w:tentative="1">
+      <w:start w:val="1"/>
+      <w:numFmt w:val="bullet"/>
+      <w:lvlText w:val="o"/>
+      <w:lvlJc w:val="left"/>
+      <w:pPr>
+        <w:ind w:left="5760" w:hanging="360"/>
+      </w:pPr>
+      <w:rPr>
+        <w:rFonts w:ascii="Courier New" w:hAnsi="Courier New" w:cs="Courier New" w:hint="default"/>
+      </w:rPr>
+    </w:lvl>
+    <w:lvl w:ilvl="8" w:tplc="40090005" w:tentative="1">
+      <w:start w:val="1"/>
+      <w:numFmt w:val="bullet"/>
+      <w:lvlText w:val=""/>
+      <w:lvlJc w:val="left"/>
+      <w:pPr>
         <w:ind w:left="6480" w:hanging="360"/>
       </w:pPr>
       <w:rPr>
@@ -51205,16 +53277,16 @@
     </w:lvl>
   </w:abstractNum>
   <w:abstractNum w:abstractNumId="45" w15:restartNumberingAfterBreak="0">
-    <w:nsid w:val="7AEF7F05"/>
+    <w:nsid w:val="7A6539D3"/>
     <w:multiLevelType w:val="hybridMultilevel"/>
-    <w:tmpl w:val="2DE629F2"/>
+    <w:tmpl w:val="5C9AE758"/>
     <w:lvl w:ilvl="0" w:tplc="9768F0A0">
       <w:start w:val="1"/>
       <w:numFmt w:val="bullet"/>
       <w:lvlText w:val=""/>
       <w:lvlJc w:val="left"/>
       <w:pPr>
-        <w:ind w:left="1080" w:hanging="360"/>
+        <w:ind w:left="720" w:hanging="360"/>
       </w:pPr>
       <w:rPr>
         <w:rFonts w:ascii="Wingdings" w:hAnsi="Wingdings" w:hint="default"/>
@@ -51228,7 +53300,7 @@
       <w:lvlText w:val="o"/>
       <w:lvlJc w:val="left"/>
       <w:pPr>
-        <w:ind w:left="1800" w:hanging="360"/>
+        <w:ind w:left="1440" w:hanging="360"/>
       </w:pPr>
       <w:rPr>
         <w:rFonts w:ascii="Courier New" w:hAnsi="Courier New" w:cs="Courier New" w:hint="default"/>
@@ -51240,7 +53312,7 @@
       <w:lvlText w:val=""/>
       <w:lvlJc w:val="left"/>
       <w:pPr>
-        <w:ind w:left="2520" w:hanging="360"/>
+        <w:ind w:left="2160" w:hanging="360"/>
       </w:pPr>
       <w:rPr>
         <w:rFonts w:ascii="Wingdings" w:hAnsi="Wingdings" w:hint="default"/>
@@ -51252,7 +53324,7 @@
       <w:lvlText w:val=""/>
       <w:lvlJc w:val="left"/>
       <w:pPr>
-        <w:ind w:left="3240" w:hanging="360"/>
+        <w:ind w:left="2880" w:hanging="360"/>
       </w:pPr>
       <w:rPr>
         <w:rFonts w:ascii="Symbol" w:hAnsi="Symbol" w:hint="default"/>
@@ -51264,7 +53336,7 @@
       <w:lvlText w:val="o"/>
       <w:lvlJc w:val="left"/>
       <w:pPr>
-        <w:ind w:left="3960" w:hanging="360"/>
+        <w:ind w:left="3600" w:hanging="360"/>
       </w:pPr>
       <w:rPr>
         <w:rFonts w:ascii="Courier New" w:hAnsi="Courier New" w:cs="Courier New" w:hint="default"/>
@@ -51276,7 +53348,7 @@
       <w:lvlText w:val=""/>
       <w:lvlJc w:val="left"/>
       <w:pPr>
-        <w:ind w:left="4680" w:hanging="360"/>
+        <w:ind w:left="4320" w:hanging="360"/>
       </w:pPr>
       <w:rPr>
         <w:rFonts w:ascii="Wingdings" w:hAnsi="Wingdings" w:hint="default"/>
@@ -51288,7 +53360,7 @@
       <w:lvlText w:val=""/>
       <w:lvlJc w:val="left"/>
       <w:pPr>
-        <w:ind w:left="5400" w:hanging="360"/>
+        <w:ind w:left="5040" w:hanging="360"/>
       </w:pPr>
       <w:rPr>
         <w:rFonts w:ascii="Symbol" w:hAnsi="Symbol" w:hint="default"/>
@@ -51300,7 +53372,7 @@
       <w:lvlText w:val="o"/>
       <w:lvlJc w:val="left"/>
       <w:pPr>
-        <w:ind w:left="6120" w:hanging="360"/>
+        <w:ind w:left="5760" w:hanging="360"/>
       </w:pPr>
       <w:rPr>
         <w:rFonts w:ascii="Courier New" w:hAnsi="Courier New" w:cs="Courier New" w:hint="default"/>
@@ -51312,7 +53384,7 @@
       <w:lvlText w:val=""/>
       <w:lvlJc w:val="left"/>
       <w:pPr>
-        <w:ind w:left="6840" w:hanging="360"/>
+        <w:ind w:left="6480" w:hanging="360"/>
       </w:pPr>
       <w:rPr>
         <w:rFonts w:ascii="Wingdings" w:hAnsi="Wingdings" w:hint="default"/>
@@ -51320,6 +53392,121 @@
     </w:lvl>
   </w:abstractNum>
   <w:abstractNum w:abstractNumId="46" w15:restartNumberingAfterBreak="0">
+    <w:nsid w:val="7AEF7F05"/>
+    <w:multiLevelType w:val="hybridMultilevel"/>
+    <w:tmpl w:val="2DE629F2"/>
+    <w:lvl w:ilvl="0" w:tplc="9768F0A0">
+      <w:start w:val="1"/>
+      <w:numFmt w:val="bullet"/>
+      <w:lvlText w:val=""/>
+      <w:lvlJc w:val="left"/>
+      <w:pPr>
+        <w:ind w:left="1080" w:hanging="360"/>
+      </w:pPr>
+      <w:rPr>
+        <w:rFonts w:ascii="Wingdings" w:hAnsi="Wingdings" w:hint="default"/>
+        <w:b/>
+        <w:i w:val="0"/>
+      </w:rPr>
+    </w:lvl>
+    <w:lvl w:ilvl="1" w:tplc="40090003" w:tentative="1">
+      <w:start w:val="1"/>
+      <w:numFmt w:val="bullet"/>
+      <w:lvlText w:val="o"/>
+      <w:lvlJc w:val="left"/>
+      <w:pPr>
+        <w:ind w:left="1800" w:hanging="360"/>
+      </w:pPr>
+      <w:rPr>
+        <w:rFonts w:ascii="Courier New" w:hAnsi="Courier New" w:cs="Courier New" w:hint="default"/>
+      </w:rPr>
+    </w:lvl>
+    <w:lvl w:ilvl="2" w:tplc="40090005" w:tentative="1">
+      <w:start w:val="1"/>
+      <w:numFmt w:val="bullet"/>
+      <w:lvlText w:val=""/>
+      <w:lvlJc w:val="left"/>
+      <w:pPr>
+        <w:ind w:left="2520" w:hanging="360"/>
+      </w:pPr>
+      <w:rPr>
+        <w:rFonts w:ascii="Wingdings" w:hAnsi="Wingdings" w:hint="default"/>
+      </w:rPr>
+    </w:lvl>
+    <w:lvl w:ilvl="3" w:tplc="40090001" w:tentative="1">
+      <w:start w:val="1"/>
+      <w:numFmt w:val="bullet"/>
+      <w:lvlText w:val=""/>
+      <w:lvlJc w:val="left"/>
+      <w:pPr>
+        <w:ind w:left="3240" w:hanging="360"/>
+      </w:pPr>
+      <w:rPr>
+        <w:rFonts w:ascii="Symbol" w:hAnsi="Symbol" w:hint="default"/>
+      </w:rPr>
+    </w:lvl>
+    <w:lvl w:ilvl="4" w:tplc="40090003" w:tentative="1">
+      <w:start w:val="1"/>
+      <w:numFmt w:val="bullet"/>
+      <w:lvlText w:val="o"/>
+      <w:lvlJc w:val="left"/>
+      <w:pPr>
+        <w:ind w:left="3960" w:hanging="360"/>
+      </w:pPr>
+      <w:rPr>
+        <w:rFonts w:ascii="Courier New" w:hAnsi="Courier New" w:cs="Courier New" w:hint="default"/>
+      </w:rPr>
+    </w:lvl>
+    <w:lvl w:ilvl="5" w:tplc="40090005" w:tentative="1">
+      <w:start w:val="1"/>
+      <w:numFmt w:val="bullet"/>
+      <w:lvlText w:val=""/>
+      <w:lvlJc w:val="left"/>
+      <w:pPr>
+        <w:ind w:left="4680" w:hanging="360"/>
+      </w:pPr>
+      <w:rPr>
+        <w:rFonts w:ascii="Wingdings" w:hAnsi="Wingdings" w:hint="default"/>
+      </w:rPr>
+    </w:lvl>
+    <w:lvl w:ilvl="6" w:tplc="40090001" w:tentative="1">
+      <w:start w:val="1"/>
+      <w:numFmt w:val="bullet"/>
+      <w:lvlText w:val=""/>
+      <w:lvlJc w:val="left"/>
+      <w:pPr>
+        <w:ind w:left="5400" w:hanging="360"/>
+      </w:pPr>
+      <w:rPr>
+        <w:rFonts w:ascii="Symbol" w:hAnsi="Symbol" w:hint="default"/>
+      </w:rPr>
+    </w:lvl>
+    <w:lvl w:ilvl="7" w:tplc="40090003" w:tentative="1">
+      <w:start w:val="1"/>
+      <w:numFmt w:val="bullet"/>
+      <w:lvlText w:val="o"/>
+      <w:lvlJc w:val="left"/>
+      <w:pPr>
+        <w:ind w:left="6120" w:hanging="360"/>
+      </w:pPr>
+      <w:rPr>
+        <w:rFonts w:ascii="Courier New" w:hAnsi="Courier New" w:cs="Courier New" w:hint="default"/>
+      </w:rPr>
+    </w:lvl>
+    <w:lvl w:ilvl="8" w:tplc="40090005" w:tentative="1">
+      <w:start w:val="1"/>
+      <w:numFmt w:val="bullet"/>
+      <w:lvlText w:val=""/>
+      <w:lvlJc w:val="left"/>
+      <w:pPr>
+        <w:ind w:left="6840" w:hanging="360"/>
+      </w:pPr>
+      <w:rPr>
+        <w:rFonts w:ascii="Wingdings" w:hAnsi="Wingdings" w:hint="default"/>
+      </w:rPr>
+    </w:lvl>
+  </w:abstractNum>
+  <w:abstractNum w:abstractNumId="47" w15:restartNumberingAfterBreak="0">
     <w:nsid w:val="7C2F72BF"/>
     <w:multiLevelType w:val="multilevel"/>
     <w:tmpl w:val="9A981FFA"/>
@@ -51468,7 +53655,7 @@
       </w:rPr>
     </w:lvl>
   </w:abstractNum>
-  <w:abstractNum w:abstractNumId="47" w15:restartNumberingAfterBreak="0">
+  <w:abstractNum w:abstractNumId="48" w15:restartNumberingAfterBreak="0">
     <w:nsid w:val="7E1B20A3"/>
     <w:multiLevelType w:val="hybridMultilevel"/>
     <w:tmpl w:val="736C8368"/>
@@ -51582,7 +53769,7 @@
     </w:lvl>
   </w:abstractNum>
   <w:num w:numId="1" w16cid:durableId="434178300">
-    <w:abstractNumId w:val="32"/>
+    <w:abstractNumId w:val="33"/>
   </w:num>
   <w:num w:numId="2" w16cid:durableId="886794682">
     <w:abstractNumId w:val="16"/>
@@ -51594,52 +53781,52 @@
     <w:abstractNumId w:val="6"/>
   </w:num>
   <w:num w:numId="5" w16cid:durableId="759957469">
-    <w:abstractNumId w:val="29"/>
+    <w:abstractNumId w:val="30"/>
   </w:num>
   <w:num w:numId="6" w16cid:durableId="579876237">
     <w:abstractNumId w:val="9"/>
   </w:num>
   <w:num w:numId="7" w16cid:durableId="868100861">
-    <w:abstractNumId w:val="39"/>
+    <w:abstractNumId w:val="40"/>
   </w:num>
   <w:num w:numId="8" w16cid:durableId="1271013678">
     <w:abstractNumId w:val="0"/>
   </w:num>
   <w:num w:numId="9" w16cid:durableId="578684155">
-    <w:abstractNumId w:val="31"/>
+    <w:abstractNumId w:val="32"/>
   </w:num>
   <w:num w:numId="10" w16cid:durableId="1922252014">
     <w:abstractNumId w:val="22"/>
   </w:num>
   <w:num w:numId="11" w16cid:durableId="1750883915">
-    <w:abstractNumId w:val="24"/>
+    <w:abstractNumId w:val="25"/>
   </w:num>
   <w:num w:numId="12" w16cid:durableId="152767284">
-    <w:abstractNumId w:val="30"/>
+    <w:abstractNumId w:val="31"/>
   </w:num>
   <w:num w:numId="13" w16cid:durableId="683363690">
     <w:abstractNumId w:val="7"/>
   </w:num>
   <w:num w:numId="14" w16cid:durableId="243489912">
-    <w:abstractNumId w:val="26"/>
+    <w:abstractNumId w:val="27"/>
   </w:num>
   <w:num w:numId="15" w16cid:durableId="1321272167">
     <w:abstractNumId w:val="19"/>
   </w:num>
   <w:num w:numId="16" w16cid:durableId="2094428120">
-    <w:abstractNumId w:val="44"/>
+    <w:abstractNumId w:val="45"/>
   </w:num>
   <w:num w:numId="17" w16cid:durableId="1144471207">
-    <w:abstractNumId w:val="25"/>
+    <w:abstractNumId w:val="26"/>
   </w:num>
   <w:num w:numId="18" w16cid:durableId="881482821">
     <w:abstractNumId w:val="4"/>
   </w:num>
   <w:num w:numId="19" w16cid:durableId="1275213656">
-    <w:abstractNumId w:val="37"/>
+    <w:abstractNumId w:val="38"/>
   </w:num>
   <w:num w:numId="20" w16cid:durableId="1641034631">
-    <w:abstractNumId w:val="40"/>
+    <w:abstractNumId w:val="41"/>
   </w:num>
   <w:num w:numId="21" w16cid:durableId="658079619">
     <w:abstractNumId w:val="3"/>
@@ -51648,40 +53835,40 @@
     <w:abstractNumId w:val="20"/>
   </w:num>
   <w:num w:numId="23" w16cid:durableId="517623784">
-    <w:abstractNumId w:val="28"/>
+    <w:abstractNumId w:val="29"/>
   </w:num>
   <w:num w:numId="24" w16cid:durableId="1348368266">
     <w:abstractNumId w:val="18"/>
   </w:num>
   <w:num w:numId="25" w16cid:durableId="2090997550">
-    <w:abstractNumId w:val="45"/>
+    <w:abstractNumId w:val="46"/>
   </w:num>
   <w:num w:numId="26" w16cid:durableId="1352878502">
     <w:abstractNumId w:val="13"/>
   </w:num>
   <w:num w:numId="27" w16cid:durableId="1036156198">
-    <w:abstractNumId w:val="41"/>
+    <w:abstractNumId w:val="42"/>
   </w:num>
   <w:num w:numId="28" w16cid:durableId="289750148">
-    <w:abstractNumId w:val="34"/>
+    <w:abstractNumId w:val="35"/>
   </w:num>
   <w:num w:numId="29" w16cid:durableId="572274076">
-    <w:abstractNumId w:val="36"/>
+    <w:abstractNumId w:val="37"/>
   </w:num>
   <w:num w:numId="30" w16cid:durableId="818418425">
     <w:abstractNumId w:val="1"/>
   </w:num>
   <w:num w:numId="31" w16cid:durableId="1238827533">
-    <w:abstractNumId w:val="35"/>
+    <w:abstractNumId w:val="36"/>
   </w:num>
   <w:num w:numId="32" w16cid:durableId="314771189">
     <w:abstractNumId w:val="2"/>
   </w:num>
   <w:num w:numId="33" w16cid:durableId="1690177999">
-    <w:abstractNumId w:val="42"/>
+    <w:abstractNumId w:val="43"/>
   </w:num>
   <w:num w:numId="34" w16cid:durableId="2021202697">
-    <w:abstractNumId w:val="38"/>
+    <w:abstractNumId w:val="39"/>
   </w:num>
   <w:num w:numId="35" w16cid:durableId="1128547970">
     <w:abstractNumId w:val="8"/>
@@ -51690,10 +53877,10 @@
     <w:abstractNumId w:val="12"/>
   </w:num>
   <w:num w:numId="37" w16cid:durableId="128667572">
-    <w:abstractNumId w:val="47"/>
+    <w:abstractNumId w:val="48"/>
   </w:num>
   <w:num w:numId="38" w16cid:durableId="365788212">
-    <w:abstractNumId w:val="23"/>
+    <w:abstractNumId w:val="24"/>
   </w:num>
   <w:num w:numId="39" w16cid:durableId="1022123545">
     <w:abstractNumId w:val="21"/>
@@ -51708,22 +53895,25 @@
     <w:abstractNumId w:val="10"/>
   </w:num>
   <w:num w:numId="43" w16cid:durableId="1221596673">
-    <w:abstractNumId w:val="33"/>
+    <w:abstractNumId w:val="34"/>
   </w:num>
   <w:num w:numId="44" w16cid:durableId="1127360627">
-    <w:abstractNumId w:val="43"/>
+    <w:abstractNumId w:val="44"/>
   </w:num>
   <w:num w:numId="45" w16cid:durableId="577835580">
-    <w:abstractNumId w:val="46"/>
+    <w:abstractNumId w:val="47"/>
   </w:num>
   <w:num w:numId="46" w16cid:durableId="1297177179">
     <w:abstractNumId w:val="14"/>
   </w:num>
   <w:num w:numId="47" w16cid:durableId="2136215360">
-    <w:abstractNumId w:val="27"/>
+    <w:abstractNumId w:val="28"/>
   </w:num>
   <w:num w:numId="48" w16cid:durableId="1144928760">
     <w:abstractNumId w:val="5"/>
+  </w:num>
+  <w:num w:numId="49" w16cid:durableId="755638658">
+    <w:abstractNumId w:val="23"/>
   </w:num>
 </w:numbering>
 </file>
@@ -52330,7 +54520,6 @@
   <w:style w:type="character" w:default="1" w:styleId="DefaultParagraphFont">
     <w:name w:val="Default Paragraph Font"/>
     <w:uiPriority w:val="1"/>
-    <w:semiHidden/>
     <w:unhideWhenUsed/>
   </w:style>
   <w:style w:type="table" w:default="1" w:styleId="TableNormal">
@@ -52769,6 +54958,11 @@
     <w:basedOn w:val="DefaultParagraphFont"/>
     <w:rsid w:val="002037E0"/>
   </w:style>
+  <w:style w:type="character" w:customStyle="1" w:styleId="y">
+    <w:name w:val="ͼy"/>
+    <w:basedOn w:val="DefaultParagraphFont"/>
+    <w:rsid w:val="00A7003C"/>
+  </w:style>
 </w:styles>
 </file>
 

</xml_diff>

<commit_message>
Completed Python analysis and project dependencies
</commit_message>
<xml_diff>
--- a/docs/project_documentation.docx
+++ b/docs/project_documentation.docx
@@ -33319,6 +33319,7 @@
       <w:r>
         <w:rPr>
           <w:rFonts w:ascii="Times New Roman" w:eastAsia="Times New Roman" w:hAnsi="Times New Roman" w:cs="Times New Roman"/>
+          <w:noProof/>
           <w:kern w:val="0"/>
           <w:sz w:val="20"/>
           <w:szCs w:val="20"/>
@@ -34354,6 +34355,7 @@
       <w:r>
         <w:rPr>
           <w:rFonts w:ascii="Times New Roman" w:eastAsia="Times New Roman" w:hAnsi="Times New Roman" w:cs="Times New Roman"/>
+          <w:noProof/>
           <w:kern w:val="0"/>
           <w:sz w:val="20"/>
           <w:szCs w:val="20"/>
@@ -35020,6 +35022,7 @@
       <w:r>
         <w:rPr>
           <w:rFonts w:ascii="Times New Roman" w:eastAsia="Times New Roman" w:hAnsi="Times New Roman" w:cs="Times New Roman"/>
+          <w:noProof/>
           <w:kern w:val="0"/>
           <w:sz w:val="20"/>
           <w:szCs w:val="20"/>
@@ -35740,6 +35743,7 @@
       <w:r>
         <w:rPr>
           <w:rFonts w:ascii="Times New Roman" w:eastAsia="Times New Roman" w:hAnsi="Times New Roman" w:cs="Times New Roman"/>
+          <w:noProof/>
           <w:kern w:val="0"/>
           <w:sz w:val="20"/>
           <w:szCs w:val="20"/>
@@ -36898,6 +36902,7 @@
       <w:r>
         <w:rPr>
           <w:rFonts w:ascii="Times New Roman" w:eastAsia="Times New Roman" w:hAnsi="Times New Roman" w:cs="Times New Roman"/>
+          <w:noProof/>
           <w:kern w:val="0"/>
           <w:sz w:val="20"/>
           <w:szCs w:val="20"/>
@@ -36996,6 +37001,565 @@
           <w14:ligatures w14:val="none"/>
         </w:rPr>
         <w:t>Completed advanced Python development analysis and anomaly detection</w:t>
+      </w:r>
+      <w:r>
+        <w:rPr>
+          <w:rFonts w:ascii="Times New Roman" w:eastAsia="Times New Roman" w:hAnsi="Times New Roman" w:cs="Times New Roman"/>
+          <w:kern w:val="0"/>
+          <w:sz w:val="20"/>
+          <w:szCs w:val="20"/>
+          <w:lang w:eastAsia="en-IN"/>
+          <w14:ligatures w14:val="none"/>
+        </w:rPr>
+        <w:t>”</w:t>
+      </w:r>
+    </w:p>
+    <w:p>
+      <w:pPr>
+        <w:rPr>
+          <w:rFonts w:ascii="Times New Roman" w:eastAsia="Times New Roman" w:hAnsi="Times New Roman" w:cs="Times New Roman"/>
+          <w:kern w:val="0"/>
+          <w:sz w:val="20"/>
+          <w:szCs w:val="20"/>
+          <w:lang w:eastAsia="en-IN"/>
+          <w14:ligatures w14:val="none"/>
+        </w:rPr>
+      </w:pPr>
+      <w:r>
+        <w:rPr>
+          <w:rFonts w:ascii="Times New Roman" w:eastAsia="Times New Roman" w:hAnsi="Times New Roman" w:cs="Times New Roman"/>
+          <w:kern w:val="0"/>
+          <w:sz w:val="20"/>
+          <w:szCs w:val="20"/>
+          <w:lang w:eastAsia="en-IN"/>
+          <w14:ligatures w14:val="none"/>
+        </w:rPr>
+        <w:t>Git push</w:t>
+      </w:r>
+    </w:p>
+    <w:p>
+      <w:pPr>
+        <w:rPr>
+          <w:rFonts w:ascii="Times New Roman" w:eastAsia="Times New Roman" w:hAnsi="Times New Roman" w:cs="Times New Roman"/>
+          <w:kern w:val="0"/>
+          <w:sz w:val="20"/>
+          <w:szCs w:val="20"/>
+          <w:lang w:eastAsia="en-IN"/>
+          <w14:ligatures w14:val="none"/>
+        </w:rPr>
+      </w:pPr>
+    </w:p>
+    <w:p>
+      <w:pPr>
+        <w:rPr>
+          <w:rFonts w:ascii="Times New Roman" w:eastAsia="Times New Roman" w:hAnsi="Times New Roman" w:cs="Times New Roman"/>
+          <w:b/>
+          <w:bCs/>
+          <w:kern w:val="0"/>
+          <w:sz w:val="28"/>
+          <w:szCs w:val="28"/>
+          <w:lang w:eastAsia="en-IN"/>
+          <w14:ligatures w14:val="none"/>
+        </w:rPr>
+      </w:pPr>
+      <w:r>
+        <w:rPr>
+          <w:rFonts w:ascii="Times New Roman" w:eastAsia="Times New Roman" w:hAnsi="Times New Roman" w:cs="Times New Roman"/>
+          <w:b/>
+          <w:bCs/>
+          <w:kern w:val="0"/>
+          <w:sz w:val="28"/>
+          <w:szCs w:val="28"/>
+          <w:lang w:eastAsia="en-IN"/>
+          <w14:ligatures w14:val="none"/>
+        </w:rPr>
+        <w:t># Key Findings</w:t>
+      </w:r>
+    </w:p>
+    <w:p>
+      <w:pPr>
+        <w:rPr>
+          <w:rFonts w:ascii="Times New Roman" w:eastAsia="Times New Roman" w:hAnsi="Times New Roman" w:cs="Times New Roman"/>
+          <w:kern w:val="0"/>
+          <w:sz w:val="20"/>
+          <w:szCs w:val="20"/>
+          <w:lang w:eastAsia="en-IN"/>
+          <w14:ligatures w14:val="none"/>
+        </w:rPr>
+      </w:pPr>
+      <w:r>
+        <w:rPr>
+          <w:rFonts w:ascii="Times New Roman" w:eastAsia="Times New Roman" w:hAnsi="Times New Roman" w:cs="Times New Roman"/>
+          <w:kern w:val="0"/>
+          <w:sz w:val="20"/>
+          <w:szCs w:val="20"/>
+          <w:lang w:eastAsia="en-IN"/>
+          <w14:ligatures w14:val="none"/>
+        </w:rPr>
+        <w:t>- India's GDP shows a strong long-term upward trend from 1960 to 2024, although the annual growth rate varies considerably across periods.</w:t>
+      </w:r>
+    </w:p>
+    <w:p>
+      <w:pPr>
+        <w:rPr>
+          <w:rFonts w:ascii="Times New Roman" w:eastAsia="Times New Roman" w:hAnsi="Times New Roman" w:cs="Times New Roman"/>
+          <w:kern w:val="0"/>
+          <w:sz w:val="20"/>
+          <w:szCs w:val="20"/>
+          <w:lang w:eastAsia="en-IN"/>
+          <w14:ligatures w14:val="none"/>
+        </w:rPr>
+      </w:pPr>
+      <w:r>
+        <w:rPr>
+          <w:rFonts w:ascii="Times New Roman" w:eastAsia="Times New Roman" w:hAnsi="Times New Roman" w:cs="Times New Roman"/>
+          <w:kern w:val="0"/>
+          <w:sz w:val="20"/>
+          <w:szCs w:val="20"/>
+          <w:lang w:eastAsia="en-IN"/>
+          <w14:ligatures w14:val="none"/>
+        </w:rPr>
+        <w:t>- India's highest recorded GDP growth in this dataset occurred in 2007 at approximately 29.4%, while the largest contraction occurred in 1966 at approximately -23.5%.</w:t>
+      </w:r>
+    </w:p>
+    <w:p>
+      <w:pPr>
+        <w:rPr>
+          <w:rFonts w:ascii="Times New Roman" w:eastAsia="Times New Roman" w:hAnsi="Times New Roman" w:cs="Times New Roman"/>
+          <w:kern w:val="0"/>
+          <w:sz w:val="20"/>
+          <w:szCs w:val="20"/>
+          <w:lang w:eastAsia="en-IN"/>
+          <w14:ligatures w14:val="none"/>
+        </w:rPr>
+      </w:pPr>
+      <w:r>
+        <w:rPr>
+          <w:rFonts w:ascii="Times New Roman" w:eastAsia="Times New Roman" w:hAnsi="Times New Roman" w:cs="Times New Roman"/>
+          <w:kern w:val="0"/>
+          <w:sz w:val="20"/>
+          <w:szCs w:val="20"/>
+          <w:lang w:eastAsia="en-IN"/>
+          <w14:ligatures w14:val="none"/>
+        </w:rPr>
+        <w:t>- The 2024 comparison of the 10 most populous countries shows that population size alone does not correspond to higher GDP per capita.</w:t>
+      </w:r>
+    </w:p>
+    <w:p>
+      <w:pPr>
+        <w:rPr>
+          <w:rFonts w:ascii="Times New Roman" w:eastAsia="Times New Roman" w:hAnsi="Times New Roman" w:cs="Times New Roman"/>
+          <w:kern w:val="0"/>
+          <w:sz w:val="20"/>
+          <w:szCs w:val="20"/>
+          <w:lang w:eastAsia="en-IN"/>
+          <w14:ligatures w14:val="none"/>
+        </w:rPr>
+      </w:pPr>
+      <w:r>
+        <w:rPr>
+          <w:rFonts w:ascii="Times New Roman" w:eastAsia="Times New Roman" w:hAnsi="Times New Roman" w:cs="Times New Roman"/>
+          <w:kern w:val="0"/>
+          <w:sz w:val="20"/>
+          <w:szCs w:val="20"/>
+          <w:lang w:eastAsia="en-IN"/>
+          <w14:ligatures w14:val="none"/>
+        </w:rPr>
+        <w:t>- The United States has a substantially higher GDP per capita than other highly populous economies, while India and China have similar population sizes but materially different GDP per capita.</w:t>
+      </w:r>
+    </w:p>
+    <w:p>
+      <w:pPr>
+        <w:rPr>
+          <w:rFonts w:ascii="Times New Roman" w:eastAsia="Times New Roman" w:hAnsi="Times New Roman" w:cs="Times New Roman"/>
+          <w:kern w:val="0"/>
+          <w:sz w:val="20"/>
+          <w:szCs w:val="20"/>
+          <w:lang w:eastAsia="en-IN"/>
+          <w14:ligatures w14:val="none"/>
+        </w:rPr>
+      </w:pPr>
+      <w:r>
+        <w:rPr>
+          <w:rFonts w:ascii="Times New Roman" w:eastAsia="Times New Roman" w:hAnsi="Times New Roman" w:cs="Times New Roman"/>
+          <w:kern w:val="0"/>
+          <w:sz w:val="20"/>
+          <w:szCs w:val="20"/>
+          <w:lang w:eastAsia="en-IN"/>
+          <w14:ligatures w14:val="none"/>
+        </w:rPr>
+        <w:t>- The 2024 GDP ranking shows the United States and China as the two largest economies in the dataset, with India ranking among the largest economies by total GDP.</w:t>
+      </w:r>
+    </w:p>
+    <w:p>
+      <w:pPr>
+        <w:rPr>
+          <w:rFonts w:ascii="Times New Roman" w:eastAsia="Times New Roman" w:hAnsi="Times New Roman" w:cs="Times New Roman"/>
+          <w:kern w:val="0"/>
+          <w:sz w:val="20"/>
+          <w:szCs w:val="20"/>
+          <w:lang w:eastAsia="en-IN"/>
+          <w14:ligatures w14:val="none"/>
+        </w:rPr>
+      </w:pPr>
+      <w:r>
+        <w:rPr>
+          <w:rFonts w:ascii="Times New Roman" w:eastAsia="Times New Roman" w:hAnsi="Times New Roman" w:cs="Times New Roman"/>
+          <w:kern w:val="0"/>
+          <w:sz w:val="20"/>
+          <w:szCs w:val="20"/>
+          <w:lang w:eastAsia="en-IN"/>
+          <w14:ligatures w14:val="none"/>
+        </w:rPr>
+        <w:t>- The correlation analysis shows a moderate positive relationship between population and total GDP, while GDP per capita has a stronger relationship with life expectancy and internet usage in this dataset.</w:t>
+      </w:r>
+    </w:p>
+    <w:p>
+      <w:pPr>
+        <w:rPr>
+          <w:rFonts w:ascii="Times New Roman" w:eastAsia="Times New Roman" w:hAnsi="Times New Roman" w:cs="Times New Roman"/>
+          <w:kern w:val="0"/>
+          <w:sz w:val="20"/>
+          <w:szCs w:val="20"/>
+          <w:lang w:eastAsia="en-IN"/>
+          <w14:ligatures w14:val="none"/>
+        </w:rPr>
+      </w:pPr>
+      <w:r>
+        <w:rPr>
+          <w:rFonts w:ascii="Times New Roman" w:eastAsia="Times New Roman" w:hAnsi="Times New Roman" w:cs="Times New Roman"/>
+          <w:kern w:val="0"/>
+          <w:sz w:val="20"/>
+          <w:szCs w:val="20"/>
+          <w:lang w:eastAsia="en-IN"/>
+          <w14:ligatures w14:val="none"/>
+        </w:rPr>
+        <w:t>- GDP per capita outlier analysis identified a small group of economies with unusually high GDP per capita values relative to the overall distribution.</w:t>
+      </w:r>
+    </w:p>
+    <w:p>
+      <w:pPr>
+        <w:rPr>
+          <w:rFonts w:ascii="Times New Roman" w:eastAsia="Times New Roman" w:hAnsi="Times New Roman" w:cs="Times New Roman"/>
+          <w:kern w:val="0"/>
+          <w:sz w:val="20"/>
+          <w:szCs w:val="20"/>
+          <w:lang w:eastAsia="en-IN"/>
+          <w14:ligatures w14:val="none"/>
+        </w:rPr>
+      </w:pPr>
+      <w:r>
+        <w:rPr>
+          <w:rFonts w:ascii="Times New Roman" w:eastAsia="Times New Roman" w:hAnsi="Times New Roman" w:cs="Times New Roman"/>
+          <w:kern w:val="0"/>
+          <w:sz w:val="20"/>
+          <w:szCs w:val="20"/>
+          <w:lang w:eastAsia="en-IN"/>
+          <w14:ligatures w14:val="none"/>
+        </w:rPr>
+        <w:lastRenderedPageBreak/>
+        <w:t>- Internet usage and life expectancy were incorporated into the country-level dataset to support broader development-indicator analysis.</w:t>
+      </w:r>
+    </w:p>
+    <w:p>
+      <w:pPr>
+        <w:rPr>
+          <w:rFonts w:ascii="Times New Roman" w:eastAsia="Times New Roman" w:hAnsi="Times New Roman" w:cs="Times New Roman"/>
+          <w:kern w:val="0"/>
+          <w:sz w:val="20"/>
+          <w:szCs w:val="20"/>
+          <w:lang w:eastAsia="en-IN"/>
+          <w14:ligatures w14:val="none"/>
+        </w:rPr>
+      </w:pPr>
+    </w:p>
+    <w:p>
+      <w:pPr>
+        <w:rPr>
+          <w:rFonts w:ascii="Times New Roman" w:eastAsia="Times New Roman" w:hAnsi="Times New Roman" w:cs="Times New Roman"/>
+          <w:kern w:val="0"/>
+          <w:sz w:val="20"/>
+          <w:szCs w:val="20"/>
+          <w:lang w:eastAsia="en-IN"/>
+          <w14:ligatures w14:val="none"/>
+        </w:rPr>
+      </w:pPr>
+      <w:r>
+        <w:rPr>
+          <w:rFonts w:ascii="Times New Roman" w:eastAsia="Times New Roman" w:hAnsi="Times New Roman" w:cs="Times New Roman"/>
+          <w:b/>
+          <w:bCs/>
+          <w:kern w:val="0"/>
+          <w:sz w:val="20"/>
+          <w:szCs w:val="20"/>
+          <w:lang w:eastAsia="en-IN"/>
+          <w14:ligatures w14:val="none"/>
+        </w:rPr>
+        <w:t>Requirements.txt</w:t>
+      </w:r>
+      <w:r>
+        <w:rPr>
+          <w:rFonts w:ascii="Times New Roman" w:eastAsia="Times New Roman" w:hAnsi="Times New Roman" w:cs="Times New Roman"/>
+          <w:kern w:val="0"/>
+          <w:sz w:val="20"/>
+          <w:szCs w:val="20"/>
+          <w:lang w:eastAsia="en-IN"/>
+          <w14:ligatures w14:val="none"/>
+        </w:rPr>
+        <w:t xml:space="preserve"> – paste – </w:t>
+      </w:r>
+    </w:p>
+    <w:p>
+      <w:pPr>
+        <w:rPr>
+          <w:rFonts w:ascii="Times New Roman" w:eastAsia="Times New Roman" w:hAnsi="Times New Roman" w:cs="Times New Roman"/>
+          <w:kern w:val="0"/>
+          <w:sz w:val="20"/>
+          <w:szCs w:val="20"/>
+          <w:lang w:eastAsia="en-IN"/>
+          <w14:ligatures w14:val="none"/>
+        </w:rPr>
+      </w:pPr>
+      <w:r>
+        <w:rPr>
+          <w:rFonts w:ascii="Times New Roman" w:eastAsia="Times New Roman" w:hAnsi="Times New Roman" w:cs="Times New Roman"/>
+          <w:kern w:val="0"/>
+          <w:sz w:val="20"/>
+          <w:szCs w:val="20"/>
+          <w:lang w:eastAsia="en-IN"/>
+          <w14:ligatures w14:val="none"/>
+        </w:rPr>
+        <w:t>pandas</w:t>
+      </w:r>
+    </w:p>
+    <w:p>
+      <w:pPr>
+        <w:rPr>
+          <w:rFonts w:ascii="Times New Roman" w:eastAsia="Times New Roman" w:hAnsi="Times New Roman" w:cs="Times New Roman"/>
+          <w:kern w:val="0"/>
+          <w:sz w:val="20"/>
+          <w:szCs w:val="20"/>
+          <w:lang w:eastAsia="en-IN"/>
+          <w14:ligatures w14:val="none"/>
+        </w:rPr>
+      </w:pPr>
+      <w:r>
+        <w:rPr>
+          <w:rFonts w:ascii="Times New Roman" w:eastAsia="Times New Roman" w:hAnsi="Times New Roman" w:cs="Times New Roman"/>
+          <w:kern w:val="0"/>
+          <w:sz w:val="20"/>
+          <w:szCs w:val="20"/>
+          <w:lang w:eastAsia="en-IN"/>
+          <w14:ligatures w14:val="none"/>
+        </w:rPr>
+        <w:t>numpy</w:t>
+      </w:r>
+    </w:p>
+    <w:p>
+      <w:pPr>
+        <w:rPr>
+          <w:rFonts w:ascii="Times New Roman" w:eastAsia="Times New Roman" w:hAnsi="Times New Roman" w:cs="Times New Roman"/>
+          <w:kern w:val="0"/>
+          <w:sz w:val="20"/>
+          <w:szCs w:val="20"/>
+          <w:lang w:eastAsia="en-IN"/>
+          <w14:ligatures w14:val="none"/>
+        </w:rPr>
+      </w:pPr>
+      <w:r>
+        <w:rPr>
+          <w:rFonts w:ascii="Times New Roman" w:eastAsia="Times New Roman" w:hAnsi="Times New Roman" w:cs="Times New Roman"/>
+          <w:kern w:val="0"/>
+          <w:sz w:val="20"/>
+          <w:szCs w:val="20"/>
+          <w:lang w:eastAsia="en-IN"/>
+          <w14:ligatures w14:val="none"/>
+        </w:rPr>
+        <w:t>matplotlib</w:t>
+      </w:r>
+    </w:p>
+    <w:p>
+      <w:pPr>
+        <w:rPr>
+          <w:rFonts w:ascii="Times New Roman" w:eastAsia="Times New Roman" w:hAnsi="Times New Roman" w:cs="Times New Roman"/>
+          <w:kern w:val="0"/>
+          <w:sz w:val="20"/>
+          <w:szCs w:val="20"/>
+          <w:lang w:eastAsia="en-IN"/>
+          <w14:ligatures w14:val="none"/>
+        </w:rPr>
+      </w:pPr>
+      <w:r>
+        <w:rPr>
+          <w:rFonts w:ascii="Times New Roman" w:eastAsia="Times New Roman" w:hAnsi="Times New Roman" w:cs="Times New Roman"/>
+          <w:kern w:val="0"/>
+          <w:sz w:val="20"/>
+          <w:szCs w:val="20"/>
+          <w:lang w:eastAsia="en-IN"/>
+          <w14:ligatures w14:val="none"/>
+        </w:rPr>
+        <w:t>seaborn</w:t>
+      </w:r>
+    </w:p>
+    <w:p>
+      <w:pPr>
+        <w:rPr>
+          <w:rFonts w:ascii="Times New Roman" w:eastAsia="Times New Roman" w:hAnsi="Times New Roman" w:cs="Times New Roman"/>
+          <w:kern w:val="0"/>
+          <w:sz w:val="20"/>
+          <w:szCs w:val="20"/>
+          <w:lang w:eastAsia="en-IN"/>
+          <w14:ligatures w14:val="none"/>
+        </w:rPr>
+      </w:pPr>
+      <w:r>
+        <w:rPr>
+          <w:rFonts w:ascii="Times New Roman" w:eastAsia="Times New Roman" w:hAnsi="Times New Roman" w:cs="Times New Roman"/>
+          <w:kern w:val="0"/>
+          <w:sz w:val="20"/>
+          <w:szCs w:val="20"/>
+          <w:lang w:eastAsia="en-IN"/>
+          <w14:ligatures w14:val="none"/>
+        </w:rPr>
+        <w:t>scipy</w:t>
+      </w:r>
+    </w:p>
+    <w:p>
+      <w:pPr>
+        <w:rPr>
+          <w:rFonts w:ascii="Times New Roman" w:eastAsia="Times New Roman" w:hAnsi="Times New Roman" w:cs="Times New Roman"/>
+          <w:kern w:val="0"/>
+          <w:sz w:val="20"/>
+          <w:szCs w:val="20"/>
+          <w:lang w:eastAsia="en-IN"/>
+          <w14:ligatures w14:val="none"/>
+        </w:rPr>
+      </w:pPr>
+      <w:r>
+        <w:rPr>
+          <w:rFonts w:ascii="Times New Roman" w:eastAsia="Times New Roman" w:hAnsi="Times New Roman" w:cs="Times New Roman"/>
+          <w:kern w:val="0"/>
+          <w:sz w:val="20"/>
+          <w:szCs w:val="20"/>
+          <w:lang w:eastAsia="en-IN"/>
+          <w14:ligatures w14:val="none"/>
+        </w:rPr>
+        <w:t>openpyxl</w:t>
+      </w:r>
+    </w:p>
+    <w:p>
+      <w:pPr>
+        <w:rPr>
+          <w:rFonts w:ascii="Times New Roman" w:eastAsia="Times New Roman" w:hAnsi="Times New Roman" w:cs="Times New Roman"/>
+          <w:kern w:val="0"/>
+          <w:sz w:val="20"/>
+          <w:szCs w:val="20"/>
+          <w:lang w:eastAsia="en-IN"/>
+          <w14:ligatures w14:val="none"/>
+        </w:rPr>
+      </w:pPr>
+      <w:r>
+        <w:rPr>
+          <w:rFonts w:ascii="Times New Roman" w:eastAsia="Times New Roman" w:hAnsi="Times New Roman" w:cs="Times New Roman"/>
+          <w:kern w:val="0"/>
+          <w:sz w:val="20"/>
+          <w:szCs w:val="20"/>
+          <w:lang w:eastAsia="en-IN"/>
+          <w14:ligatures w14:val="none"/>
+        </w:rPr>
+        <w:t>PyMySQL</w:t>
+      </w:r>
+    </w:p>
+    <w:p>
+      <w:pPr>
+        <w:rPr>
+          <w:rFonts w:ascii="Times New Roman" w:eastAsia="Times New Roman" w:hAnsi="Times New Roman" w:cs="Times New Roman"/>
+          <w:kern w:val="0"/>
+          <w:sz w:val="20"/>
+          <w:szCs w:val="20"/>
+          <w:lang w:eastAsia="en-IN"/>
+          <w14:ligatures w14:val="none"/>
+        </w:rPr>
+      </w:pPr>
+      <w:r>
+        <w:rPr>
+          <w:rFonts w:ascii="Times New Roman" w:eastAsia="Times New Roman" w:hAnsi="Times New Roman" w:cs="Times New Roman"/>
+          <w:kern w:val="0"/>
+          <w:sz w:val="20"/>
+          <w:szCs w:val="20"/>
+          <w:lang w:eastAsia="en-IN"/>
+          <w14:ligatures w14:val="none"/>
+        </w:rPr>
+        <w:t>SQLAlchemy</w:t>
+      </w:r>
+    </w:p>
+    <w:p>
+      <w:pPr>
+        <w:rPr>
+          <w:rFonts w:ascii="Times New Roman" w:eastAsia="Times New Roman" w:hAnsi="Times New Roman" w:cs="Times New Roman"/>
+          <w:kern w:val="0"/>
+          <w:sz w:val="20"/>
+          <w:szCs w:val="20"/>
+          <w:lang w:eastAsia="en-IN"/>
+          <w14:ligatures w14:val="none"/>
+        </w:rPr>
+      </w:pPr>
+    </w:p>
+    <w:p>
+      <w:pPr>
+        <w:rPr>
+          <w:rFonts w:ascii="Times New Roman" w:eastAsia="Times New Roman" w:hAnsi="Times New Roman" w:cs="Times New Roman"/>
+          <w:kern w:val="0"/>
+          <w:sz w:val="20"/>
+          <w:szCs w:val="20"/>
+          <w:lang w:eastAsia="en-IN"/>
+          <w14:ligatures w14:val="none"/>
+        </w:rPr>
+      </w:pPr>
+      <w:r>
+        <w:rPr>
+          <w:rFonts w:ascii="Times New Roman" w:eastAsia="Times New Roman" w:hAnsi="Times New Roman" w:cs="Times New Roman"/>
+          <w:kern w:val="0"/>
+          <w:sz w:val="20"/>
+          <w:szCs w:val="20"/>
+          <w:lang w:eastAsia="en-IN"/>
+          <w14:ligatures w14:val="none"/>
+        </w:rPr>
+        <w:t>Git add .</w:t>
+      </w:r>
+    </w:p>
+    <w:p>
+      <w:pPr>
+        <w:rPr>
+          <w:rFonts w:ascii="Times New Roman" w:eastAsia="Times New Roman" w:hAnsi="Times New Roman" w:cs="Times New Roman"/>
+          <w:kern w:val="0"/>
+          <w:sz w:val="20"/>
+          <w:szCs w:val="20"/>
+          <w:lang w:eastAsia="en-IN"/>
+          <w14:ligatures w14:val="none"/>
+        </w:rPr>
+      </w:pPr>
+      <w:r>
+        <w:rPr>
+          <w:rFonts w:ascii="Times New Roman" w:eastAsia="Times New Roman" w:hAnsi="Times New Roman" w:cs="Times New Roman"/>
+          <w:kern w:val="0"/>
+          <w:sz w:val="20"/>
+          <w:szCs w:val="20"/>
+          <w:lang w:eastAsia="en-IN"/>
+          <w14:ligatures w14:val="none"/>
+        </w:rPr>
+        <w:t>Git commit -m “</w:t>
+      </w:r>
+      <w:r>
+        <w:rPr>
+          <w:rFonts w:ascii="Times New Roman" w:eastAsia="Times New Roman" w:hAnsi="Times New Roman" w:cs="Times New Roman"/>
+          <w:kern w:val="0"/>
+          <w:sz w:val="20"/>
+          <w:szCs w:val="20"/>
+          <w:lang w:eastAsia="en-IN"/>
+          <w14:ligatures w14:val="none"/>
+        </w:rPr>
+        <w:t>Completed Python analysis and project dependencies</w:t>
       </w:r>
       <w:r>
         <w:rPr>
@@ -43985,6 +44549,7 @@
   <w:style w:type="character" w:default="1" w:styleId="DefaultParagraphFont">
     <w:name w:val="Default Paragraph Font"/>
     <w:uiPriority w:val="1"/>
+    <w:semiHidden/>
     <w:unhideWhenUsed/>
   </w:style>
   <w:style w:type="table" w:default="1" w:styleId="TableNormal">

</xml_diff>